<commit_message>
Concept approval at Riyadh (Thumamah) as a one-month activity; dashboard table with total cost, cost to date, start and finish per branch
Co-Authored-By: Claude Sonnet 5.5 <noreply@anthropic.com>
Claude-Session: https://claude.ai/code/session_01DZdGPWRxvKXCnMyT6qFPZb
</commit_message>
<xml_diff>
--- a/p6/0580_Schedule_Narrative.docx
+++ b/p6/0580_Schedule_Narrative.docx
@@ -2990,7 +2990,7 @@
         <w:rPr>
           <w:b w:val="0"/>
         </w:rPr>
-        <w:t>All SAR reviews and approvals of submissions are 21 days. In a Sunday to Thursday calendar that is three working weeks, so each approval activity is 15 working days. This applies to the initial and detailed baseline programme, the survey, every design stage, HCIS documents, POC plan, as-built documents and the taking-over application. The POC inspection and approval is a separate one month period as instructed.</w:t>
+        <w:t>All SAR reviews and approvals of submissions are 21 days. In a Sunday to Thursday calendar that is three working weeks, so each approval activity is 15 working days. This applies to the initial and detailed baseline programme, the survey, every design stage, HCIS documents, POC plan, as-built documents and the taking-over application. The POC inspection and approval, and the concept approval at Riyadh (Thumamah), are separate one month periods (22 working days) as instructed.</w:t>
       </w:r>
     </w:p>
     <w:p>
@@ -2998,7 +2998,7 @@
         <w:rPr>
           <w:b w:val="0"/>
         </w:rPr>
-        <w:t>103 approval activities are loaded. Their durations: 10 days x 1, 12 days x 1, 15 days x 101 (working days).</w:t>
+        <w:t>103 approval activities are loaded. Their durations: 10 days x 1, 12 days x 1, 15 days x 100, 22 days x 1 (working days).</w:t>
       </w:r>
     </w:p>
     <w:p>
@@ -6514,6 +6514,14 @@
       </w:pPr>
       <w:r>
         <w:t>Priority 1 means Makkah and Riyadh (Thumamah). Riyadh (Malaz) is treated as Priority 2.</w:t>
+      </w:r>
+    </w:p>
+    <w:p>
+      <w:pPr>
+        <w:pStyle w:val="ListBullet"/>
+      </w:pPr>
+      <w:r>
+        <w:t>Concept approval at Riyadh (Thumamah) is one month (22 working days); all other SAR reviews are 21 days (15 working days).</w:t>
       </w:r>
     </w:p>
     <w:p>

</xml_diff>

<commit_message>
Mock-up approval (site visit, one month) at Riyadh (Thumamah) replaces the concept-approval change; station names shown with codes
Co-Authored-By: Claude Sonnet 5.5 <noreply@anthropic.com>
Claude-Session: https://claude.ai/code/session_01DZdGPWRxvKXCnMyT6qFPZb
</commit_message>
<xml_diff>
--- a/p6/0580_Schedule_Narrative.docx
+++ b/p6/0580_Schedule_Narrative.docx
@@ -67,7 +67,7 @@
         <w:rPr>
           <w:b w:val="0"/>
         </w:rPr>
-        <w:t>This narrative describes the baseline programme (Rev 1) of project 0580-Security Technology Salutation after eliminating Passenger Checking Roles, covering 14 stations on three railways (North South Railway, East West Railway and Haramain High Speed Rail). It is delivered as a Primavera P6 24 XER file with 598 activities (507 tasks and 91 milestones) and 913 logic links. It runs from the Notice to Proceed milestone on 01 Nov 2026 to the contract completion milestone on 31 Oct 2029.</w:t>
+        <w:t>This narrative describes the baseline programme (Rev 1) of project 0580-Security Technology Salutation after eliminating Passenger Checking Roles, covering 14 stations on three railways (North South Railway, East West Railway and Haramain High Speed Rail). It is delivered as a Primavera P6 24 XER file with 600 activities (508 tasks and 92 milestones) and 917 logic links. It runs from the Notice to Proceed milestone on 01 Nov 2026 to the contract completion milestone on 31 Oct 2029.</w:t>
       </w:r>
     </w:p>
     <w:p>
@@ -2990,7 +2990,7 @@
         <w:rPr>
           <w:b w:val="0"/>
         </w:rPr>
-        <w:t>All SAR reviews and approvals of submissions are 21 days. In a Sunday to Thursday calendar that is three working weeks, so each approval activity is 15 working days. This applies to the initial and detailed baseline programme, the survey, every design stage, HCIS documents, POC plan, as-built documents and the taking-over application. The POC inspection and approval, and the concept approval at Riyadh (Thumamah), are separate one month periods (22 working days) as instructed.</w:t>
+        <w:t>All SAR reviews and approvals of submissions are 21 days. In a Sunday to Thursday calendar that is three working weeks, so each approval activity is 15 working days. This applies to the initial and detailed baseline programme, the survey, every design stage, HCIS documents, POC plan, as-built documents and the taking-over application. The POC inspection and approval, and the mock-up approval at Riyadh (Thumamah), are separate one month periods (22 working days) as instructed.</w:t>
       </w:r>
     </w:p>
     <w:p>
@@ -2998,7 +2998,7 @@
         <w:rPr>
           <w:b w:val="0"/>
         </w:rPr>
-        <w:t>103 approval activities are loaded. Their durations: 10 days x 1, 12 days x 1, 15 days x 100, 22 days x 1 (working days).</w:t>
+        <w:t>104 approval activities are loaded. Their durations: 10 days x 1, 12 days x 1, 15 days x 101, 22 days x 1 (working days).</w:t>
       </w:r>
     </w:p>
     <w:p>
@@ -3633,7 +3633,7 @@
         <w:rPr>
           <w:b w:val="0"/>
         </w:rPr>
-        <w:t>The WBS follows EPC. Level 1 is the project (0580), level 2 the EPC phase (Engineering, Procurement, Construction, Commissioning and handover, plus Project management), level 3 the station, level 4 the design stage or work package (enabling works, civil, installation, POC), and level 5 the submittal, approval or area. There are 519 nodes. Levels 6 to 8 are not used because the contract gives no zone-level data; they can be added when it does.</w:t>
+        <w:t>The WBS follows EPC. Level 1 is the project (0580), level 2 the EPC phase (Engineering, Procurement, Construction, Commissioning and handover, plus Project management), level 3 the station, level 4 the design stage or work package (enabling works, civil, installation, POC), and level 5 the submittal, approval or area. There are 520 nodes. Levels 6 to 8 are not used because the contract gives no zone-level data; they can be added when it does.</w:t>
       </w:r>
     </w:p>
     <w:tbl>
@@ -3798,7 +3798,7 @@
               <w:rPr>
                 <w:sz w:val="19"/>
               </w:rPr>
-              <w:t>253</w:t>
+              <w:t>254</w:t>
             </w:r>
           </w:p>
         </w:tc>
@@ -6521,7 +6521,7 @@
         <w:pStyle w:val="ListBullet"/>
       </w:pPr>
       <w:r>
-        <w:t>Concept approval at Riyadh (Thumamah) is one month (22 working days); all other SAR reviews are 21 days (15 working days).</w:t>
+        <w:t>Mock-up approval: after the installation at Riyadh (Thumamah) is complete, SAR visits the site and approves the executed works (one month, 22 working days) so that the solution can be rolled out to the other stations. It is a predecessor of the SAT milestone (MS6) and the handover at that station only; it does not gate the installation of the other stations. Cost has no Annex 3 item and is carved from 3% of the testing milestone.</w:t>
       </w:r>
     </w:p>
     <w:p>

</xml_diff>

<commit_message>
Design rule applied to every station: 4-month design starting 2 months after mobilization, 2-month overlap with enabling works
Co-Authored-By: Claude Sonnet 5.5 <noreply@anthropic.com>
Claude-Session: https://claude.ai/code/session_01DZdGPWRxvKXCnMyT6qFPZb
</commit_message>
<xml_diff>
--- a/p6/0580_Schedule_Narrative.docx
+++ b/p6/0580_Schedule_Narrative.docx
@@ -67,7 +67,7 @@
         <w:rPr>
           <w:b w:val="0"/>
         </w:rPr>
-        <w:t>This narrative describes the baseline programme (Rev 1) of project 0580-Security Technology Salutation after eliminating Passenger Checking Roles, covering 14 stations on three railways (North South Railway, East West Railway and Haramain High Speed Rail). It is delivered as a Primavera P6 24 XER file with 600 activities (508 tasks and 92 milestones) and 917 logic links. It runs from the Notice to Proceed milestone on 01 Nov 2026 to the contract completion milestone on 31 Oct 2029.</w:t>
+        <w:t>This narrative describes the baseline programme (Rev 1) of project 0580-Security Technology Salutation after eliminating Passenger Checking Roles, covering 14 stations on three railways (North South Railway, East West Railway and Haramain High Speed Rail). It is delivered as a Primavera P6 24 XER file with 600 activities (508 tasks and 92 milestones) and 928 logic links. It runs from the Notice to Proceed milestone on 01 Nov 2026 to the contract completion milestone on 31 Oct 2029.</w:t>
       </w:r>
     </w:p>
     <w:p>
@@ -174,7 +174,7 @@
               <w:rPr>
                 <w:sz w:val="19"/>
               </w:rPr>
-              <w:t>Overlap</w:t>
+              <w:t>Design rule</w:t>
             </w:r>
           </w:p>
         </w:tc>
@@ -188,7 +188,7 @@
               <w:rPr>
                 <w:sz w:val="19"/>
               </w:rPr>
-              <w:t>Enabling works for the priority stations start at the beginning of month 5, the last two months of design.</w:t>
+              <w:t>At every station: two months of mobilization and survey, then four months of design starting two months after the station mobilization starts; enabling works start in the last two months of design (two months of overlap). At the priority stations this is months 1-2, 3-6 and 5-6 of the project.</w:t>
             </w:r>
           </w:p>
         </w:tc>
@@ -1000,7 +1000,7 @@
         <w:rPr>
           <w:b w:val="0"/>
         </w:rPr>
-        <w:t>The two month window for mobilization and survey is held by a logic link from NTP (milestone PRJ-M1150), and design starts after that milestone and the survey approval. Enabling works for the priority stations start from the same milestone with a lag that places them at the start of month 5. No date constraint is used.</w:t>
+        <w:t>The two month window for mobilization and survey is held by a logic link from NTP (milestone PRJ-M1150) at the priority stations; design starts after that milestone and the survey approval. At the other stations design starts two months after their own survey starts. Design lasts four months at every station. Enabling works start two months before the end of design, so design and execution overlap by two months. No date constraint is used.</w:t>
       </w:r>
     </w:p>
     <w:p>
@@ -1016,7 +1016,7 @@
         <w:rPr>
           <w:b w:val="0"/>
         </w:rPr>
-        <w:t>Priority 1: Makkah (Haramain) and Riyadh (Thumamah, North South Railway). Their surveys start first, they carry the four month design window, and their enabling works and civil works run in parallel with design. Manufacture is released only after SAR approval of the engineering (milestone MS3), so no equipment is ordered before approval. Priority 2: Riyadh (Malaz, East West Railway), surveyed in the same two months, with a shorter design. The remaining stations follow in waves after the detailed baseline is approved.</w:t>
+        <w:t>Priority 1: Makkah (Haramain) and Riyadh (Thumamah, North South Railway). Their surveys start first and their enabling and civil works run in parallel with design. Equipment is manufactured only after SAR approval of the engineering (milestone MS3), so no equipment is ordered before approval. Priority 2: Riyadh (Malaz, East West Railway), surveyed in the same two months. The remaining stations follow in waves after the detailed baseline is approved, each with the same four month design.</w:t>
       </w:r>
     </w:p>
     <w:tbl>
@@ -1331,7 +1331,7 @@
               <w:rPr>
                 <w:sz w:val="19"/>
               </w:rPr>
-              <w:t>13 Dec 2027</w:t>
+              <w:t>30 Jan 2028</w:t>
             </w:r>
           </w:p>
         </w:tc>
@@ -1389,7 +1389,7 @@
               <w:rPr>
                 <w:sz w:val="19"/>
               </w:rPr>
-              <w:t>03 Mar 2027</w:t>
+              <w:t>11 Feb 2027</w:t>
             </w:r>
           </w:p>
         </w:tc>
@@ -1403,7 +1403,7 @@
               <w:rPr>
                 <w:sz w:val="19"/>
               </w:rPr>
-              <w:t>20 Sep 2028</w:t>
+              <w:t>24 Oct 2028</w:t>
             </w:r>
           </w:p>
         </w:tc>
@@ -1461,7 +1461,7 @@
               <w:rPr>
                 <w:sz w:val="19"/>
               </w:rPr>
-              <w:t>23 Jun 2027</w:t>
+              <w:t>13 May 2027</w:t>
             </w:r>
           </w:p>
         </w:tc>
@@ -1475,7 +1475,7 @@
               <w:rPr>
                 <w:sz w:val="19"/>
               </w:rPr>
-              <w:t>28 Jun 2028</w:t>
+              <w:t>28 Aug 2028</w:t>
             </w:r>
           </w:p>
         </w:tc>
@@ -1533,7 +1533,7 @@
               <w:rPr>
                 <w:sz w:val="19"/>
               </w:rPr>
-              <w:t>17 Aug 2027</w:t>
+              <w:t>07 Jul 2027</w:t>
             </w:r>
           </w:p>
         </w:tc>
@@ -1547,7 +1547,7 @@
               <w:rPr>
                 <w:sz w:val="19"/>
               </w:rPr>
-              <w:t>30 Aug 2028</w:t>
+              <w:t>23 Oct 2028</w:t>
             </w:r>
           </w:p>
         </w:tc>
@@ -1605,7 +1605,7 @@
               <w:rPr>
                 <w:sz w:val="19"/>
               </w:rPr>
-              <w:t>17 Aug 2027</w:t>
+              <w:t>07 Jul 2027</w:t>
             </w:r>
           </w:p>
         </w:tc>
@@ -1619,7 +1619,7 @@
               <w:rPr>
                 <w:sz w:val="19"/>
               </w:rPr>
-              <w:t>22 Aug 2028</w:t>
+              <w:t>15 Oct 2028</w:t>
             </w:r>
           </w:p>
         </w:tc>
@@ -1677,7 +1677,7 @@
               <w:rPr>
                 <w:sz w:val="19"/>
               </w:rPr>
-              <w:t>06 Oct 2027</w:t>
+              <w:t>17 Aug 2027</w:t>
             </w:r>
           </w:p>
         </w:tc>
@@ -1691,7 +1691,7 @@
               <w:rPr>
                 <w:sz w:val="19"/>
               </w:rPr>
-              <w:t>18 Oct 2028</w:t>
+              <w:t>03 Dec 2028</w:t>
             </w:r>
           </w:p>
         </w:tc>
@@ -1749,7 +1749,7 @@
               <w:rPr>
                 <w:sz w:val="19"/>
               </w:rPr>
-              <w:t>06 Feb 2028</w:t>
+              <w:t>30 Nov 2027</w:t>
             </w:r>
           </w:p>
         </w:tc>
@@ -1763,7 +1763,7 @@
               <w:rPr>
                 <w:sz w:val="19"/>
               </w:rPr>
-              <w:t>23 Jul 2029</w:t>
+              <w:t>08 Jul 2029</w:t>
             </w:r>
           </w:p>
         </w:tc>
@@ -1821,7 +1821,7 @@
               <w:rPr>
                 <w:sz w:val="19"/>
               </w:rPr>
-              <w:t>06 Feb 2028</w:t>
+              <w:t>30 Nov 2027</w:t>
             </w:r>
           </w:p>
         </w:tc>
@@ -1835,7 +1835,7 @@
               <w:rPr>
                 <w:sz w:val="19"/>
               </w:rPr>
-              <w:t>29 Jul 2029</w:t>
+              <w:t>12 Jul 2029</w:t>
             </w:r>
           </w:p>
         </w:tc>
@@ -1893,7 +1893,7 @@
               <w:rPr>
                 <w:sz w:val="19"/>
               </w:rPr>
-              <w:t>30 Mar 2028</w:t>
+              <w:t>11 Jan 2028</w:t>
             </w:r>
           </w:p>
         </w:tc>
@@ -1907,7 +1907,7 @@
               <w:rPr>
                 <w:sz w:val="19"/>
               </w:rPr>
-              <w:t>01 Apr 2029</w:t>
+              <w:t>29 Apr 2029</w:t>
             </w:r>
           </w:p>
         </w:tc>
@@ -1965,7 +1965,7 @@
               <w:rPr>
                 <w:sz w:val="19"/>
               </w:rPr>
-              <w:t>25 Apr 2028</w:t>
+              <w:t>01 Feb 2028</w:t>
             </w:r>
           </w:p>
         </w:tc>
@@ -1979,7 +1979,7 @@
               <w:rPr>
                 <w:sz w:val="19"/>
               </w:rPr>
-              <w:t>16 May 2029</w:t>
+              <w:t>03 Jun 2029</w:t>
             </w:r>
           </w:p>
         </w:tc>
@@ -2037,7 +2037,7 @@
               <w:rPr>
                 <w:sz w:val="19"/>
               </w:rPr>
-              <w:t>13 Jul 2028</w:t>
+              <w:t>10 Apr 2028</w:t>
             </w:r>
           </w:p>
         </w:tc>
@@ -2051,7 +2051,7 @@
               <w:rPr>
                 <w:sz w:val="19"/>
               </w:rPr>
-              <w:t>29 Jul 2029</w:t>
+              <w:t>02 Aug 2029</w:t>
             </w:r>
           </w:p>
         </w:tc>
@@ -2109,7 +2109,7 @@
               <w:rPr>
                 <w:sz w:val="19"/>
               </w:rPr>
-              <w:t>31 Aug 2028</w:t>
+              <w:t>29 May 2028</w:t>
             </w:r>
           </w:p>
         </w:tc>
@@ -2123,7 +2123,7 @@
               <w:rPr>
                 <w:sz w:val="19"/>
               </w:rPr>
-              <w:t>16 Sep 2029</w:t>
+              <w:t>13 Sep 2029</w:t>
             </w:r>
           </w:p>
         </w:tc>
@@ -3924,7 +3924,7 @@
         <w:rPr>
           <w:b w:val="0"/>
         </w:rPr>
-        <w:t>The contract completion milestone is held by the 36 month term, so no activity has zero float against it. The longest physical path finishes 22 working days before the contract end date, and that margin is the project float. 28 tasks sit on this longest path and 7 more are within 20 working days of it. The first 25 in date order are listed below.</w:t>
+        <w:t>The contract completion milestone is held by the 36 month term, so no activity has zero float against it. The longest physical path finishes 23 working days before the contract end date, and that margin is the project float. 28 tasks sit on this longest path and 7 more are within 20 working days of it. The first 25 in date order are listed below.</w:t>
       </w:r>
     </w:p>
     <w:tbl>
@@ -4095,7 +4095,7 @@
               <w:rPr>
                 <w:sz w:val="19"/>
               </w:rPr>
-              <w:t>32</w:t>
+              <w:t>33</w:t>
             </w:r>
           </w:p>
         </w:tc>
@@ -4167,7 +4167,7 @@
               <w:rPr>
                 <w:sz w:val="19"/>
               </w:rPr>
-              <w:t>22</w:t>
+              <w:t>23</w:t>
             </w:r>
           </w:p>
         </w:tc>
@@ -4239,7 +4239,7 @@
               <w:rPr>
                 <w:sz w:val="19"/>
               </w:rPr>
-              <w:t>27</w:t>
+              <w:t>28</w:t>
             </w:r>
           </w:p>
         </w:tc>
@@ -4311,7 +4311,7 @@
               <w:rPr>
                 <w:sz w:val="19"/>
               </w:rPr>
-              <w:t>22</w:t>
+              <w:t>23</w:t>
             </w:r>
           </w:p>
         </w:tc>
@@ -4383,7 +4383,7 @@
               <w:rPr>
                 <w:sz w:val="19"/>
               </w:rPr>
-              <w:t>22</w:t>
+              <w:t>23</w:t>
             </w:r>
           </w:p>
         </w:tc>
@@ -4427,7 +4427,7 @@
               <w:rPr>
                 <w:sz w:val="19"/>
               </w:rPr>
-              <w:t>31 Aug 2028</w:t>
+              <w:t>29 May 2028</w:t>
             </w:r>
           </w:p>
         </w:tc>
@@ -4441,7 +4441,7 @@
               <w:rPr>
                 <w:sz w:val="19"/>
               </w:rPr>
-              <w:t>13 Sep 2028</w:t>
+              <w:t>11 Jun 2028</w:t>
             </w:r>
           </w:p>
         </w:tc>
@@ -4455,7 +4455,7 @@
               <w:rPr>
                 <w:sz w:val="19"/>
               </w:rPr>
-              <w:t>22</w:t>
+              <w:t>23</w:t>
             </w:r>
           </w:p>
         </w:tc>
@@ -4471,7 +4471,7 @@
               <w:rPr>
                 <w:sz w:val="19"/>
               </w:rPr>
-              <w:t>NQR-E1030</w:t>
+              <w:t>NQR-E1020</w:t>
             </w:r>
           </w:p>
         </w:tc>
@@ -4485,7 +4485,7 @@
               <w:rPr>
                 <w:sz w:val="19"/>
               </w:rPr>
-              <w:t>Concept design: submittal - Al Qurayyat</w:t>
+              <w:t>Survey: SAR approval of survey report - Al Qurayyat</w:t>
             </w:r>
           </w:p>
         </w:tc>
@@ -4499,7 +4499,7 @@
               <w:rPr>
                 <w:sz w:val="19"/>
               </w:rPr>
-              <w:t>14 Sep 2028</w:t>
+              <w:t>12 Jun 2028</w:t>
             </w:r>
           </w:p>
         </w:tc>
@@ -4513,7 +4513,7 @@
               <w:rPr>
                 <w:sz w:val="19"/>
               </w:rPr>
-              <w:t>20 Sep 2028</w:t>
+              <w:t>02 Jul 2028</w:t>
             </w:r>
           </w:p>
         </w:tc>
@@ -4527,7 +4527,7 @@
               <w:rPr>
                 <w:sz w:val="19"/>
               </w:rPr>
-              <w:t>22</w:t>
+              <w:t>41</w:t>
             </w:r>
           </w:p>
         </w:tc>
@@ -4543,7 +4543,7 @@
               <w:rPr>
                 <w:sz w:val="19"/>
               </w:rPr>
-              <w:t>NQR-E1050</w:t>
+              <w:t>NQR-E1030</w:t>
             </w:r>
           </w:p>
         </w:tc>
@@ -4557,7 +4557,7 @@
               <w:rPr>
                 <w:sz w:val="19"/>
               </w:rPr>
-              <w:t>Preliminary design: submittal - Al Qurayyat</w:t>
+              <w:t>Concept design: submittal - Al Qurayyat</w:t>
             </w:r>
           </w:p>
         </w:tc>
@@ -4571,7 +4571,7 @@
               <w:rPr>
                 <w:sz w:val="19"/>
               </w:rPr>
-              <w:t>21 Sep 2028</w:t>
+              <w:t>27 Jul 2028</w:t>
             </w:r>
           </w:p>
         </w:tc>
@@ -4585,7 +4585,7 @@
               <w:rPr>
                 <w:sz w:val="19"/>
               </w:rPr>
-              <w:t>02 Oct 2028</w:t>
+              <w:t>09 Aug 2028</w:t>
             </w:r>
           </w:p>
         </w:tc>
@@ -4599,7 +4599,7 @@
               <w:rPr>
                 <w:sz w:val="19"/>
               </w:rPr>
-              <w:t>22</w:t>
+              <w:t>23</w:t>
             </w:r>
           </w:p>
         </w:tc>
@@ -4615,7 +4615,7 @@
               <w:rPr>
                 <w:sz w:val="19"/>
               </w:rPr>
-              <w:t>NQR-E1060</w:t>
+              <w:t>NQR-E1050</w:t>
             </w:r>
           </w:p>
         </w:tc>
@@ -4629,7 +4629,7 @@
               <w:rPr>
                 <w:sz w:val="19"/>
               </w:rPr>
-              <w:t>Preliminary design: SAR review and approval - Al Qurayyat</w:t>
+              <w:t>Preliminary design: submittal - Al Qurayyat</w:t>
             </w:r>
           </w:p>
         </w:tc>
@@ -4643,7 +4643,7 @@
               <w:rPr>
                 <w:sz w:val="19"/>
               </w:rPr>
-              <w:t>03 Oct 2028</w:t>
+              <w:t>10 Aug 2028</w:t>
             </w:r>
           </w:p>
         </w:tc>
@@ -4657,7 +4657,7 @@
               <w:rPr>
                 <w:sz w:val="19"/>
               </w:rPr>
-              <w:t>23 Oct 2028</w:t>
+              <w:t>31 Aug 2028</w:t>
             </w:r>
           </w:p>
         </w:tc>
@@ -4671,7 +4671,7 @@
               <w:rPr>
                 <w:sz w:val="19"/>
               </w:rPr>
-              <w:t>39</w:t>
+              <w:t>23</w:t>
             </w:r>
           </w:p>
         </w:tc>
@@ -4715,7 +4715,7 @@
               <w:rPr>
                 <w:sz w:val="19"/>
               </w:rPr>
-              <w:t>03 Oct 2028</w:t>
+              <w:t>03 Sep 2028</w:t>
             </w:r>
           </w:p>
         </w:tc>
@@ -4729,7 +4729,7 @@
               <w:rPr>
                 <w:sz w:val="19"/>
               </w:rPr>
-              <w:t>18 Oct 2028</w:t>
+              <w:t>08 Oct 2028</w:t>
             </w:r>
           </w:p>
         </w:tc>
@@ -4743,7 +4743,7 @@
               <w:rPr>
                 <w:sz w:val="19"/>
               </w:rPr>
-              <w:t>22</w:t>
+              <w:t>23</w:t>
             </w:r>
           </w:p>
         </w:tc>
@@ -4787,7 +4787,7 @@
               <w:rPr>
                 <w:sz w:val="19"/>
               </w:rPr>
-              <w:t>10 Oct 2028</w:t>
+              <w:t>17 Sep 2028</w:t>
             </w:r>
           </w:p>
         </w:tc>
@@ -4801,7 +4801,7 @@
               <w:rPr>
                 <w:sz w:val="19"/>
               </w:rPr>
-              <w:t>25 Oct 2028</w:t>
+              <w:t>24 Oct 2028</w:t>
             </w:r>
           </w:p>
         </w:tc>
@@ -4815,7 +4815,7 @@
               <w:rPr>
                 <w:sz w:val="19"/>
               </w:rPr>
-              <w:t>22</w:t>
+              <w:t>23</w:t>
             </w:r>
           </w:p>
         </w:tc>
@@ -4859,7 +4859,7 @@
               <w:rPr>
                 <w:sz w:val="19"/>
               </w:rPr>
-              <w:t>19 Oct 2028</w:t>
+              <w:t>09 Oct 2028</w:t>
             </w:r>
           </w:p>
         </w:tc>
@@ -4873,7 +4873,7 @@
               <w:rPr>
                 <w:sz w:val="19"/>
               </w:rPr>
-              <w:t>08 Nov 2028</w:t>
+              <w:t>29 Oct 2028</w:t>
             </w:r>
           </w:p>
         </w:tc>
@@ -4887,7 +4887,7 @@
               <w:rPr>
                 <w:sz w:val="19"/>
               </w:rPr>
-              <w:t>27</w:t>
+              <w:t>35</w:t>
             </w:r>
           </w:p>
         </w:tc>
@@ -4931,7 +4931,7 @@
               <w:rPr>
                 <w:sz w:val="19"/>
               </w:rPr>
-              <w:t>19 Oct 2028</w:t>
+              <w:t>09 Oct 2028</w:t>
             </w:r>
           </w:p>
         </w:tc>
@@ -4945,7 +4945,7 @@
               <w:rPr>
                 <w:sz w:val="19"/>
               </w:rPr>
-              <w:t>25 Oct 2028</w:t>
+              <w:t>24 Oct 2028</w:t>
             </w:r>
           </w:p>
         </w:tc>
@@ -4959,7 +4959,7 @@
               <w:rPr>
                 <w:sz w:val="19"/>
               </w:rPr>
-              <w:t>22</w:t>
+              <w:t>23</w:t>
             </w:r>
           </w:p>
         </w:tc>
@@ -5003,7 +5003,7 @@
               <w:rPr>
                 <w:sz w:val="19"/>
               </w:rPr>
-              <w:t>26 Oct 2028</w:t>
+              <w:t>25 Oct 2028</w:t>
             </w:r>
           </w:p>
         </w:tc>
@@ -5017,7 +5017,7 @@
               <w:rPr>
                 <w:sz w:val="19"/>
               </w:rPr>
-              <w:t>15 Nov 2028</w:t>
+              <w:t>14 Nov 2028</w:t>
             </w:r>
           </w:p>
         </w:tc>
@@ -5031,7 +5031,7 @@
               <w:rPr>
                 <w:sz w:val="19"/>
               </w:rPr>
-              <w:t>22</w:t>
+              <w:t>23</w:t>
             </w:r>
           </w:p>
         </w:tc>
@@ -5075,7 +5075,7 @@
               <w:rPr>
                 <w:sz w:val="19"/>
               </w:rPr>
-              <w:t>26 Oct 2028</w:t>
+              <w:t>25 Oct 2028</w:t>
             </w:r>
           </w:p>
         </w:tc>
@@ -5089,7 +5089,7 @@
               <w:rPr>
                 <w:sz w:val="19"/>
               </w:rPr>
-              <w:t>15 Nov 2028</w:t>
+              <w:t>14 Nov 2028</w:t>
             </w:r>
           </w:p>
         </w:tc>
@@ -5103,7 +5103,7 @@
               <w:rPr>
                 <w:sz w:val="19"/>
               </w:rPr>
-              <w:t>22</w:t>
+              <w:t>23</w:t>
             </w:r>
           </w:p>
         </w:tc>
@@ -5147,7 +5147,7 @@
               <w:rPr>
                 <w:sz w:val="19"/>
               </w:rPr>
-              <w:t>16 Nov 2028</w:t>
+              <w:t>15 Nov 2028</w:t>
             </w:r>
           </w:p>
         </w:tc>
@@ -5161,7 +5161,7 @@
               <w:rPr>
                 <w:sz w:val="19"/>
               </w:rPr>
-              <w:t>01 Mar 2029</w:t>
+              <w:t>28 Feb 2029</w:t>
             </w:r>
           </w:p>
         </w:tc>
@@ -5175,7 +5175,7 @@
               <w:rPr>
                 <w:sz w:val="19"/>
               </w:rPr>
-              <w:t>22</w:t>
+              <w:t>23</w:t>
             </w:r>
           </w:p>
         </w:tc>
@@ -5219,7 +5219,7 @@
               <w:rPr>
                 <w:sz w:val="19"/>
               </w:rPr>
-              <w:t>16 Nov 2028</w:t>
+              <w:t>15 Nov 2028</w:t>
             </w:r>
           </w:p>
         </w:tc>
@@ -5233,7 +5233,7 @@
               <w:rPr>
                 <w:sz w:val="19"/>
               </w:rPr>
-              <w:t>01 Mar 2029</w:t>
+              <w:t>28 Feb 2029</w:t>
             </w:r>
           </w:p>
         </w:tc>
@@ -5247,7 +5247,7 @@
               <w:rPr>
                 <w:sz w:val="19"/>
               </w:rPr>
-              <w:t>22</w:t>
+              <w:t>23</w:t>
             </w:r>
           </w:p>
         </w:tc>
@@ -5291,7 +5291,7 @@
               <w:rPr>
                 <w:sz w:val="19"/>
               </w:rPr>
-              <w:t>16 Nov 2028</w:t>
+              <w:t>15 Nov 2028</w:t>
             </w:r>
           </w:p>
         </w:tc>
@@ -5305,7 +5305,7 @@
               <w:rPr>
                 <w:sz w:val="19"/>
               </w:rPr>
-              <w:t>01 Mar 2029</w:t>
+              <w:t>28 Feb 2029</w:t>
             </w:r>
           </w:p>
         </w:tc>
@@ -5319,7 +5319,7 @@
               <w:rPr>
                 <w:sz w:val="19"/>
               </w:rPr>
-              <w:t>22</w:t>
+              <w:t>23</w:t>
             </w:r>
           </w:p>
         </w:tc>
@@ -5363,7 +5363,7 @@
               <w:rPr>
                 <w:sz w:val="19"/>
               </w:rPr>
-              <w:t>16 Nov 2028</w:t>
+              <w:t>15 Nov 2028</w:t>
             </w:r>
           </w:p>
         </w:tc>
@@ -5377,7 +5377,7 @@
               <w:rPr>
                 <w:sz w:val="19"/>
               </w:rPr>
-              <w:t>01 Mar 2029</w:t>
+              <w:t>28 Feb 2029</w:t>
             </w:r>
           </w:p>
         </w:tc>
@@ -5391,7 +5391,7 @@
               <w:rPr>
                 <w:sz w:val="19"/>
               </w:rPr>
-              <w:t>22</w:t>
+              <w:t>23</w:t>
             </w:r>
           </w:p>
         </w:tc>
@@ -5435,7 +5435,7 @@
               <w:rPr>
                 <w:sz w:val="19"/>
               </w:rPr>
-              <w:t>04 Mar 2029</w:t>
+              <w:t>01 Mar 2029</w:t>
             </w:r>
           </w:p>
         </w:tc>
@@ -5449,7 +5449,7 @@
               <w:rPr>
                 <w:sz w:val="19"/>
               </w:rPr>
-              <w:t>15 Mar 2029</w:t>
+              <w:t>14 Mar 2029</w:t>
             </w:r>
           </w:p>
         </w:tc>
@@ -5463,7 +5463,7 @@
               <w:rPr>
                 <w:sz w:val="19"/>
               </w:rPr>
-              <w:t>22</w:t>
+              <w:t>23</w:t>
             </w:r>
           </w:p>
         </w:tc>
@@ -5507,7 +5507,7 @@
               <w:rPr>
                 <w:sz w:val="19"/>
               </w:rPr>
-              <w:t>18 Mar 2029</w:t>
+              <w:t>15 Mar 2029</w:t>
             </w:r>
           </w:p>
         </w:tc>
@@ -5521,7 +5521,7 @@
               <w:rPr>
                 <w:sz w:val="19"/>
               </w:rPr>
-              <w:t>19 Apr 2029</w:t>
+              <w:t>18 Apr 2029</w:t>
             </w:r>
           </w:p>
         </w:tc>
@@ -5535,7 +5535,7 @@
               <w:rPr>
                 <w:sz w:val="19"/>
               </w:rPr>
-              <w:t>22</w:t>
+              <w:t>23</w:t>
             </w:r>
           </w:p>
         </w:tc>
@@ -5579,7 +5579,7 @@
               <w:rPr>
                 <w:sz w:val="19"/>
               </w:rPr>
-              <w:t>29 Apr 2029</w:t>
+              <w:t>19 Apr 2029</w:t>
             </w:r>
           </w:p>
         </w:tc>
@@ -5593,7 +5593,7 @@
               <w:rPr>
                 <w:sz w:val="19"/>
               </w:rPr>
-              <w:t>03 May 2029</w:t>
+              <w:t>02 May 2029</w:t>
             </w:r>
           </w:p>
         </w:tc>
@@ -5607,7 +5607,7 @@
               <w:rPr>
                 <w:sz w:val="19"/>
               </w:rPr>
-              <w:t>22</w:t>
+              <w:t>23</w:t>
             </w:r>
           </w:p>
         </w:tc>
@@ -5651,7 +5651,7 @@
               <w:rPr>
                 <w:sz w:val="19"/>
               </w:rPr>
-              <w:t>06 May 2029</w:t>
+              <w:t>03 May 2029</w:t>
             </w:r>
           </w:p>
         </w:tc>
@@ -5665,7 +5665,7 @@
               <w:rPr>
                 <w:sz w:val="19"/>
               </w:rPr>
-              <w:t>20 May 2029</w:t>
+              <w:t>17 May 2029</w:t>
             </w:r>
           </w:p>
         </w:tc>
@@ -5679,7 +5679,7 @@
               <w:rPr>
                 <w:sz w:val="19"/>
               </w:rPr>
-              <w:t>22</w:t>
+              <w:t>23</w:t>
             </w:r>
           </w:p>
         </w:tc>
@@ -5723,7 +5723,7 @@
               <w:rPr>
                 <w:sz w:val="19"/>
               </w:rPr>
-              <w:t>10 May 2029</w:t>
+              <w:t>09 May 2029</w:t>
             </w:r>
           </w:p>
         </w:tc>
@@ -5737,7 +5737,7 @@
               <w:rPr>
                 <w:sz w:val="19"/>
               </w:rPr>
-              <w:t>04 Jun 2029</w:t>
+              <w:t>03 Jun 2029</w:t>
             </w:r>
           </w:p>
         </w:tc>
@@ -5751,7 +5751,7 @@
               <w:rPr>
                 <w:sz w:val="19"/>
               </w:rPr>
-              <w:t>22</w:t>
+              <w:t>23</w:t>
             </w:r>
           </w:p>
         </w:tc>
@@ -5795,7 +5795,7 @@
               <w:rPr>
                 <w:sz w:val="19"/>
               </w:rPr>
-              <w:t>21 May 2029</w:t>
+              <w:t>20 May 2029</w:t>
             </w:r>
           </w:p>
         </w:tc>
@@ -5809,7 +5809,7 @@
               <w:rPr>
                 <w:sz w:val="19"/>
               </w:rPr>
-              <w:t>05 Jun 2029</w:t>
+              <w:t>04 Jun 2029</w:t>
             </w:r>
           </w:p>
         </w:tc>
@@ -5823,7 +5823,7 @@
               <w:rPr>
                 <w:sz w:val="19"/>
               </w:rPr>
-              <w:t>35</w:t>
+              <w:t>36</w:t>
             </w:r>
           </w:p>
         </w:tc>
@@ -6537,7 +6537,7 @@
         <w:pStyle w:val="ListBullet"/>
       </w:pPr>
       <w:r>
-        <w:t>Enabling and civil works at the priority stations start before the engineering approval milestone, at the Contractor risk; equipment is not ordered before approval.</w:t>
+        <w:t>Enabling and civil works start two months before the end of design at every station, before the engineering approval milestone, at the Contractor risk; equipment is not ordered before approval.</w:t>
       </w:r>
     </w:p>
     <w:p>

</xml_diff>

<commit_message>
Survey access permit (two months) in months 1-2; survey moved into the four-month design
Co-Authored-By: Claude Sonnet 5.5 <noreply@anthropic.com>
Claude-Session: https://claude.ai/code/session_01DZdGPWRxvKXCnMyT6qFPZb
</commit_message>
<xml_diff>
--- a/p6/0580_Schedule_Narrative.docx
+++ b/p6/0580_Schedule_Narrative.docx
@@ -67,7 +67,7 @@
         <w:rPr>
           <w:b w:val="0"/>
         </w:rPr>
-        <w:t>This narrative describes the baseline programme (Rev 1) of project 0580-Security Technology Salutation after eliminating Passenger Checking Roles, covering 14 stations on three railways (North South Railway, East West Railway and Haramain High Speed Rail). It is delivered as a Primavera P6 24 XER file with 600 activities (508 tasks and 92 milestones) and 928 logic links. It runs from the Notice to Proceed milestone on 01 Nov 2026 to the contract completion milestone on 31 Oct 2029.</w:t>
+        <w:t>This narrative describes the baseline programme (Rev 1) of project 0580-Security Technology Salutation after eliminating Passenger Checking Roles, covering 14 stations on three railways (North South Railway, East West Railway and Haramain High Speed Rail). It is delivered as a Primavera P6 24 XER file with 614 activities (522 tasks and 92 milestones) and 931 logic links. It runs from the Notice to Proceed milestone on 01 Nov 2026 to the contract completion milestone on 31 Oct 2029.</w:t>
       </w:r>
     </w:p>
     <w:p>
@@ -158,7 +158,7 @@
               <w:rPr>
                 <w:sz w:val="19"/>
               </w:rPr>
-              <w:t>Months 1-2 mobilization and site survey; months 3-6 design (four months). Milestones: mobilization and survey complete, design complete.</w:t>
+              <w:t>Months 1-2 mobilization and the survey access permit (the permit takes two months); months 3-6 design (four months) which starts with the site survey. Milestones: mobilization and permits complete, design complete.</w:t>
             </w:r>
           </w:p>
         </w:tc>
@@ -531,7 +531,7 @@
               <w:rPr>
                 <w:sz w:val="19"/>
               </w:rPr>
-              <w:t>Mobilization and site survey complete (end of month 2)</w:t>
+              <w:t>Mobilization and survey permits complete (end of month 2)</w:t>
             </w:r>
           </w:p>
         </w:tc>
@@ -589,7 +589,7 @@
               <w:rPr>
                 <w:sz w:val="19"/>
               </w:rPr>
-              <w:t>14 Jan 2027</w:t>
+              <w:t>21 Mar 2027</w:t>
             </w:r>
           </w:p>
         </w:tc>
@@ -830,7 +830,7 @@
               <w:rPr>
                 <w:sz w:val="19"/>
               </w:rPr>
-              <w:t>Mobilization and site survey (months 1-2)</w:t>
+              <w:t>Mobilization and survey permit (months 1-2)</w:t>
             </w:r>
           </w:p>
         </w:tc>
@@ -858,7 +858,7 @@
               <w:rPr>
                 <w:sz w:val="19"/>
               </w:rPr>
-              <w:t>24 Dec 2026</w:t>
+              <w:t>31 Dec 2026</w:t>
             </w:r>
           </w:p>
         </w:tc>
@@ -872,7 +872,7 @@
               <w:rPr>
                 <w:sz w:val="19"/>
               </w:rPr>
-              <w:t>Mobilization, initial baseline, survey submittal and 21 day approval at Riyadh (Thumamah), Makkah and Riyadh (Malaz)</w:t>
+              <w:t>Mobilization, initial baseline, and the two month site access permit for the survey at Riyadh (Thumamah), Makkah and Riyadh (Malaz)</w:t>
             </w:r>
           </w:p>
         </w:tc>
@@ -888,7 +888,7 @@
               <w:rPr>
                 <w:sz w:val="19"/>
               </w:rPr>
-              <w:t>Design (months 3-6)</w:t>
+              <w:t>Design including survey (months 3-6)</w:t>
             </w:r>
           </w:p>
         </w:tc>
@@ -930,7 +930,7 @@
               <w:rPr>
                 <w:sz w:val="19"/>
               </w:rPr>
-              <w:t>Concept, preliminary, detailed and IFC design with HCIS documents; each stage submitted and approved in 21 days</w:t>
+              <w:t>Site survey, concept, preliminary, detailed and IFC design with HCIS documents; each stage submitted and approved in 21 days</w:t>
             </w:r>
           </w:p>
         </w:tc>
@@ -1000,7 +1000,7 @@
         <w:rPr>
           <w:b w:val="0"/>
         </w:rPr>
-        <w:t>The two month window for mobilization and survey is held by a logic link from NTP (milestone PRJ-M1150) at the priority stations; design starts after that milestone and the survey approval. At the other stations design starts two months after their own survey starts. Design lasts four months at every station. Enabling works start two months before the end of design, so design and execution overlap by two months. No date constraint is used.</w:t>
+        <w:t>The survey needs a site access permit and the permit takes two months, so months 1 and 2 are mobilization and the permit (activity E1005 at each station). The survey is the first part of design, so design starts when the permit is granted and lasts four months in total, survey included. At the priority stations the two month window is held by milestone PRJ-M1150; at the other stations design starts when their own permit ends. Enabling works start two months before the end of design, so design and execution overlap by two months. No date constraint is used.</w:t>
       </w:r>
     </w:p>
     <w:p>
@@ -1016,7 +1016,7 @@
         <w:rPr>
           <w:b w:val="0"/>
         </w:rPr>
-        <w:t>Priority 1: Makkah (Haramain) and Riyadh (Thumamah, North South Railway). Their surveys start first and their enabling and civil works run in parallel with design. Equipment is manufactured only after SAR approval of the engineering (milestone MS3), so no equipment is ordered before approval. Priority 2: Riyadh (Malaz, East West Railway), surveyed in the same two months. The remaining stations follow in waves after the detailed baseline is approved, each with the same four month design.</w:t>
+        <w:t>Priority 1: Makkah (Haramain) and Riyadh (Thumamah, North South Railway). Their permits are applied for first and their enabling and civil works run in parallel with design. Equipment is manufactured only after SAR approval of the engineering (milestone MS3), so no equipment is ordered before approval. Priority 2: Riyadh (Malaz, East West Railway), permitted in the same two months. The remaining stations follow in waves after the detailed baseline is approved, each with the same four month design.</w:t>
       </w:r>
     </w:p>
     <w:tbl>
@@ -1098,7 +1098,7 @@
                 <w:color w:val="FFFFFF"/>
                 <w:sz w:val="19"/>
               </w:rPr>
-              <w:t>Survey start</w:t>
+              <w:t>Permit start</w:t>
             </w:r>
           </w:p>
         </w:tc>
@@ -1173,7 +1173,7 @@
               <w:rPr>
                 <w:sz w:val="19"/>
               </w:rPr>
-              <w:t>08 Nov 2026</w:t>
+              <w:t>01 Nov 2026</w:t>
             </w:r>
           </w:p>
         </w:tc>
@@ -1245,7 +1245,7 @@
               <w:rPr>
                 <w:sz w:val="19"/>
               </w:rPr>
-              <w:t>08 Nov 2026</w:t>
+              <w:t>01 Nov 2026</w:t>
             </w:r>
           </w:p>
         </w:tc>
@@ -1317,7 +1317,7 @@
               <w:rPr>
                 <w:sz w:val="19"/>
               </w:rPr>
-              <w:t>15 Nov 2026</w:t>
+              <w:t>01 Nov 2026</w:t>
             </w:r>
           </w:p>
         </w:tc>
@@ -1389,7 +1389,7 @@
               <w:rPr>
                 <w:sz w:val="19"/>
               </w:rPr>
-              <w:t>11 Feb 2027</w:t>
+              <w:t>22 Mar 2027</w:t>
             </w:r>
           </w:p>
         </w:tc>
@@ -1403,7 +1403,7 @@
               <w:rPr>
                 <w:sz w:val="19"/>
               </w:rPr>
-              <w:t>24 Oct 2028</w:t>
+              <w:t>26 Nov 2028</w:t>
             </w:r>
           </w:p>
         </w:tc>
@@ -1475,7 +1475,7 @@
               <w:rPr>
                 <w:sz w:val="19"/>
               </w:rPr>
-              <w:t>28 Aug 2028</w:t>
+              <w:t>30 Aug 2028</w:t>
             </w:r>
           </w:p>
         </w:tc>
@@ -1547,7 +1547,7 @@
               <w:rPr>
                 <w:sz w:val="19"/>
               </w:rPr>
-              <w:t>23 Oct 2028</w:t>
+              <w:t>25 Oct 2028</w:t>
             </w:r>
           </w:p>
         </w:tc>
@@ -1619,7 +1619,7 @@
               <w:rPr>
                 <w:sz w:val="19"/>
               </w:rPr>
-              <w:t>15 Oct 2028</w:t>
+              <w:t>17 Oct 2028</w:t>
             </w:r>
           </w:p>
         </w:tc>
@@ -1691,7 +1691,7 @@
               <w:rPr>
                 <w:sz w:val="19"/>
               </w:rPr>
-              <w:t>03 Dec 2028</w:t>
+              <w:t>05 Dec 2028</w:t>
             </w:r>
           </w:p>
         </w:tc>
@@ -1763,7 +1763,7 @@
               <w:rPr>
                 <w:sz w:val="19"/>
               </w:rPr>
-              <w:t>08 Jul 2029</w:t>
+              <w:t>10 Jul 2029</w:t>
             </w:r>
           </w:p>
         </w:tc>
@@ -1835,7 +1835,7 @@
               <w:rPr>
                 <w:sz w:val="19"/>
               </w:rPr>
-              <w:t>12 Jul 2029</w:t>
+              <w:t>16 Jul 2029</w:t>
             </w:r>
           </w:p>
         </w:tc>
@@ -1907,7 +1907,7 @@
               <w:rPr>
                 <w:sz w:val="19"/>
               </w:rPr>
-              <w:t>29 Apr 2029</w:t>
+              <w:t>01 May 2029</w:t>
             </w:r>
           </w:p>
         </w:tc>
@@ -1979,7 +1979,7 @@
               <w:rPr>
                 <w:sz w:val="19"/>
               </w:rPr>
-              <w:t>03 Jun 2029</w:t>
+              <w:t>05 Jun 2029</w:t>
             </w:r>
           </w:p>
         </w:tc>
@@ -2051,7 +2051,7 @@
               <w:rPr>
                 <w:sz w:val="19"/>
               </w:rPr>
-              <w:t>02 Aug 2029</w:t>
+              <w:t>06 Aug 2029</w:t>
             </w:r>
           </w:p>
         </w:tc>
@@ -2123,7 +2123,7 @@
               <w:rPr>
                 <w:sz w:val="19"/>
               </w:rPr>
-              <w:t>13 Sep 2029</w:t>
+              <w:t>17 Sep 2029</w:t>
             </w:r>
           </w:p>
         </w:tc>
@@ -2286,7 +2286,7 @@
               <w:rPr>
                 <w:sz w:val="19"/>
               </w:rPr>
-              <w:t>22 Nov 2026</w:t>
+              <w:t>03 Jan 2027</w:t>
             </w:r>
           </w:p>
         </w:tc>
@@ -2300,7 +2300,7 @@
               <w:rPr>
                 <w:sz w:val="19"/>
               </w:rPr>
-              <w:t>30 Nov 2026</w:t>
+              <w:t>07 Jan 2027</w:t>
             </w:r>
           </w:p>
         </w:tc>
@@ -2314,7 +2314,7 @@
               <w:rPr>
                 <w:sz w:val="19"/>
               </w:rPr>
-              <w:t>7</w:t>
+              <w:t>5</w:t>
             </w:r>
           </w:p>
         </w:tc>
@@ -2358,7 +2358,7 @@
               <w:rPr>
                 <w:sz w:val="19"/>
               </w:rPr>
-              <w:t>01 Dec 2026</w:t>
+              <w:t>10 Jan 2027</w:t>
             </w:r>
           </w:p>
         </w:tc>
@@ -2372,7 +2372,7 @@
               <w:rPr>
                 <w:sz w:val="19"/>
               </w:rPr>
-              <w:t>21 Dec 2026</w:t>
+              <w:t>28 Jan 2027</w:t>
             </w:r>
           </w:p>
         </w:tc>
@@ -2430,7 +2430,7 @@
               <w:rPr>
                 <w:sz w:val="19"/>
               </w:rPr>
-              <w:t>22 Dec 2026</w:t>
+              <w:t>31 Jan 2027</w:t>
             </w:r>
           </w:p>
         </w:tc>
@@ -2444,7 +2444,7 @@
               <w:rPr>
                 <w:sz w:val="19"/>
               </w:rPr>
-              <w:t>04 Jan 2027</w:t>
+              <w:t>09 Feb 2027</w:t>
             </w:r>
           </w:p>
         </w:tc>
@@ -2458,7 +2458,7 @@
               <w:rPr>
                 <w:sz w:val="19"/>
               </w:rPr>
-              <w:t>10</w:t>
+              <w:t>8</w:t>
             </w:r>
           </w:p>
         </w:tc>
@@ -2502,7 +2502,7 @@
               <w:rPr>
                 <w:sz w:val="19"/>
               </w:rPr>
-              <w:t>05 Jan 2027</w:t>
+              <w:t>10 Feb 2027</w:t>
             </w:r>
           </w:p>
         </w:tc>
@@ -2516,7 +2516,7 @@
               <w:rPr>
                 <w:sz w:val="19"/>
               </w:rPr>
-              <w:t>25 Jan 2027</w:t>
+              <w:t>28 Feb 2027</w:t>
             </w:r>
           </w:p>
         </w:tc>
@@ -2530,7 +2530,7 @@
               <w:rPr>
                 <w:sz w:val="19"/>
               </w:rPr>
-              <w:t>15</w:t>
+              <w:t>12</w:t>
             </w:r>
           </w:p>
         </w:tc>
@@ -2574,7 +2574,7 @@
               <w:rPr>
                 <w:sz w:val="19"/>
               </w:rPr>
-              <w:t>05 Jan 2027</w:t>
+              <w:t>10 Feb 2027</w:t>
             </w:r>
           </w:p>
         </w:tc>
@@ -2588,7 +2588,7 @@
               <w:rPr>
                 <w:sz w:val="19"/>
               </w:rPr>
-              <w:t>25 Jan 2027</w:t>
+              <w:t>28 Feb 2027</w:t>
             </w:r>
           </w:p>
         </w:tc>
@@ -2602,7 +2602,7 @@
               <w:rPr>
                 <w:sz w:val="19"/>
               </w:rPr>
-              <w:t>15</w:t>
+              <w:t>12</w:t>
             </w:r>
           </w:p>
         </w:tc>
@@ -2646,7 +2646,7 @@
               <w:rPr>
                 <w:sz w:val="19"/>
               </w:rPr>
-              <w:t>26 Jan 2027</w:t>
+              <w:t>01 Mar 2027</w:t>
             </w:r>
           </w:p>
         </w:tc>
@@ -2660,7 +2660,7 @@
               <w:rPr>
                 <w:sz w:val="19"/>
               </w:rPr>
-              <w:t>08 Feb 2027</w:t>
+              <w:t>17 Mar 2027</w:t>
             </w:r>
           </w:p>
         </w:tc>
@@ -2674,7 +2674,7 @@
               <w:rPr>
                 <w:sz w:val="19"/>
               </w:rPr>
-              <w:t>10</w:t>
+              <w:t>8</w:t>
             </w:r>
           </w:p>
         </w:tc>
@@ -2718,7 +2718,7 @@
               <w:rPr>
                 <w:sz w:val="19"/>
               </w:rPr>
-              <w:t>09 Feb 2027</w:t>
+              <w:t>18 Mar 2027</w:t>
             </w:r>
           </w:p>
         </w:tc>
@@ -2732,7 +2732,7 @@
               <w:rPr>
                 <w:sz w:val="19"/>
               </w:rPr>
-              <w:t>15 Feb 2027</w:t>
+              <w:t>24 Mar 2027</w:t>
             </w:r>
           </w:p>
         </w:tc>
@@ -2790,7 +2790,7 @@
               <w:rPr>
                 <w:sz w:val="19"/>
               </w:rPr>
-              <w:t>16 Feb 2027</w:t>
+              <w:t>25 Mar 2027</w:t>
             </w:r>
           </w:p>
         </w:tc>
@@ -2804,7 +2804,7 @@
               <w:rPr>
                 <w:sz w:val="19"/>
               </w:rPr>
-              <w:t>02 Mar 2027</w:t>
+              <w:t>07 Apr 2027</w:t>
             </w:r>
           </w:p>
         </w:tc>
@@ -2862,7 +2862,7 @@
               <w:rPr>
                 <w:sz w:val="19"/>
               </w:rPr>
-              <w:t>03 Mar 2027</w:t>
+              <w:t>08 Apr 2027</w:t>
             </w:r>
           </w:p>
         </w:tc>
@@ -2876,7 +2876,7 @@
               <w:rPr>
                 <w:sz w:val="19"/>
               </w:rPr>
-              <w:t>25 Mar 2027</w:t>
+              <w:t>25 Apr 2027</w:t>
             </w:r>
           </w:p>
         </w:tc>
@@ -2934,7 +2934,7 @@
               <w:rPr>
                 <w:sz w:val="19"/>
               </w:rPr>
-              <w:t>28 Mar 2027</w:t>
+              <w:t>26 Apr 2027</w:t>
             </w:r>
           </w:p>
         </w:tc>
@@ -2948,7 +2948,7 @@
               <w:rPr>
                 <w:sz w:val="19"/>
               </w:rPr>
-              <w:t>25 Mar 2027</w:t>
+              <w:t>25 Apr 2027</w:t>
             </w:r>
           </w:p>
         </w:tc>
@@ -2998,7 +2998,7 @@
         <w:rPr>
           <w:b w:val="0"/>
         </w:rPr>
-        <w:t>104 approval activities are loaded. Their durations: 10 days x 1, 12 days x 1, 15 days x 101, 22 days x 1 (working days).</w:t>
+        <w:t>118 approval activities are loaded. Their durations: 10 days x 1, 12 days x 1, 15 days x 101, 22 days x 1, 45 days x 14 (working days).</w:t>
       </w:r>
     </w:p>
     <w:p>
@@ -3633,7 +3633,7 @@
         <w:rPr>
           <w:b w:val="0"/>
         </w:rPr>
-        <w:t>The WBS follows EPC. Level 1 is the project (0580), level 2 the EPC phase (Engineering, Procurement, Construction, Commissioning and handover, plus Project management), level 3 the station, level 4 the design stage or work package (enabling works, civil, installation, POC), and level 5 the submittal, approval or area. There are 520 nodes. Levels 6 to 8 are not used because the contract gives no zone-level data; they can be added when it does.</w:t>
+        <w:t>The WBS follows EPC. Level 1 is the project (0580), level 2 the EPC phase (Engineering, Procurement, Construction, Commissioning and handover, plus Project management), level 3 the station, level 4 the design stage or work package (enabling works, civil, installation, POC), and level 5 the submittal, approval or area. There are 534 nodes. Levels 6 to 8 are not used because the contract gives no zone-level data; they can be added when it does.</w:t>
       </w:r>
     </w:p>
     <w:tbl>
@@ -3828,7 +3828,7 @@
               <w:rPr>
                 <w:sz w:val="19"/>
               </w:rPr>
-              <w:t>201</w:t>
+              <w:t>215</w:t>
             </w:r>
           </w:p>
         </w:tc>
@@ -3848,7 +3848,7 @@
         <w:rPr>
           <w:b w:val="0"/>
         </w:rPr>
-        <w:t>Engineering is divided by recognised design stage: site survey, concept design, preliminary design, detailed design, issued for construction, HCIS submission and as-built. Within each stage there is a submittal and a 21 day SAR approval. Procurement is released after the engineering approval milestone (MS3).</w:t>
+        <w:t>Engineering is divided by recognised design stage: site survey (after the two month access permit), concept design, preliminary design, detailed design, issued for construction, HCIS submission and as-built. Within each stage there is a submittal and a 21 day SAR approval. Procurement is released after the engineering approval milestone (MS3).</w:t>
       </w:r>
     </w:p>
     <w:p>
@@ -3924,7 +3924,7 @@
         <w:rPr>
           <w:b w:val="0"/>
         </w:rPr>
-        <w:t>The contract completion milestone is held by the 36 month term, so no activity has zero float against it. The longest physical path finishes 23 working days before the contract end date, and that margin is the project float. 28 tasks sit on this longest path and 7 more are within 20 working days of it. The first 25 in date order are listed below.</w:t>
+        <w:t>The contract completion milestone is held by the 36 month term, so no activity has zero float against it. The longest physical path finishes 21 working days before the contract end date, and that margin is the project float. 32 tasks sit on this longest path and 8 more are within 20 working days of it. The first 25 in date order are listed below.</w:t>
       </w:r>
     </w:p>
     <w:tbl>
@@ -4039,7 +4039,7 @@
               <w:rPr>
                 <w:sz w:val="19"/>
               </w:rPr>
-              <w:t>NRY-E1010</w:t>
+              <w:t>NRY-E1005</w:t>
             </w:r>
           </w:p>
         </w:tc>
@@ -4053,7 +4053,7 @@
               <w:rPr>
                 <w:sz w:val="19"/>
               </w:rPr>
-              <w:t>Survey: submittal of site survey and as-found report - Riyadh (Thumamah)</w:t>
+              <w:t>Survey: site access permit - application and approval (two months) - Riyadh (Thumamah)</w:t>
             </w:r>
           </w:p>
         </w:tc>
@@ -4067,7 +4067,7 @@
               <w:rPr>
                 <w:sz w:val="19"/>
               </w:rPr>
-              <w:t>08 Nov 2026</w:t>
+              <w:t>01 Nov 2026</w:t>
             </w:r>
           </w:p>
         </w:tc>
@@ -4081,7 +4081,7 @@
               <w:rPr>
                 <w:sz w:val="19"/>
               </w:rPr>
-              <w:t>19 Nov 2026</w:t>
+              <w:t>31 Dec 2026</w:t>
             </w:r>
           </w:p>
         </w:tc>
@@ -4095,7 +4095,7 @@
               <w:rPr>
                 <w:sz w:val="19"/>
               </w:rPr>
-              <w:t>33</w:t>
+              <w:t>21</w:t>
             </w:r>
           </w:p>
         </w:tc>
@@ -4111,7 +4111,7 @@
               <w:rPr>
                 <w:sz w:val="19"/>
               </w:rPr>
-              <w:t>HMK-E1010</w:t>
+              <w:t>HMK-E1005</w:t>
             </w:r>
           </w:p>
         </w:tc>
@@ -4125,7 +4125,7 @@
               <w:rPr>
                 <w:sz w:val="19"/>
               </w:rPr>
-              <w:t>Survey: submittal of site survey and as-found report - Makkah</w:t>
+              <w:t>Survey: site access permit - application and approval (two months) - Makkah</w:t>
             </w:r>
           </w:p>
         </w:tc>
@@ -4139,7 +4139,7 @@
               <w:rPr>
                 <w:sz w:val="19"/>
               </w:rPr>
-              <w:t>08 Nov 2026</w:t>
+              <w:t>01 Nov 2026</w:t>
             </w:r>
           </w:p>
         </w:tc>
@@ -4153,7 +4153,7 @@
               <w:rPr>
                 <w:sz w:val="19"/>
               </w:rPr>
-              <w:t>03 Dec 2026</w:t>
+              <w:t>31 Dec 2026</w:t>
             </w:r>
           </w:p>
         </w:tc>
@@ -4167,7 +4167,7 @@
               <w:rPr>
                 <w:sz w:val="19"/>
               </w:rPr>
-              <w:t>23</w:t>
+              <w:t>21</w:t>
             </w:r>
           </w:p>
         </w:tc>
@@ -4183,7 +4183,7 @@
               <w:rPr>
                 <w:sz w:val="19"/>
               </w:rPr>
-              <w:t>ERY-E1010</w:t>
+              <w:t>ERY-E1005</w:t>
             </w:r>
           </w:p>
         </w:tc>
@@ -4197,7 +4197,7 @@
               <w:rPr>
                 <w:sz w:val="19"/>
               </w:rPr>
-              <w:t>Survey: submittal of site survey and as-found report - Riyadh (Malaz)</w:t>
+              <w:t>Survey: site access permit - application and approval (two months) - Riyadh (Malaz)</w:t>
             </w:r>
           </w:p>
         </w:tc>
@@ -4211,7 +4211,7 @@
               <w:rPr>
                 <w:sz w:val="19"/>
               </w:rPr>
-              <w:t>15 Nov 2026</w:t>
+              <w:t>01 Nov 2026</w:t>
             </w:r>
           </w:p>
         </w:tc>
@@ -4225,7 +4225,7 @@
               <w:rPr>
                 <w:sz w:val="19"/>
               </w:rPr>
-              <w:t>26 Nov 2026</w:t>
+              <w:t>31 Dec 2026</w:t>
             </w:r>
           </w:p>
         </w:tc>
@@ -4239,7 +4239,7 @@
               <w:rPr>
                 <w:sz w:val="19"/>
               </w:rPr>
-              <w:t>28</w:t>
+              <w:t>21</w:t>
             </w:r>
           </w:p>
         </w:tc>
@@ -4255,7 +4255,7 @@
               <w:rPr>
                 <w:sz w:val="19"/>
               </w:rPr>
-              <w:t>PRJ-A2010</w:t>
+              <w:t>PRJ-A1040</w:t>
             </w:r>
           </w:p>
         </w:tc>
@@ -4269,7 +4269,7 @@
               <w:rPr>
                 <w:sz w:val="19"/>
               </w:rPr>
-              <w:t>Detailed baseline programme (within 21 days after survey)</w:t>
+              <w:t>Mobilization: site establishment, offices, personnel and tools</w:t>
             </w:r>
           </w:p>
         </w:tc>
@@ -4283,7 +4283,7 @@
               <w:rPr>
                 <w:sz w:val="19"/>
               </w:rPr>
-              <w:t>06 Dec 2026</w:t>
+              <w:t>08 Nov 2026</w:t>
             </w:r>
           </w:p>
         </w:tc>
@@ -4297,7 +4297,7 @@
               <w:rPr>
                 <w:sz w:val="19"/>
               </w:rPr>
-              <w:t>24 Dec 2026</w:t>
+              <w:t>10 Dec 2026</w:t>
             </w:r>
           </w:p>
         </w:tc>
@@ -4311,7 +4311,7 @@
               <w:rPr>
                 <w:sz w:val="19"/>
               </w:rPr>
-              <w:t>23</w:t>
+              <w:t>36</w:t>
             </w:r>
           </w:p>
         </w:tc>
@@ -4327,7 +4327,7 @@
               <w:rPr>
                 <w:sz w:val="19"/>
               </w:rPr>
-              <w:t>PRJ-A2020</w:t>
+              <w:t>PRJ-A1050</w:t>
             </w:r>
           </w:p>
         </w:tc>
@@ -4341,7 +4341,7 @@
               <w:rPr>
                 <w:sz w:val="19"/>
               </w:rPr>
-              <w:t>SAR review and approval of detailed baseline</w:t>
+              <w:t>Mobilization submittals: QC programme and ITP, HSE, security, procurement and shipping plan</w:t>
             </w:r>
           </w:p>
         </w:tc>
@@ -4355,7 +4355,7 @@
               <w:rPr>
                 <w:sz w:val="19"/>
               </w:rPr>
-              <w:t>27 Dec 2026</w:t>
+              <w:t>08 Nov 2026</w:t>
             </w:r>
           </w:p>
         </w:tc>
@@ -4369,7 +4369,7 @@
               <w:rPr>
                 <w:sz w:val="19"/>
               </w:rPr>
-              <w:t>14 Jan 2027</w:t>
+              <w:t>03 Dec 2026</w:t>
             </w:r>
           </w:p>
         </w:tc>
@@ -4383,7 +4383,7 @@
               <w:rPr>
                 <w:sz w:val="19"/>
               </w:rPr>
-              <w:t>23</w:t>
+              <w:t>41</w:t>
             </w:r>
           </w:p>
         </w:tc>
@@ -4399,7 +4399,7 @@
               <w:rPr>
                 <w:sz w:val="19"/>
               </w:rPr>
-              <w:t>NQR-E1010</w:t>
+              <w:t>NRY-E1010</w:t>
             </w:r>
           </w:p>
         </w:tc>
@@ -4413,7 +4413,7 @@
               <w:rPr>
                 <w:sz w:val="19"/>
               </w:rPr>
-              <w:t>Survey: submittal of site survey and as-found report - Al Qurayyat</w:t>
+              <w:t>Survey: submittal of site survey and as-found report - Riyadh (Thumamah)</w:t>
             </w:r>
           </w:p>
         </w:tc>
@@ -4427,7 +4427,7 @@
               <w:rPr>
                 <w:sz w:val="19"/>
               </w:rPr>
-              <w:t>29 May 2028</w:t>
+              <w:t>03 Jan 2027</w:t>
             </w:r>
           </w:p>
         </w:tc>
@@ -4441,7 +4441,7 @@
               <w:rPr>
                 <w:sz w:val="19"/>
               </w:rPr>
-              <w:t>11 Jun 2028</w:t>
+              <w:t>14 Jan 2027</w:t>
             </w:r>
           </w:p>
         </w:tc>
@@ -4455,7 +4455,7 @@
               <w:rPr>
                 <w:sz w:val="19"/>
               </w:rPr>
-              <w:t>23</w:t>
+              <w:t>31</w:t>
             </w:r>
           </w:p>
         </w:tc>
@@ -4471,7 +4471,7 @@
               <w:rPr>
                 <w:sz w:val="19"/>
               </w:rPr>
-              <w:t>NQR-E1020</w:t>
+              <w:t>ERY-E1010</w:t>
             </w:r>
           </w:p>
         </w:tc>
@@ -4485,7 +4485,7 @@
               <w:rPr>
                 <w:sz w:val="19"/>
               </w:rPr>
-              <w:t>Survey: SAR approval of survey report - Al Qurayyat</w:t>
+              <w:t>Survey: submittal of site survey and as-found report - Riyadh (Malaz)</w:t>
             </w:r>
           </w:p>
         </w:tc>
@@ -4499,7 +4499,7 @@
               <w:rPr>
                 <w:sz w:val="19"/>
               </w:rPr>
-              <w:t>12 Jun 2028</w:t>
+              <w:t>03 Jan 2027</w:t>
             </w:r>
           </w:p>
         </w:tc>
@@ -4513,7 +4513,7 @@
               <w:rPr>
                 <w:sz w:val="19"/>
               </w:rPr>
-              <w:t>02 Jul 2028</w:t>
+              <w:t>14 Jan 2027</w:t>
             </w:r>
           </w:p>
         </w:tc>
@@ -4527,7 +4527,7 @@
               <w:rPr>
                 <w:sz w:val="19"/>
               </w:rPr>
-              <w:t>41</w:t>
+              <w:t>31</w:t>
             </w:r>
           </w:p>
         </w:tc>
@@ -4543,7 +4543,7 @@
               <w:rPr>
                 <w:sz w:val="19"/>
               </w:rPr>
-              <w:t>NQR-E1030</w:t>
+              <w:t>HMK-E1010</w:t>
             </w:r>
           </w:p>
         </w:tc>
@@ -4557,7 +4557,7 @@
               <w:rPr>
                 <w:sz w:val="19"/>
               </w:rPr>
-              <w:t>Concept design: submittal - Al Qurayyat</w:t>
+              <w:t>Survey: submittal of site survey and as-found report - Makkah</w:t>
             </w:r>
           </w:p>
         </w:tc>
@@ -4571,7 +4571,7 @@
               <w:rPr>
                 <w:sz w:val="19"/>
               </w:rPr>
-              <w:t>27 Jul 2028</w:t>
+              <w:t>03 Jan 2027</w:t>
             </w:r>
           </w:p>
         </w:tc>
@@ -4585,7 +4585,7 @@
               <w:rPr>
                 <w:sz w:val="19"/>
               </w:rPr>
-              <w:t>09 Aug 2028</w:t>
+              <w:t>28 Jan 2027</w:t>
             </w:r>
           </w:p>
         </w:tc>
@@ -4599,7 +4599,7 @@
               <w:rPr>
                 <w:sz w:val="19"/>
               </w:rPr>
-              <w:t>23</w:t>
+              <w:t>21</w:t>
             </w:r>
           </w:p>
         </w:tc>
@@ -4615,7 +4615,7 @@
               <w:rPr>
                 <w:sz w:val="19"/>
               </w:rPr>
-              <w:t>NQR-E1050</w:t>
+              <w:t>PRJ-A2010</w:t>
             </w:r>
           </w:p>
         </w:tc>
@@ -4629,7 +4629,7 @@
               <w:rPr>
                 <w:sz w:val="19"/>
               </w:rPr>
-              <w:t>Preliminary design: submittal - Al Qurayyat</w:t>
+              <w:t>Detailed baseline programme (within 21 days after survey)</w:t>
             </w:r>
           </w:p>
         </w:tc>
@@ -4643,7 +4643,7 @@
               <w:rPr>
                 <w:sz w:val="19"/>
               </w:rPr>
-              <w:t>10 Aug 2028</w:t>
+              <w:t>31 Jan 2027</w:t>
             </w:r>
           </w:p>
         </w:tc>
@@ -4657,7 +4657,7 @@
               <w:rPr>
                 <w:sz w:val="19"/>
               </w:rPr>
-              <w:t>31 Aug 2028</w:t>
+              <w:t>18 Feb 2027</w:t>
             </w:r>
           </w:p>
         </w:tc>
@@ -4671,7 +4671,7 @@
               <w:rPr>
                 <w:sz w:val="19"/>
               </w:rPr>
-              <w:t>23</w:t>
+              <w:t>21</w:t>
             </w:r>
           </w:p>
         </w:tc>
@@ -4687,7 +4687,7 @@
               <w:rPr>
                 <w:sz w:val="19"/>
               </w:rPr>
-              <w:t>NQR-E1070</w:t>
+              <w:t>PRJ-A2020</w:t>
             </w:r>
           </w:p>
         </w:tc>
@@ -4701,7 +4701,7 @@
               <w:rPr>
                 <w:sz w:val="19"/>
               </w:rPr>
-              <w:t>Detailed design: submittal (drawings, BOQ, data sheets) - Al Qurayyat</w:t>
+              <w:t>SAR review and approval of detailed baseline</w:t>
             </w:r>
           </w:p>
         </w:tc>
@@ -4715,7 +4715,7 @@
               <w:rPr>
                 <w:sz w:val="19"/>
               </w:rPr>
-              <w:t>03 Sep 2028</w:t>
+              <w:t>21 Feb 2027</w:t>
             </w:r>
           </w:p>
         </w:tc>
@@ -4729,7 +4729,7 @@
               <w:rPr>
                 <w:sz w:val="19"/>
               </w:rPr>
-              <w:t>08 Oct 2028</w:t>
+              <w:t>21 Mar 2027</w:t>
             </w:r>
           </w:p>
         </w:tc>
@@ -4743,7 +4743,7 @@
               <w:rPr>
                 <w:sz w:val="19"/>
               </w:rPr>
-              <w:t>23</w:t>
+              <w:t>21</w:t>
             </w:r>
           </w:p>
         </w:tc>
@@ -4759,7 +4759,7 @@
               <w:rPr>
                 <w:sz w:val="19"/>
               </w:rPr>
-              <w:t>NQR-E1110</w:t>
+              <w:t>NQR-E1005</w:t>
             </w:r>
           </w:p>
         </w:tc>
@@ -4773,7 +4773,7 @@
               <w:rPr>
                 <w:sz w:val="19"/>
               </w:rPr>
-              <w:t>HCIS Stage 3 and 4 documents: preparation - Al Qurayyat</w:t>
+              <w:t>Survey: site access permit - application and approval (two months) - Al Qurayyat</w:t>
             </w:r>
           </w:p>
         </w:tc>
@@ -4787,7 +4787,7 @@
               <w:rPr>
                 <w:sz w:val="19"/>
               </w:rPr>
-              <w:t>17 Sep 2028</w:t>
+              <w:t>29 May 2028</w:t>
             </w:r>
           </w:p>
         </w:tc>
@@ -4801,7 +4801,7 @@
               <w:rPr>
                 <w:sz w:val="19"/>
               </w:rPr>
-              <w:t>24 Oct 2028</w:t>
+              <w:t>30 Jul 2028</w:t>
             </w:r>
           </w:p>
         </w:tc>
@@ -4815,7 +4815,7 @@
               <w:rPr>
                 <w:sz w:val="19"/>
               </w:rPr>
-              <w:t>23</w:t>
+              <w:t>21</w:t>
             </w:r>
           </w:p>
         </w:tc>
@@ -4831,7 +4831,7 @@
               <w:rPr>
                 <w:sz w:val="19"/>
               </w:rPr>
-              <w:t>NQR-E1080</w:t>
+              <w:t>NQR-E1010</w:t>
             </w:r>
           </w:p>
         </w:tc>
@@ -4845,7 +4845,7 @@
               <w:rPr>
                 <w:sz w:val="19"/>
               </w:rPr>
-              <w:t>Detailed design: SAR review and approval - Al Qurayyat</w:t>
+              <w:t>Survey: submittal of site survey and as-found report - Al Qurayyat</w:t>
             </w:r>
           </w:p>
         </w:tc>
@@ -4859,7 +4859,7 @@
               <w:rPr>
                 <w:sz w:val="19"/>
               </w:rPr>
-              <w:t>09 Oct 2028</w:t>
+              <w:t>31 Jul 2028</w:t>
             </w:r>
           </w:p>
         </w:tc>
@@ -4873,7 +4873,7 @@
               <w:rPr>
                 <w:sz w:val="19"/>
               </w:rPr>
-              <w:t>29 Oct 2028</w:t>
+              <w:t>13 Aug 2028</w:t>
             </w:r>
           </w:p>
         </w:tc>
@@ -4887,7 +4887,7 @@
               <w:rPr>
                 <w:sz w:val="19"/>
               </w:rPr>
-              <w:t>35</w:t>
+              <w:t>21</w:t>
             </w:r>
           </w:p>
         </w:tc>
@@ -4903,7 +4903,7 @@
               <w:rPr>
                 <w:sz w:val="19"/>
               </w:rPr>
-              <w:t>NQR-E1090</w:t>
+              <w:t>NQR-E1030</w:t>
             </w:r>
           </w:p>
         </w:tc>
@@ -4917,7 +4917,7 @@
               <w:rPr>
                 <w:sz w:val="19"/>
               </w:rPr>
-              <w:t>IFC and shop drawings: submittal - Al Qurayyat</w:t>
+              <w:t>Concept design: submittal - Al Qurayyat</w:t>
             </w:r>
           </w:p>
         </w:tc>
@@ -4931,7 +4931,7 @@
               <w:rPr>
                 <w:sz w:val="19"/>
               </w:rPr>
-              <w:t>09 Oct 2028</w:t>
+              <w:t>14 Aug 2028</w:t>
             </w:r>
           </w:p>
         </w:tc>
@@ -4945,7 +4945,7 @@
               <w:rPr>
                 <w:sz w:val="19"/>
               </w:rPr>
-              <w:t>24 Oct 2028</w:t>
+              <w:t>23 Aug 2028</w:t>
             </w:r>
           </w:p>
         </w:tc>
@@ -4959,7 +4959,7 @@
               <w:rPr>
                 <w:sz w:val="19"/>
               </w:rPr>
-              <w:t>23</w:t>
+              <w:t>21</w:t>
             </w:r>
           </w:p>
         </w:tc>
@@ -4975,7 +4975,7 @@
               <w:rPr>
                 <w:sz w:val="19"/>
               </w:rPr>
-              <w:t>NQR-E1100</w:t>
+              <w:t>NQR-E1050</w:t>
             </w:r>
           </w:p>
         </w:tc>
@@ -4989,7 +4989,7 @@
               <w:rPr>
                 <w:sz w:val="19"/>
               </w:rPr>
-              <w:t>IFC and shop drawings: SAR approval and release - Al Qurayyat</w:t>
+              <w:t>Preliminary design: submittal - Al Qurayyat</w:t>
             </w:r>
           </w:p>
         </w:tc>
@@ -5003,7 +5003,7 @@
               <w:rPr>
                 <w:sz w:val="19"/>
               </w:rPr>
-              <w:t>25 Oct 2028</w:t>
+              <w:t>24 Aug 2028</w:t>
             </w:r>
           </w:p>
         </w:tc>
@@ -5017,7 +5017,7 @@
               <w:rPr>
                 <w:sz w:val="19"/>
               </w:rPr>
-              <w:t>14 Nov 2028</w:t>
+              <w:t>12 Sep 2028</w:t>
             </w:r>
           </w:p>
         </w:tc>
@@ -5031,7 +5031,7 @@
               <w:rPr>
                 <w:sz w:val="19"/>
               </w:rPr>
-              <w:t>23</w:t>
+              <w:t>21</w:t>
             </w:r>
           </w:p>
         </w:tc>
@@ -5047,7 +5047,7 @@
               <w:rPr>
                 <w:sz w:val="19"/>
               </w:rPr>
-              <w:t>NQR-E1120</w:t>
+              <w:t>NQR-E1070</w:t>
             </w:r>
           </w:p>
         </w:tc>
@@ -5061,7 +5061,7 @@
               <w:rPr>
                 <w:sz w:val="19"/>
               </w:rPr>
-              <w:t>HCIS Stage 3 and 4 documents: SAR final review and HCIS submission - Al Qurayyat</w:t>
+              <w:t>Detailed design: submittal (drawings, BOQ, data sheets) - Al Qurayyat</w:t>
             </w:r>
           </w:p>
         </w:tc>
@@ -5075,7 +5075,7 @@
               <w:rPr>
                 <w:sz w:val="19"/>
               </w:rPr>
-              <w:t>25 Oct 2028</w:t>
+              <w:t>13 Sep 2028</w:t>
             </w:r>
           </w:p>
         </w:tc>
@@ -5089,7 +5089,7 @@
               <w:rPr>
                 <w:sz w:val="19"/>
               </w:rPr>
-              <w:t>14 Nov 2028</w:t>
+              <w:t>12 Oct 2028</w:t>
             </w:r>
           </w:p>
         </w:tc>
@@ -5103,7 +5103,7 @@
               <w:rPr>
                 <w:sz w:val="19"/>
               </w:rPr>
-              <w:t>23</w:t>
+              <w:t>21</w:t>
             </w:r>
           </w:p>
         </w:tc>
@@ -5119,7 +5119,7 @@
               <w:rPr>
                 <w:sz w:val="19"/>
               </w:rPr>
-              <w:t>NQR-P1010</w:t>
+              <w:t>NQR-E1110</w:t>
             </w:r>
           </w:p>
         </w:tc>
@@ -5133,7 +5133,7 @@
               <w:rPr>
                 <w:sz w:val="19"/>
               </w:rPr>
-              <w:t>Manufacture CCTV cameras and analytics - Al Qurayyat</w:t>
+              <w:t>HCIS Stage 3 and 4 documents: preparation - Al Qurayyat</w:t>
             </w:r>
           </w:p>
         </w:tc>
@@ -5147,7 +5147,7 @@
               <w:rPr>
                 <w:sz w:val="19"/>
               </w:rPr>
-              <w:t>15 Nov 2028</w:t>
+              <w:t>25 Sep 2028</w:t>
             </w:r>
           </w:p>
         </w:tc>
@@ -5161,7 +5161,7 @@
               <w:rPr>
                 <w:sz w:val="19"/>
               </w:rPr>
-              <w:t>28 Feb 2029</w:t>
+              <w:t>26 Oct 2028</w:t>
             </w:r>
           </w:p>
         </w:tc>
@@ -5175,7 +5175,7 @@
               <w:rPr>
                 <w:sz w:val="19"/>
               </w:rPr>
-              <w:t>23</w:t>
+              <w:t>21</w:t>
             </w:r>
           </w:p>
         </w:tc>
@@ -5191,7 +5191,7 @@
               <w:rPr>
                 <w:sz w:val="19"/>
               </w:rPr>
-              <w:t>NQR-P1020</w:t>
+              <w:t>NQR-E1080</w:t>
             </w:r>
           </w:p>
         </w:tc>
@@ -5205,7 +5205,7 @@
               <w:rPr>
                 <w:sz w:val="19"/>
               </w:rPr>
-              <w:t>Manufacture video management servers, storage and video wall - Al Qurayyat</w:t>
+              <w:t>Detailed design: SAR review and approval - Al Qurayyat</w:t>
             </w:r>
           </w:p>
         </w:tc>
@@ -5219,7 +5219,7 @@
               <w:rPr>
                 <w:sz w:val="19"/>
               </w:rPr>
-              <w:t>15 Nov 2028</w:t>
+              <w:t>15 Oct 2028</w:t>
             </w:r>
           </w:p>
         </w:tc>
@@ -5233,7 +5233,7 @@
               <w:rPr>
                 <w:sz w:val="19"/>
               </w:rPr>
-              <w:t>28 Feb 2029</w:t>
+              <w:t>02 Nov 2028</w:t>
             </w:r>
           </w:p>
         </w:tc>
@@ -5247,7 +5247,7 @@
               <w:rPr>
                 <w:sz w:val="19"/>
               </w:rPr>
-              <w:t>23</w:t>
+              <w:t>31</w:t>
             </w:r>
           </w:p>
         </w:tc>
@@ -5263,7 +5263,7 @@
               <w:rPr>
                 <w:sz w:val="19"/>
               </w:rPr>
-              <w:t>NQR-P1030</w:t>
+              <w:t>NQR-E1090</w:t>
             </w:r>
           </w:p>
         </w:tc>
@@ -5277,7 +5277,7 @@
               <w:rPr>
                 <w:sz w:val="19"/>
               </w:rPr>
-              <w:t>Manufacture access control and intercom equipment - Al Qurayyat</w:t>
+              <w:t>IFC and shop drawings: submittal - Al Qurayyat</w:t>
             </w:r>
           </w:p>
         </w:tc>
@@ -5291,7 +5291,7 @@
               <w:rPr>
                 <w:sz w:val="19"/>
               </w:rPr>
-              <w:t>15 Nov 2028</w:t>
+              <w:t>15 Oct 2028</w:t>
             </w:r>
           </w:p>
         </w:tc>
@@ -5305,7 +5305,7 @@
               <w:rPr>
                 <w:sz w:val="19"/>
               </w:rPr>
-              <w:t>28 Feb 2029</w:t>
+              <w:t>26 Oct 2028</w:t>
             </w:r>
           </w:p>
         </w:tc>
@@ -5319,7 +5319,7 @@
               <w:rPr>
                 <w:sz w:val="19"/>
               </w:rPr>
-              <w:t>23</w:t>
+              <w:t>21</w:t>
             </w:r>
           </w:p>
         </w:tc>
@@ -5335,7 +5335,7 @@
               <w:rPr>
                 <w:sz w:val="19"/>
               </w:rPr>
-              <w:t>NQR-P1040</w:t>
+              <w:t>NQR-E1100</w:t>
             </w:r>
           </w:p>
         </w:tc>
@@ -5349,7 +5349,7 @@
               <w:rPr>
                 <w:sz w:val="19"/>
               </w:rPr>
-              <w:t>Manufacture UPS, network switches and field cabinets - Al Qurayyat</w:t>
+              <w:t>IFC and shop drawings: SAR approval and release - Al Qurayyat</w:t>
             </w:r>
           </w:p>
         </w:tc>
@@ -5363,7 +5363,7 @@
               <w:rPr>
                 <w:sz w:val="19"/>
               </w:rPr>
-              <w:t>15 Nov 2028</w:t>
+              <w:t>29 Oct 2028</w:t>
             </w:r>
           </w:p>
         </w:tc>
@@ -5377,7 +5377,7 @@
               <w:rPr>
                 <w:sz w:val="19"/>
               </w:rPr>
-              <w:t>28 Feb 2029</w:t>
+              <w:t>16 Nov 2028</w:t>
             </w:r>
           </w:p>
         </w:tc>
@@ -5391,7 +5391,7 @@
               <w:rPr>
                 <w:sz w:val="19"/>
               </w:rPr>
-              <w:t>23</w:t>
+              <w:t>21</w:t>
             </w:r>
           </w:p>
         </w:tc>
@@ -5407,7 +5407,7 @@
               <w:rPr>
                 <w:sz w:val="19"/>
               </w:rPr>
-              <w:t>NQR-P1050</w:t>
+              <w:t>NQR-E1120</w:t>
             </w:r>
           </w:p>
         </w:tc>
@@ -5421,7 +5421,7 @@
               <w:rPr>
                 <w:sz w:val="19"/>
               </w:rPr>
-              <w:t>Factory acceptance test at vendor premises - Al Qurayyat</w:t>
+              <w:t>HCIS Stage 3 and 4 documents: SAR final review and HCIS submission - Al Qurayyat</w:t>
             </w:r>
           </w:p>
         </w:tc>
@@ -5435,7 +5435,7 @@
               <w:rPr>
                 <w:sz w:val="19"/>
               </w:rPr>
-              <w:t>01 Mar 2029</w:t>
+              <w:t>29 Oct 2028</w:t>
             </w:r>
           </w:p>
         </w:tc>
@@ -5449,7 +5449,7 @@
               <w:rPr>
                 <w:sz w:val="19"/>
               </w:rPr>
-              <w:t>14 Mar 2029</w:t>
+              <w:t>16 Nov 2028</w:t>
             </w:r>
           </w:p>
         </w:tc>
@@ -5463,7 +5463,7 @@
               <w:rPr>
                 <w:sz w:val="19"/>
               </w:rPr>
-              <w:t>23</w:t>
+              <w:t>21</w:t>
             </w:r>
           </w:p>
         </w:tc>
@@ -5479,7 +5479,7 @@
               <w:rPr>
                 <w:sz w:val="19"/>
               </w:rPr>
-              <w:t>NQR-P1060</w:t>
+              <w:t>NQR-P1010</w:t>
             </w:r>
           </w:p>
         </w:tc>
@@ -5493,7 +5493,7 @@
               <w:rPr>
                 <w:sz w:val="19"/>
               </w:rPr>
-              <w:t>Shipping and customs clearance - Al Qurayyat</w:t>
+              <w:t>Manufacture CCTV cameras and analytics - Al Qurayyat</w:t>
             </w:r>
           </w:p>
         </w:tc>
@@ -5507,7 +5507,7 @@
               <w:rPr>
                 <w:sz w:val="19"/>
               </w:rPr>
-              <w:t>15 Mar 2029</w:t>
+              <w:t>19 Nov 2028</w:t>
             </w:r>
           </w:p>
         </w:tc>
@@ -5521,7 +5521,7 @@
               <w:rPr>
                 <w:sz w:val="19"/>
               </w:rPr>
-              <w:t>18 Apr 2029</w:t>
+              <w:t>04 Mar 2029</w:t>
             </w:r>
           </w:p>
         </w:tc>
@@ -5535,7 +5535,7 @@
               <w:rPr>
                 <w:sz w:val="19"/>
               </w:rPr>
-              <w:t>23</w:t>
+              <w:t>21</w:t>
             </w:r>
           </w:p>
         </w:tc>
@@ -5551,7 +5551,7 @@
               <w:rPr>
                 <w:sz w:val="19"/>
               </w:rPr>
-              <w:t>NQR-P1070</w:t>
+              <w:t>NQR-P1020</w:t>
             </w:r>
           </w:p>
         </w:tc>
@@ -5565,7 +5565,7 @@
               <w:rPr>
                 <w:sz w:val="19"/>
               </w:rPr>
-              <w:t>Delivery to station and receiving inspection - Al Qurayyat</w:t>
+              <w:t>Manufacture video management servers, storage and video wall - Al Qurayyat</w:t>
             </w:r>
           </w:p>
         </w:tc>
@@ -5579,7 +5579,7 @@
               <w:rPr>
                 <w:sz w:val="19"/>
               </w:rPr>
-              <w:t>19 Apr 2029</w:t>
+              <w:t>19 Nov 2028</w:t>
             </w:r>
           </w:p>
         </w:tc>
@@ -5593,7 +5593,7 @@
               <w:rPr>
                 <w:sz w:val="19"/>
               </w:rPr>
-              <w:t>02 May 2029</w:t>
+              <w:t>04 Mar 2029</w:t>
             </w:r>
           </w:p>
         </w:tc>
@@ -5607,7 +5607,7 @@
               <w:rPr>
                 <w:sz w:val="19"/>
               </w:rPr>
-              <w:t>23</w:t>
+              <w:t>21</w:t>
             </w:r>
           </w:p>
         </w:tc>
@@ -5623,7 +5623,7 @@
               <w:rPr>
                 <w:sz w:val="19"/>
               </w:rPr>
-              <w:t>NQR-C2010</w:t>
+              <w:t>NQR-P1030</w:t>
             </w:r>
           </w:p>
         </w:tc>
@@ -5637,7 +5637,7 @@
               <w:rPr>
                 <w:sz w:val="19"/>
               </w:rPr>
-              <w:t>Install UPS, network switches and field cabinets - Al Qurayyat</w:t>
+              <w:t>Manufacture access control and intercom equipment - Al Qurayyat</w:t>
             </w:r>
           </w:p>
         </w:tc>
@@ -5651,7 +5651,7 @@
               <w:rPr>
                 <w:sz w:val="19"/>
               </w:rPr>
-              <w:t>03 May 2029</w:t>
+              <w:t>19 Nov 2028</w:t>
             </w:r>
           </w:p>
         </w:tc>
@@ -5665,7 +5665,7 @@
               <w:rPr>
                 <w:sz w:val="19"/>
               </w:rPr>
-              <w:t>17 May 2029</w:t>
+              <w:t>04 Mar 2029</w:t>
             </w:r>
           </w:p>
         </w:tc>
@@ -5679,7 +5679,7 @@
               <w:rPr>
                 <w:sz w:val="19"/>
               </w:rPr>
-              <w:t>23</w:t>
+              <w:t>21</w:t>
             </w:r>
           </w:p>
         </w:tc>
@@ -5695,7 +5695,7 @@
               <w:rPr>
                 <w:sz w:val="19"/>
               </w:rPr>
-              <w:t>NQR-C2020</w:t>
+              <w:t>NQR-P1040</w:t>
             </w:r>
           </w:p>
         </w:tc>
@@ -5709,7 +5709,7 @@
               <w:rPr>
                 <w:sz w:val="19"/>
               </w:rPr>
-              <w:t>Cabling and termination (power, fibre, data) - Al Qurayyat</w:t>
+              <w:t>Manufacture UPS, network switches and field cabinets - Al Qurayyat</w:t>
             </w:r>
           </w:p>
         </w:tc>
@@ -5723,7 +5723,7 @@
               <w:rPr>
                 <w:sz w:val="19"/>
               </w:rPr>
-              <w:t>09 May 2029</w:t>
+              <w:t>19 Nov 2028</w:t>
             </w:r>
           </w:p>
         </w:tc>
@@ -5737,7 +5737,7 @@
               <w:rPr>
                 <w:sz w:val="19"/>
               </w:rPr>
-              <w:t>03 Jun 2029</w:t>
+              <w:t>04 Mar 2029</w:t>
             </w:r>
           </w:p>
         </w:tc>
@@ -5751,7 +5751,7 @@
               <w:rPr>
                 <w:sz w:val="19"/>
               </w:rPr>
-              <w:t>23</w:t>
+              <w:t>21</w:t>
             </w:r>
           </w:p>
         </w:tc>
@@ -5767,7 +5767,7 @@
               <w:rPr>
                 <w:sz w:val="19"/>
               </w:rPr>
-              <w:t>NQR-C2040</w:t>
+              <w:t>NQR-P1050</w:t>
             </w:r>
           </w:p>
         </w:tc>
@@ -5781,7 +5781,7 @@
               <w:rPr>
                 <w:sz w:val="19"/>
               </w:rPr>
-              <w:t>Install video management, video wall and control-room equipment - Al Qurayyat</w:t>
+              <w:t>Factory acceptance test at vendor premises - Al Qurayyat</w:t>
             </w:r>
           </w:p>
         </w:tc>
@@ -5795,7 +5795,7 @@
               <w:rPr>
                 <w:sz w:val="19"/>
               </w:rPr>
-              <w:t>20 May 2029</w:t>
+              <w:t>05 Mar 2029</w:t>
             </w:r>
           </w:p>
         </w:tc>
@@ -5809,7 +5809,7 @@
               <w:rPr>
                 <w:sz w:val="19"/>
               </w:rPr>
-              <w:t>04 Jun 2029</w:t>
+              <w:t>18 Mar 2029</w:t>
             </w:r>
           </w:p>
         </w:tc>
@@ -5823,7 +5823,7 @@
               <w:rPr>
                 <w:sz w:val="19"/>
               </w:rPr>
-              <w:t>36</w:t>
+              <w:t>21</w:t>
             </w:r>
           </w:p>
         </w:tc>

</xml_diff>

<commit_message>
Survey access permit moved to the Mobilization branch of the WBS (EPC code Project management)
Co-Authored-By: Claude Sonnet 5.5 <noreply@anthropic.com>
Claude-Session: https://claude.ai/code/session_01DZdGPWRxvKXCnMyT6qFPZb
</commit_message>
<xml_diff>
--- a/p6/0580_Schedule_Narrative.docx
+++ b/p6/0580_Schedule_Narrative.docx
@@ -1000,7 +1000,7 @@
         <w:rPr>
           <w:b w:val="0"/>
         </w:rPr>
-        <w:t>The survey needs a site access permit and the permit takes two months, so months 1 and 2 are mobilization and the permit (activity E1005 at each station). The survey is the first part of design, so design starts when the permit is granted and lasts four months in total, survey included. At the priority stations the two month window is held by milestone PRJ-M1150; at the other stations design starts when their own permit ends. Enabling works start two months before the end of design, so design and execution overlap by two months. No date constraint is used.</w:t>
+        <w:t>The survey needs a site access permit and the permit takes two months, so months 1 and 2 are mobilization and the permit (activity E1005 at each station, held in the Mobilization branch of the WBS). The survey is the first part of design, so design starts when the permit is granted and lasts four months in total, survey included. At the priority stations the two month window is held by milestone PRJ-M1150; at the other stations design starts when their own permit ends. Enabling works start two months before the end of design, so design and execution overlap by two months. No date constraint is used.</w:t>
       </w:r>
     </w:p>
     <w:p>
@@ -3633,7 +3633,7 @@
         <w:rPr>
           <w:b w:val="0"/>
         </w:rPr>
-        <w:t>The WBS follows EPC. Level 1 is the project (0580), level 2 the EPC phase (Engineering, Procurement, Construction, Commissioning and handover, plus Project management), level 3 the station, level 4 the design stage or work package (enabling works, civil, installation, POC), and level 5 the submittal, approval or area. There are 534 nodes. Levels 6 to 8 are not used because the contract gives no zone-level data; they can be added when it does.</w:t>
+        <w:t>The WBS follows EPC. Level 1 is the project (0580), level 2 the EPC phase (Engineering, Procurement, Construction, Commissioning and handover, plus Project management), level 3 the station, level 4 the design stage or work package (enabling works, civil, installation, POC), and level 5 the submittal, approval or area. There are 534 nodes. The survey access permits sit under Project management and mobilization, in the Mobilization branch (one node per station). Levels 6 to 8 are not used because the contract gives no zone-level data; they can be added when it does.</w:t>
       </w:r>
     </w:p>
     <w:tbl>
@@ -3798,7 +3798,7 @@
               <w:rPr>
                 <w:sz w:val="19"/>
               </w:rPr>
-              <w:t>254</w:t>
+              <w:t>268</w:t>
             </w:r>
           </w:p>
         </w:tc>
@@ -3828,7 +3828,7 @@
               <w:rPr>
                 <w:sz w:val="19"/>
               </w:rPr>
-              <w:t>215</w:t>
+              <w:t>201</w:t>
             </w:r>
           </w:p>
         </w:tc>
@@ -4053,7 +4053,7 @@
               <w:rPr>
                 <w:sz w:val="19"/>
               </w:rPr>
-              <w:t>Survey: site access permit - application and approval (two months) - Riyadh (Thumamah)</w:t>
+              <w:t>Mobilization: site access permit for the survey - application and approval (two months) - Riyadh (Thumamah)</w:t>
             </w:r>
           </w:p>
         </w:tc>
@@ -4125,7 +4125,7 @@
               <w:rPr>
                 <w:sz w:val="19"/>
               </w:rPr>
-              <w:t>Survey: site access permit - application and approval (two months) - Makkah</w:t>
+              <w:t>Mobilization: site access permit for the survey - application and approval (two months) - Makkah</w:t>
             </w:r>
           </w:p>
         </w:tc>
@@ -4197,7 +4197,7 @@
               <w:rPr>
                 <w:sz w:val="19"/>
               </w:rPr>
-              <w:t>Survey: site access permit - application and approval (two months) - Riyadh (Malaz)</w:t>
+              <w:t>Mobilization: site access permit for the survey - application and approval (two months) - Riyadh (Malaz)</w:t>
             </w:r>
           </w:p>
         </w:tc>
@@ -4773,7 +4773,7 @@
               <w:rPr>
                 <w:sz w:val="19"/>
               </w:rPr>
-              <w:t>Survey: site access permit - application and approval (two months) - Al Qurayyat</w:t>
+              <w:t>Mobilization: site access permit for the survey - application and approval (two months) - Al Qurayyat</w:t>
             </w:r>
           </w:p>
         </w:tc>

</xml_diff>

<commit_message>
Design calibrated to four calendar months per station; package bars shown as per-station segments in phase-filtered views
Co-Authored-By: Claude Sonnet 5.5 <noreply@anthropic.com>
Claude-Session: https://claude.ai/code/session_01DZdGPWRxvKXCnMyT6qFPZb
</commit_message>
<xml_diff>
--- a/p6/0580_Schedule_Narrative.docx
+++ b/p6/0580_Schedule_Narrative.docx
@@ -1403,7 +1403,7 @@
               <w:rPr>
                 <w:sz w:val="19"/>
               </w:rPr>
-              <w:t>26 Nov 2028</w:t>
+              <w:t>06 Dec 2028</w:t>
             </w:r>
           </w:p>
         </w:tc>
@@ -1461,7 +1461,7 @@
               <w:rPr>
                 <w:sz w:val="19"/>
               </w:rPr>
-              <w:t>13 May 2027</w:t>
+              <w:t>10 May 2027</w:t>
             </w:r>
           </w:p>
         </w:tc>
@@ -1475,7 +1475,7 @@
               <w:rPr>
                 <w:sz w:val="19"/>
               </w:rPr>
-              <w:t>30 Aug 2028</w:t>
+              <w:t>07 Sep 2028</w:t>
             </w:r>
           </w:p>
         </w:tc>
@@ -1533,7 +1533,7 @@
               <w:rPr>
                 <w:sz w:val="19"/>
               </w:rPr>
-              <w:t>07 Jul 2027</w:t>
+              <w:t>30 Jun 2027</w:t>
             </w:r>
           </w:p>
         </w:tc>
@@ -1547,7 +1547,7 @@
               <w:rPr>
                 <w:sz w:val="19"/>
               </w:rPr>
-              <w:t>25 Oct 2028</w:t>
+              <w:t>29 Oct 2028</w:t>
             </w:r>
           </w:p>
         </w:tc>
@@ -1605,7 +1605,7 @@
               <w:rPr>
                 <w:sz w:val="19"/>
               </w:rPr>
-              <w:t>07 Jul 2027</w:t>
+              <w:t>30 Jun 2027</w:t>
             </w:r>
           </w:p>
         </w:tc>
@@ -1619,7 +1619,7 @@
               <w:rPr>
                 <w:sz w:val="19"/>
               </w:rPr>
-              <w:t>17 Oct 2028</w:t>
+              <w:t>19 Oct 2028</w:t>
             </w:r>
           </w:p>
         </w:tc>
@@ -1677,7 +1677,7 @@
               <w:rPr>
                 <w:sz w:val="19"/>
               </w:rPr>
-              <w:t>17 Aug 2027</w:t>
+              <w:t>10 Aug 2027</w:t>
             </w:r>
           </w:p>
         </w:tc>
@@ -1691,7 +1691,7 @@
               <w:rPr>
                 <w:sz w:val="19"/>
               </w:rPr>
-              <w:t>05 Dec 2028</w:t>
+              <w:t>10 Dec 2028</w:t>
             </w:r>
           </w:p>
         </w:tc>
@@ -1749,7 +1749,7 @@
               <w:rPr>
                 <w:sz w:val="19"/>
               </w:rPr>
-              <w:t>30 Nov 2027</w:t>
+              <w:t>21 Nov 2027</w:t>
             </w:r>
           </w:p>
         </w:tc>
@@ -1763,7 +1763,7 @@
               <w:rPr>
                 <w:sz w:val="19"/>
               </w:rPr>
-              <w:t>10 Jul 2029</w:t>
+              <w:t>27 Jun 2029</w:t>
             </w:r>
           </w:p>
         </w:tc>
@@ -1821,7 +1821,7 @@
               <w:rPr>
                 <w:sz w:val="19"/>
               </w:rPr>
-              <w:t>30 Nov 2027</w:t>
+              <w:t>21 Nov 2027</w:t>
             </w:r>
           </w:p>
         </w:tc>
@@ -1835,7 +1835,7 @@
               <w:rPr>
                 <w:sz w:val="19"/>
               </w:rPr>
-              <w:t>16 Jul 2029</w:t>
+              <w:t>03 Jul 2029</w:t>
             </w:r>
           </w:p>
         </w:tc>
@@ -1893,7 +1893,7 @@
               <w:rPr>
                 <w:sz w:val="19"/>
               </w:rPr>
-              <w:t>11 Jan 2028</w:t>
+              <w:t>30 Dec 2027</w:t>
             </w:r>
           </w:p>
         </w:tc>
@@ -1907,7 +1907,7 @@
               <w:rPr>
                 <w:sz w:val="19"/>
               </w:rPr>
-              <w:t>01 May 2029</w:t>
+              <w:t>16 Apr 2029</w:t>
             </w:r>
           </w:p>
         </w:tc>
@@ -1965,7 +1965,7 @@
               <w:rPr>
                 <w:sz w:val="19"/>
               </w:rPr>
-              <w:t>01 Feb 2028</w:t>
+              <w:t>19 Jan 2028</w:t>
             </w:r>
           </w:p>
         </w:tc>
@@ -1979,7 +1979,7 @@
               <w:rPr>
                 <w:sz w:val="19"/>
               </w:rPr>
-              <w:t>05 Jun 2029</w:t>
+              <w:t>28 May 2029</w:t>
             </w:r>
           </w:p>
         </w:tc>
@@ -2037,7 +2037,7 @@
               <w:rPr>
                 <w:sz w:val="19"/>
               </w:rPr>
-              <w:t>10 Apr 2028</w:t>
+              <w:t>27 Mar 2028</w:t>
             </w:r>
           </w:p>
         </w:tc>
@@ -2051,7 +2051,7 @@
               <w:rPr>
                 <w:sz w:val="19"/>
               </w:rPr>
-              <w:t>06 Aug 2029</w:t>
+              <w:t>05 Aug 2029</w:t>
             </w:r>
           </w:p>
         </w:tc>
@@ -2109,7 +2109,7 @@
               <w:rPr>
                 <w:sz w:val="19"/>
               </w:rPr>
-              <w:t>29 May 2028</w:t>
+              <w:t>14 May 2028</w:t>
             </w:r>
           </w:p>
         </w:tc>
@@ -2123,7 +2123,7 @@
               <w:rPr>
                 <w:sz w:val="19"/>
               </w:rPr>
-              <w:t>17 Sep 2029</w:t>
+              <w:t>16 Sep 2029</w:t>
             </w:r>
           </w:p>
         </w:tc>
@@ -3924,7 +3924,7 @@
         <w:rPr>
           <w:b w:val="0"/>
         </w:rPr>
-        <w:t>The contract completion milestone is held by the 36 month term, so no activity has zero float against it. The longest physical path finishes 21 working days before the contract end date, and that margin is the project float. 32 tasks sit on this longest path and 8 more are within 20 working days of it. The first 25 in date order are listed below.</w:t>
+        <w:t>The contract completion milestone is held by the 36 month term, so no activity has zero float against it. The longest physical path finishes 22 working days before the contract end date, and that margin is the project float. 32 tasks sit on this longest path and 8 more are within 20 working days of it. The first 25 in date order are listed below.</w:t>
       </w:r>
     </w:p>
     <w:tbl>
@@ -4095,7 +4095,7 @@
               <w:rPr>
                 <w:sz w:val="19"/>
               </w:rPr>
-              <w:t>21</w:t>
+              <w:t>22</w:t>
             </w:r>
           </w:p>
         </w:tc>
@@ -4167,7 +4167,7 @@
               <w:rPr>
                 <w:sz w:val="19"/>
               </w:rPr>
-              <w:t>21</w:t>
+              <w:t>22</w:t>
             </w:r>
           </w:p>
         </w:tc>
@@ -4239,7 +4239,7 @@
               <w:rPr>
                 <w:sz w:val="19"/>
               </w:rPr>
-              <w:t>21</w:t>
+              <w:t>22</w:t>
             </w:r>
           </w:p>
         </w:tc>
@@ -4311,7 +4311,7 @@
               <w:rPr>
                 <w:sz w:val="19"/>
               </w:rPr>
-              <w:t>36</w:t>
+              <w:t>37</w:t>
             </w:r>
           </w:p>
         </w:tc>
@@ -4383,7 +4383,7 @@
               <w:rPr>
                 <w:sz w:val="19"/>
               </w:rPr>
-              <w:t>41</w:t>
+              <w:t>42</w:t>
             </w:r>
           </w:p>
         </w:tc>
@@ -4455,7 +4455,7 @@
               <w:rPr>
                 <w:sz w:val="19"/>
               </w:rPr>
-              <w:t>31</w:t>
+              <w:t>32</w:t>
             </w:r>
           </w:p>
         </w:tc>
@@ -4527,7 +4527,7 @@
               <w:rPr>
                 <w:sz w:val="19"/>
               </w:rPr>
-              <w:t>31</w:t>
+              <w:t>32</w:t>
             </w:r>
           </w:p>
         </w:tc>
@@ -4599,7 +4599,7 @@
               <w:rPr>
                 <w:sz w:val="19"/>
               </w:rPr>
-              <w:t>21</w:t>
+              <w:t>22</w:t>
             </w:r>
           </w:p>
         </w:tc>
@@ -4671,7 +4671,7 @@
               <w:rPr>
                 <w:sz w:val="19"/>
               </w:rPr>
-              <w:t>21</w:t>
+              <w:t>22</w:t>
             </w:r>
           </w:p>
         </w:tc>
@@ -4743,7 +4743,7 @@
               <w:rPr>
                 <w:sz w:val="19"/>
               </w:rPr>
-              <w:t>21</w:t>
+              <w:t>22</w:t>
             </w:r>
           </w:p>
         </w:tc>
@@ -4787,7 +4787,7 @@
               <w:rPr>
                 <w:sz w:val="19"/>
               </w:rPr>
-              <w:t>29 May 2028</w:t>
+              <w:t>14 May 2028</w:t>
             </w:r>
           </w:p>
         </w:tc>
@@ -4801,7 +4801,7 @@
               <w:rPr>
                 <w:sz w:val="19"/>
               </w:rPr>
-              <w:t>30 Jul 2028</w:t>
+              <w:t>13 Jul 2028</w:t>
             </w:r>
           </w:p>
         </w:tc>
@@ -4815,7 +4815,7 @@
               <w:rPr>
                 <w:sz w:val="19"/>
               </w:rPr>
-              <w:t>21</w:t>
+              <w:t>22</w:t>
             </w:r>
           </w:p>
         </w:tc>
@@ -4859,7 +4859,7 @@
               <w:rPr>
                 <w:sz w:val="19"/>
               </w:rPr>
-              <w:t>31 Jul 2028</w:t>
+              <w:t>16 Jul 2028</w:t>
             </w:r>
           </w:p>
         </w:tc>
@@ -4873,7 +4873,7 @@
               <w:rPr>
                 <w:sz w:val="19"/>
               </w:rPr>
-              <w:t>13 Aug 2028</w:t>
+              <w:t>27 Jul 2028</w:t>
             </w:r>
           </w:p>
         </w:tc>
@@ -4887,7 +4887,7 @@
               <w:rPr>
                 <w:sz w:val="19"/>
               </w:rPr>
-              <w:t>21</w:t>
+              <w:t>22</w:t>
             </w:r>
           </w:p>
         </w:tc>
@@ -4931,7 +4931,7 @@
               <w:rPr>
                 <w:sz w:val="19"/>
               </w:rPr>
-              <w:t>14 Aug 2028</w:t>
+              <w:t>30 Jul 2028</w:t>
             </w:r>
           </w:p>
         </w:tc>
@@ -4945,7 +4945,7 @@
               <w:rPr>
                 <w:sz w:val="19"/>
               </w:rPr>
-              <w:t>23 Aug 2028</w:t>
+              <w:t>10 Aug 2028</w:t>
             </w:r>
           </w:p>
         </w:tc>
@@ -4959,7 +4959,7 @@
               <w:rPr>
                 <w:sz w:val="19"/>
               </w:rPr>
-              <w:t>21</w:t>
+              <w:t>22</w:t>
             </w:r>
           </w:p>
         </w:tc>
@@ -5003,7 +5003,7 @@
               <w:rPr>
                 <w:sz w:val="19"/>
               </w:rPr>
-              <w:t>24 Aug 2028</w:t>
+              <w:t>13 Aug 2028</w:t>
             </w:r>
           </w:p>
         </w:tc>
@@ -5017,7 +5017,7 @@
               <w:rPr>
                 <w:sz w:val="19"/>
               </w:rPr>
-              <w:t>12 Sep 2028</w:t>
+              <w:t>03 Sep 2028</w:t>
             </w:r>
           </w:p>
         </w:tc>
@@ -5031,7 +5031,7 @@
               <w:rPr>
                 <w:sz w:val="19"/>
               </w:rPr>
-              <w:t>21</w:t>
+              <w:t>22</w:t>
             </w:r>
           </w:p>
         </w:tc>
@@ -5075,7 +5075,7 @@
               <w:rPr>
                 <w:sz w:val="19"/>
               </w:rPr>
-              <w:t>13 Sep 2028</w:t>
+              <w:t>04 Sep 2028</w:t>
             </w:r>
           </w:p>
         </w:tc>
@@ -5089,7 +5089,7 @@
               <w:rPr>
                 <w:sz w:val="19"/>
               </w:rPr>
-              <w:t>12 Oct 2028</w:t>
+              <w:t>09 Oct 2028</w:t>
             </w:r>
           </w:p>
         </w:tc>
@@ -5103,7 +5103,7 @@
               <w:rPr>
                 <w:sz w:val="19"/>
               </w:rPr>
-              <w:t>21</w:t>
+              <w:t>22</w:t>
             </w:r>
           </w:p>
         </w:tc>
@@ -5147,7 +5147,7 @@
               <w:rPr>
                 <w:sz w:val="19"/>
               </w:rPr>
-              <w:t>25 Sep 2028</w:t>
+              <w:t>18 Sep 2028</w:t>
             </w:r>
           </w:p>
         </w:tc>
@@ -5161,7 +5161,7 @@
               <w:rPr>
                 <w:sz w:val="19"/>
               </w:rPr>
-              <w:t>26 Oct 2028</w:t>
+              <w:t>25 Oct 2028</w:t>
             </w:r>
           </w:p>
         </w:tc>
@@ -5175,7 +5175,7 @@
               <w:rPr>
                 <w:sz w:val="19"/>
               </w:rPr>
-              <w:t>21</w:t>
+              <w:t>22</w:t>
             </w:r>
           </w:p>
         </w:tc>
@@ -5219,7 +5219,7 @@
               <w:rPr>
                 <w:sz w:val="19"/>
               </w:rPr>
-              <w:t>15 Oct 2028</w:t>
+              <w:t>10 Oct 2028</w:t>
             </w:r>
           </w:p>
         </w:tc>
@@ -5233,7 +5233,7 @@
               <w:rPr>
                 <w:sz w:val="19"/>
               </w:rPr>
-              <w:t>02 Nov 2028</w:t>
+              <w:t>30 Oct 2028</w:t>
             </w:r>
           </w:p>
         </w:tc>
@@ -5247,7 +5247,7 @@
               <w:rPr>
                 <w:sz w:val="19"/>
               </w:rPr>
-              <w:t>31</w:t>
+              <w:t>34</w:t>
             </w:r>
           </w:p>
         </w:tc>
@@ -5291,7 +5291,7 @@
               <w:rPr>
                 <w:sz w:val="19"/>
               </w:rPr>
-              <w:t>15 Oct 2028</w:t>
+              <w:t>10 Oct 2028</w:t>
             </w:r>
           </w:p>
         </w:tc>
@@ -5305,7 +5305,7 @@
               <w:rPr>
                 <w:sz w:val="19"/>
               </w:rPr>
-              <w:t>26 Oct 2028</w:t>
+              <w:t>25 Oct 2028</w:t>
             </w:r>
           </w:p>
         </w:tc>
@@ -5319,7 +5319,7 @@
               <w:rPr>
                 <w:sz w:val="19"/>
               </w:rPr>
-              <w:t>21</w:t>
+              <w:t>22</w:t>
             </w:r>
           </w:p>
         </w:tc>
@@ -5363,7 +5363,7 @@
               <w:rPr>
                 <w:sz w:val="19"/>
               </w:rPr>
-              <w:t>29 Oct 2028</w:t>
+              <w:t>26 Oct 2028</w:t>
             </w:r>
           </w:p>
         </w:tc>
@@ -5377,7 +5377,7 @@
               <w:rPr>
                 <w:sz w:val="19"/>
               </w:rPr>
-              <w:t>16 Nov 2028</w:t>
+              <w:t>15 Nov 2028</w:t>
             </w:r>
           </w:p>
         </w:tc>
@@ -5391,7 +5391,7 @@
               <w:rPr>
                 <w:sz w:val="19"/>
               </w:rPr>
-              <w:t>21</w:t>
+              <w:t>22</w:t>
             </w:r>
           </w:p>
         </w:tc>
@@ -5435,7 +5435,7 @@
               <w:rPr>
                 <w:sz w:val="19"/>
               </w:rPr>
-              <w:t>29 Oct 2028</w:t>
+              <w:t>26 Oct 2028</w:t>
             </w:r>
           </w:p>
         </w:tc>
@@ -5449,7 +5449,7 @@
               <w:rPr>
                 <w:sz w:val="19"/>
               </w:rPr>
-              <w:t>16 Nov 2028</w:t>
+              <w:t>15 Nov 2028</w:t>
             </w:r>
           </w:p>
         </w:tc>
@@ -5463,7 +5463,7 @@
               <w:rPr>
                 <w:sz w:val="19"/>
               </w:rPr>
-              <w:t>21</w:t>
+              <w:t>22</w:t>
             </w:r>
           </w:p>
         </w:tc>
@@ -5507,7 +5507,7 @@
               <w:rPr>
                 <w:sz w:val="19"/>
               </w:rPr>
-              <w:t>19 Nov 2028</w:t>
+              <w:t>16 Nov 2028</w:t>
             </w:r>
           </w:p>
         </w:tc>
@@ -5521,7 +5521,7 @@
               <w:rPr>
                 <w:sz w:val="19"/>
               </w:rPr>
-              <w:t>04 Mar 2029</w:t>
+              <w:t>01 Mar 2029</w:t>
             </w:r>
           </w:p>
         </w:tc>
@@ -5535,7 +5535,7 @@
               <w:rPr>
                 <w:sz w:val="19"/>
               </w:rPr>
-              <w:t>21</w:t>
+              <w:t>22</w:t>
             </w:r>
           </w:p>
         </w:tc>
@@ -5579,7 +5579,7 @@
               <w:rPr>
                 <w:sz w:val="19"/>
               </w:rPr>
-              <w:t>19 Nov 2028</w:t>
+              <w:t>16 Nov 2028</w:t>
             </w:r>
           </w:p>
         </w:tc>
@@ -5593,7 +5593,7 @@
               <w:rPr>
                 <w:sz w:val="19"/>
               </w:rPr>
-              <w:t>04 Mar 2029</w:t>
+              <w:t>01 Mar 2029</w:t>
             </w:r>
           </w:p>
         </w:tc>
@@ -5607,7 +5607,7 @@
               <w:rPr>
                 <w:sz w:val="19"/>
               </w:rPr>
-              <w:t>21</w:t>
+              <w:t>22</w:t>
             </w:r>
           </w:p>
         </w:tc>
@@ -5651,7 +5651,7 @@
               <w:rPr>
                 <w:sz w:val="19"/>
               </w:rPr>
-              <w:t>19 Nov 2028</w:t>
+              <w:t>16 Nov 2028</w:t>
             </w:r>
           </w:p>
         </w:tc>
@@ -5665,7 +5665,7 @@
               <w:rPr>
                 <w:sz w:val="19"/>
               </w:rPr>
-              <w:t>04 Mar 2029</w:t>
+              <w:t>01 Mar 2029</w:t>
             </w:r>
           </w:p>
         </w:tc>
@@ -5679,7 +5679,7 @@
               <w:rPr>
                 <w:sz w:val="19"/>
               </w:rPr>
-              <w:t>21</w:t>
+              <w:t>22</w:t>
             </w:r>
           </w:p>
         </w:tc>
@@ -5723,7 +5723,7 @@
               <w:rPr>
                 <w:sz w:val="19"/>
               </w:rPr>
-              <w:t>19 Nov 2028</w:t>
+              <w:t>16 Nov 2028</w:t>
             </w:r>
           </w:p>
         </w:tc>
@@ -5737,7 +5737,7 @@
               <w:rPr>
                 <w:sz w:val="19"/>
               </w:rPr>
-              <w:t>04 Mar 2029</w:t>
+              <w:t>01 Mar 2029</w:t>
             </w:r>
           </w:p>
         </w:tc>
@@ -5751,7 +5751,7 @@
               <w:rPr>
                 <w:sz w:val="19"/>
               </w:rPr>
-              <w:t>21</w:t>
+              <w:t>22</w:t>
             </w:r>
           </w:p>
         </w:tc>
@@ -5795,7 +5795,7 @@
               <w:rPr>
                 <w:sz w:val="19"/>
               </w:rPr>
-              <w:t>05 Mar 2029</w:t>
+              <w:t>04 Mar 2029</w:t>
             </w:r>
           </w:p>
         </w:tc>
@@ -5809,7 +5809,7 @@
               <w:rPr>
                 <w:sz w:val="19"/>
               </w:rPr>
-              <w:t>18 Mar 2029</w:t>
+              <w:t>15 Mar 2029</w:t>
             </w:r>
           </w:p>
         </w:tc>
@@ -5823,7 +5823,7 @@
               <w:rPr>
                 <w:sz w:val="19"/>
               </w:rPr>
-              <w:t>21</w:t>
+              <w:t>22</w:t>
             </w:r>
           </w:p>
         </w:tc>

</xml_diff>

<commit_message>
Single project-level survey permit in Mobilization (no per-station permit); full project name at WBS level 1
Co-Authored-By: Claude Sonnet 5.5 <noreply@anthropic.com>
Claude-Session: https://claude.ai/code/session_01DZdGPWRxvKXCnMyT6qFPZb
</commit_message>
<xml_diff>
--- a/p6/0580_Schedule_Narrative.docx
+++ b/p6/0580_Schedule_Narrative.docx
@@ -67,7 +67,7 @@
         <w:rPr>
           <w:b w:val="0"/>
         </w:rPr>
-        <w:t>This narrative describes the baseline programme (Rev 1) of project 0580-Security Technology Salutation after eliminating Passenger Checking Roles, covering 14 stations on three railways (North South Railway, East West Railway and Haramain High Speed Rail). It is delivered as a Primavera P6 24 XER file with 614 activities (522 tasks and 92 milestones) and 931 logic links. It runs from the Notice to Proceed milestone on 01 Nov 2026 to the contract completion milestone on 31 Oct 2029.</w:t>
+        <w:t>This narrative describes the baseline programme (Rev 1) of project 0580-Security Technology Salutation after eliminating Passenger Checking Roles, covering 14 stations on three railways (North South Railway, East West Railway and Haramain High Speed Rail). It is delivered as a Primavera P6 24 XER file with 601 activities (509 tasks and 92 milestones) and 927 logic links. It runs from the Notice to Proceed milestone on 01 Nov 2026 to the contract completion milestone on 31 Oct 2029.</w:t>
       </w:r>
     </w:p>
     <w:p>
@@ -872,7 +872,7 @@
               <w:rPr>
                 <w:sz w:val="19"/>
               </w:rPr>
-              <w:t>Mobilization, initial baseline, and the two month site access permit for the survey at Riyadh (Thumamah), Makkah and Riyadh (Malaz)</w:t>
+              <w:t>Mobilization, initial baseline, and the two month site access permit for the surveys, applied for once for the whole project</w:t>
             </w:r>
           </w:p>
         </w:tc>
@@ -1000,7 +1000,7 @@
         <w:rPr>
           <w:b w:val="0"/>
         </w:rPr>
-        <w:t>The survey needs a site access permit and the permit takes two months, so months 1 and 2 are mobilization and the permit (activity E1005 at each station, held in the Mobilization branch of the WBS). The survey is the first part of design, so design starts when the permit is granted and lasts four months in total, survey included. At the priority stations the two month window is held by milestone PRJ-M1150; at the other stations design starts when their own permit ends. Enabling works start two months before the end of design, so design and execution overlap by two months. No date constraint is used.</w:t>
+        <w:t>The survey needs a site access permit and the permit takes two months, so months 1 and 2 are mobilization and the permit (one project-level activity, PRJ-A1060, in the Mobilization branch of the WBS; there is no permit activity per station). The survey is the first part of design, so the survey and design start when the permit is granted and lasts four months in total, survey included. At the priority stations the two month window is held by milestone PRJ-M1150; the other stations start design in their wave, with the permit already in hand. Enabling works start two months before the end of design, so design and execution overlap by two months. No date constraint is used.</w:t>
       </w:r>
     </w:p>
     <w:p>
@@ -1098,7 +1098,7 @@
                 <w:color w:val="FFFFFF"/>
                 <w:sz w:val="19"/>
               </w:rPr>
-              <w:t>Permit start</w:t>
+              <w:t>Design start</w:t>
             </w:r>
           </w:p>
         </w:tc>
@@ -1173,7 +1173,7 @@
               <w:rPr>
                 <w:sz w:val="19"/>
               </w:rPr>
-              <w:t>01 Nov 2026</w:t>
+              <w:t>03 Jan 2027</w:t>
             </w:r>
           </w:p>
         </w:tc>
@@ -1245,7 +1245,7 @@
               <w:rPr>
                 <w:sz w:val="19"/>
               </w:rPr>
-              <w:t>01 Nov 2026</w:t>
+              <w:t>03 Jan 2027</w:t>
             </w:r>
           </w:p>
         </w:tc>
@@ -1317,7 +1317,7 @@
               <w:rPr>
                 <w:sz w:val="19"/>
               </w:rPr>
-              <w:t>01 Nov 2026</w:t>
+              <w:t>03 Jan 2027</w:t>
             </w:r>
           </w:p>
         </w:tc>
@@ -1403,7 +1403,7 @@
               <w:rPr>
                 <w:sz w:val="19"/>
               </w:rPr>
-              <w:t>06 Dec 2028</w:t>
+              <w:t>28 Sep 2028</w:t>
             </w:r>
           </w:p>
         </w:tc>
@@ -1461,7 +1461,7 @@
               <w:rPr>
                 <w:sz w:val="19"/>
               </w:rPr>
-              <w:t>10 May 2027</w:t>
+              <w:t>08 Jun 2027</w:t>
             </w:r>
           </w:p>
         </w:tc>
@@ -1475,7 +1475,7 @@
               <w:rPr>
                 <w:sz w:val="19"/>
               </w:rPr>
-              <w:t>07 Sep 2028</w:t>
+              <w:t>27 Jul 2028</w:t>
             </w:r>
           </w:p>
         </w:tc>
@@ -1533,7 +1533,7 @@
               <w:rPr>
                 <w:sz w:val="19"/>
               </w:rPr>
-              <w:t>30 Jun 2027</w:t>
+              <w:t>28 Jul 2027</w:t>
             </w:r>
           </w:p>
         </w:tc>
@@ -1547,7 +1547,7 @@
               <w:rPr>
                 <w:sz w:val="19"/>
               </w:rPr>
-              <w:t>29 Oct 2028</w:t>
+              <w:t>24 Sep 2028</w:t>
             </w:r>
           </w:p>
         </w:tc>
@@ -1605,7 +1605,7 @@
               <w:rPr>
                 <w:sz w:val="19"/>
               </w:rPr>
-              <w:t>30 Jun 2027</w:t>
+              <w:t>28 Jul 2027</w:t>
             </w:r>
           </w:p>
         </w:tc>
@@ -1619,7 +1619,7 @@
               <w:rPr>
                 <w:sz w:val="19"/>
               </w:rPr>
-              <w:t>19 Oct 2028</w:t>
+              <w:t>14 Sep 2028</w:t>
             </w:r>
           </w:p>
         </w:tc>
@@ -1677,7 +1677,7 @@
               <w:rPr>
                 <w:sz w:val="19"/>
               </w:rPr>
-              <w:t>10 Aug 2027</w:t>
+              <w:t>13 Sep 2027</w:t>
             </w:r>
           </w:p>
         </w:tc>
@@ -1691,7 +1691,7 @@
               <w:rPr>
                 <w:sz w:val="19"/>
               </w:rPr>
-              <w:t>10 Dec 2028</w:t>
+              <w:t>09 Nov 2028</w:t>
             </w:r>
           </w:p>
         </w:tc>
@@ -1749,7 +1749,7 @@
               <w:rPr>
                 <w:sz w:val="19"/>
               </w:rPr>
-              <w:t>21 Nov 2027</w:t>
+              <w:t>05 Jan 2028</w:t>
             </w:r>
           </w:p>
         </w:tc>
@@ -1763,7 +1763,7 @@
               <w:rPr>
                 <w:sz w:val="19"/>
               </w:rPr>
-              <w:t>27 Jun 2029</w:t>
+              <w:t>11 Jun 2029</w:t>
             </w:r>
           </w:p>
         </w:tc>
@@ -1821,7 +1821,7 @@
               <w:rPr>
                 <w:sz w:val="19"/>
               </w:rPr>
-              <w:t>21 Nov 2027</w:t>
+              <w:t>05 Jan 2028</w:t>
             </w:r>
           </w:p>
         </w:tc>
@@ -1835,7 +1835,7 @@
               <w:rPr>
                 <w:sz w:val="19"/>
               </w:rPr>
-              <w:t>03 Jul 2029</w:t>
+              <w:t>17 Jun 2029</w:t>
             </w:r>
           </w:p>
         </w:tc>
@@ -1893,7 +1893,7 @@
               <w:rPr>
                 <w:sz w:val="19"/>
               </w:rPr>
-              <w:t>30 Dec 2027</w:t>
+              <w:t>27 Feb 2028</w:t>
             </w:r>
           </w:p>
         </w:tc>
@@ -1907,7 +1907,7 @@
               <w:rPr>
                 <w:sz w:val="19"/>
               </w:rPr>
-              <w:t>16 Apr 2029</w:t>
+              <w:t>04 Apr 2029</w:t>
             </w:r>
           </w:p>
         </w:tc>
@@ -1965,7 +1965,7 @@
               <w:rPr>
                 <w:sz w:val="19"/>
               </w:rPr>
-              <w:t>19 Jan 2028</w:t>
+              <w:t>20 Mar 2028</w:t>
             </w:r>
           </w:p>
         </w:tc>
@@ -1979,7 +1979,7 @@
               <w:rPr>
                 <w:sz w:val="19"/>
               </w:rPr>
-              <w:t>28 May 2029</w:t>
+              <w:t>20 May 2029</w:t>
             </w:r>
           </w:p>
         </w:tc>
@@ -2037,7 +2037,7 @@
               <w:rPr>
                 <w:sz w:val="19"/>
               </w:rPr>
-              <w:t>27 Mar 2028</w:t>
+              <w:t>04 Jun 2028</w:t>
             </w:r>
           </w:p>
         </w:tc>
@@ -2051,7 +2051,7 @@
               <w:rPr>
                 <w:sz w:val="19"/>
               </w:rPr>
-              <w:t>05 Aug 2029</w:t>
+              <w:t>02 Aug 2029</w:t>
             </w:r>
           </w:p>
         </w:tc>
@@ -2109,7 +2109,7 @@
               <w:rPr>
                 <w:sz w:val="19"/>
               </w:rPr>
-              <w:t>14 May 2028</w:t>
+              <w:t>18 Jul 2028</w:t>
             </w:r>
           </w:p>
         </w:tc>
@@ -2123,7 +2123,7 @@
               <w:rPr>
                 <w:sz w:val="19"/>
               </w:rPr>
-              <w:t>16 Sep 2029</w:t>
+              <w:t>17 Sep 2029</w:t>
             </w:r>
           </w:p>
         </w:tc>
@@ -2998,7 +2998,7 @@
         <w:rPr>
           <w:b w:val="0"/>
         </w:rPr>
-        <w:t>118 approval activities are loaded. Their durations: 10 days x 1, 12 days x 1, 15 days x 101, 22 days x 1, 45 days x 14 (working days).</w:t>
+        <w:t>105 approval activities are loaded. Their durations: 10 days x 1, 12 days x 1, 15 days x 101, 22 days x 1, 45 days x 1 (working days).</w:t>
       </w:r>
     </w:p>
     <w:p>
@@ -3633,7 +3633,7 @@
         <w:rPr>
           <w:b w:val="0"/>
         </w:rPr>
-        <w:t>The WBS follows EPC. Level 1 is the project (0580), level 2 the EPC phase (Engineering, Procurement, Construction, Commissioning and handover, plus Project management), level 3 the station, level 4 the design stage or work package (enabling works, civil, installation, POC), and level 5 the submittal, approval or area. There are 534 nodes. The survey access permits sit under Project management and mobilization, in the Mobilization branch (one node per station). Levels 6 to 8 are not used because the contract gives no zone-level data; they can be added when it does.</w:t>
+        <w:t>The WBS follows EPC. Level 1 is the project (0580), level 2 the EPC phase (Engineering, Procurement, Construction, Commissioning and handover, plus Project management), level 3 the station, level 4 the design stage or work package (enabling works, civil, installation, POC), and level 5 the submittal, approval or area. There are 520 nodes. The survey access permits sit under Project management and mobilization, in the Mobilization branch (one node per station). Levels 6 to 8 are not used because the contract gives no zone-level data; they can be added when it does.</w:t>
       </w:r>
     </w:p>
     <w:tbl>
@@ -3798,7 +3798,7 @@
               <w:rPr>
                 <w:sz w:val="19"/>
               </w:rPr>
-              <w:t>268</w:t>
+              <w:t>254</w:t>
             </w:r>
           </w:p>
         </w:tc>
@@ -3924,7 +3924,7 @@
         <w:rPr>
           <w:b w:val="0"/>
         </w:rPr>
-        <w:t>The contract completion milestone is held by the 36 month term, so no activity has zero float against it. The longest physical path finishes 22 working days before the contract end date, and that margin is the project float. 32 tasks sit on this longest path and 8 more are within 20 working days of it. The first 25 in date order are listed below.</w:t>
+        <w:t>The contract completion milestone is held by the 36 month term, so no activity has zero float against it. The longest physical path finishes 21 working days before the contract end date, and that margin is the project float. 29 tasks sit on this longest path and 8 more are within 20 working days of it. The first 25 in date order are listed below.</w:t>
       </w:r>
     </w:p>
     <w:tbl>
@@ -4039,7 +4039,7 @@
               <w:rPr>
                 <w:sz w:val="19"/>
               </w:rPr>
-              <w:t>NRY-E1005</w:t>
+              <w:t>PRJ-A1060</w:t>
             </w:r>
           </w:p>
         </w:tc>
@@ -4053,7 +4053,7 @@
               <w:rPr>
                 <w:sz w:val="19"/>
               </w:rPr>
-              <w:t>Mobilization: site access permit for the survey - application and approval (two months) - Riyadh (Thumamah)</w:t>
+              <w:t>Site access permits for the surveys of all stations: application and approval (two months)</w:t>
             </w:r>
           </w:p>
         </w:tc>
@@ -4095,7 +4095,7 @@
               <w:rPr>
                 <w:sz w:val="19"/>
               </w:rPr>
-              <w:t>22</w:t>
+              <w:t>21</w:t>
             </w:r>
           </w:p>
         </w:tc>
@@ -4111,7 +4111,7 @@
               <w:rPr>
                 <w:sz w:val="19"/>
               </w:rPr>
-              <w:t>HMK-E1005</w:t>
+              <w:t>PRJ-A1040</w:t>
             </w:r>
           </w:p>
         </w:tc>
@@ -4125,7 +4125,7 @@
               <w:rPr>
                 <w:sz w:val="19"/>
               </w:rPr>
-              <w:t>Mobilization: site access permit for the survey - application and approval (two months) - Makkah</w:t>
+              <w:t>Mobilization: site establishment, offices, personnel and tools</w:t>
             </w:r>
           </w:p>
         </w:tc>
@@ -4139,7 +4139,7 @@
               <w:rPr>
                 <w:sz w:val="19"/>
               </w:rPr>
-              <w:t>01 Nov 2026</w:t>
+              <w:t>08 Nov 2026</w:t>
             </w:r>
           </w:p>
         </w:tc>
@@ -4153,7 +4153,7 @@
               <w:rPr>
                 <w:sz w:val="19"/>
               </w:rPr>
-              <w:t>31 Dec 2026</w:t>
+              <w:t>10 Dec 2026</w:t>
             </w:r>
           </w:p>
         </w:tc>
@@ -4167,7 +4167,7 @@
               <w:rPr>
                 <w:sz w:val="19"/>
               </w:rPr>
-              <w:t>22</w:t>
+              <w:t>36</w:t>
             </w:r>
           </w:p>
         </w:tc>
@@ -4183,7 +4183,7 @@
               <w:rPr>
                 <w:sz w:val="19"/>
               </w:rPr>
-              <w:t>ERY-E1005</w:t>
+              <w:t>PRJ-A1050</w:t>
             </w:r>
           </w:p>
         </w:tc>
@@ -4197,7 +4197,7 @@
               <w:rPr>
                 <w:sz w:val="19"/>
               </w:rPr>
-              <w:t>Mobilization: site access permit for the survey - application and approval (two months) - Riyadh (Malaz)</w:t>
+              <w:t>Mobilization submittals: QC programme and ITP, HSE, security, procurement and shipping plan</w:t>
             </w:r>
           </w:p>
         </w:tc>
@@ -4211,7 +4211,7 @@
               <w:rPr>
                 <w:sz w:val="19"/>
               </w:rPr>
-              <w:t>01 Nov 2026</w:t>
+              <w:t>08 Nov 2026</w:t>
             </w:r>
           </w:p>
         </w:tc>
@@ -4225,7 +4225,7 @@
               <w:rPr>
                 <w:sz w:val="19"/>
               </w:rPr>
-              <w:t>31 Dec 2026</w:t>
+              <w:t>03 Dec 2026</w:t>
             </w:r>
           </w:p>
         </w:tc>
@@ -4239,7 +4239,7 @@
               <w:rPr>
                 <w:sz w:val="19"/>
               </w:rPr>
-              <w:t>22</w:t>
+              <w:t>41</w:t>
             </w:r>
           </w:p>
         </w:tc>
@@ -4255,7 +4255,7 @@
               <w:rPr>
                 <w:sz w:val="19"/>
               </w:rPr>
-              <w:t>PRJ-A1040</w:t>
+              <w:t>NRY-E1010</w:t>
             </w:r>
           </w:p>
         </w:tc>
@@ -4269,7 +4269,7 @@
               <w:rPr>
                 <w:sz w:val="19"/>
               </w:rPr>
-              <w:t>Mobilization: site establishment, offices, personnel and tools</w:t>
+              <w:t>Survey: submittal of site survey and as-found report - Riyadh (Thumamah)</w:t>
             </w:r>
           </w:p>
         </w:tc>
@@ -4283,7 +4283,7 @@
               <w:rPr>
                 <w:sz w:val="19"/>
               </w:rPr>
-              <w:t>08 Nov 2026</w:t>
+              <w:t>03 Jan 2027</w:t>
             </w:r>
           </w:p>
         </w:tc>
@@ -4297,7 +4297,7 @@
               <w:rPr>
                 <w:sz w:val="19"/>
               </w:rPr>
-              <w:t>10 Dec 2026</w:t>
+              <w:t>14 Jan 2027</w:t>
             </w:r>
           </w:p>
         </w:tc>
@@ -4311,7 +4311,7 @@
               <w:rPr>
                 <w:sz w:val="19"/>
               </w:rPr>
-              <w:t>37</w:t>
+              <w:t>31</w:t>
             </w:r>
           </w:p>
         </w:tc>
@@ -4327,7 +4327,7 @@
               <w:rPr>
                 <w:sz w:val="19"/>
               </w:rPr>
-              <w:t>PRJ-A1050</w:t>
+              <w:t>ERY-E1010</w:t>
             </w:r>
           </w:p>
         </w:tc>
@@ -4341,7 +4341,7 @@
               <w:rPr>
                 <w:sz w:val="19"/>
               </w:rPr>
-              <w:t>Mobilization submittals: QC programme and ITP, HSE, security, procurement and shipping plan</w:t>
+              <w:t>Survey: submittal of site survey and as-found report - Riyadh (Malaz)</w:t>
             </w:r>
           </w:p>
         </w:tc>
@@ -4355,7 +4355,7 @@
               <w:rPr>
                 <w:sz w:val="19"/>
               </w:rPr>
-              <w:t>08 Nov 2026</w:t>
+              <w:t>03 Jan 2027</w:t>
             </w:r>
           </w:p>
         </w:tc>
@@ -4369,7 +4369,7 @@
               <w:rPr>
                 <w:sz w:val="19"/>
               </w:rPr>
-              <w:t>03 Dec 2026</w:t>
+              <w:t>14 Jan 2027</w:t>
             </w:r>
           </w:p>
         </w:tc>
@@ -4383,7 +4383,7 @@
               <w:rPr>
                 <w:sz w:val="19"/>
               </w:rPr>
-              <w:t>42</w:t>
+              <w:t>31</w:t>
             </w:r>
           </w:p>
         </w:tc>
@@ -4399,7 +4399,7 @@
               <w:rPr>
                 <w:sz w:val="19"/>
               </w:rPr>
-              <w:t>NRY-E1010</w:t>
+              <w:t>HMK-E1010</w:t>
             </w:r>
           </w:p>
         </w:tc>
@@ -4413,7 +4413,7 @@
               <w:rPr>
                 <w:sz w:val="19"/>
               </w:rPr>
-              <w:t>Survey: submittal of site survey and as-found report - Riyadh (Thumamah)</w:t>
+              <w:t>Survey: submittal of site survey and as-found report - Makkah</w:t>
             </w:r>
           </w:p>
         </w:tc>
@@ -4441,7 +4441,7 @@
               <w:rPr>
                 <w:sz w:val="19"/>
               </w:rPr>
-              <w:t>14 Jan 2027</w:t>
+              <w:t>28 Jan 2027</w:t>
             </w:r>
           </w:p>
         </w:tc>
@@ -4455,7 +4455,7 @@
               <w:rPr>
                 <w:sz w:val="19"/>
               </w:rPr>
-              <w:t>32</w:t>
+              <w:t>21</w:t>
             </w:r>
           </w:p>
         </w:tc>
@@ -4471,7 +4471,7 @@
               <w:rPr>
                 <w:sz w:val="19"/>
               </w:rPr>
-              <w:t>ERY-E1010</w:t>
+              <w:t>PRJ-A2010</w:t>
             </w:r>
           </w:p>
         </w:tc>
@@ -4485,7 +4485,7 @@
               <w:rPr>
                 <w:sz w:val="19"/>
               </w:rPr>
-              <w:t>Survey: submittal of site survey and as-found report - Riyadh (Malaz)</w:t>
+              <w:t>Detailed baseline programme (within 21 days after survey)</w:t>
             </w:r>
           </w:p>
         </w:tc>
@@ -4499,7 +4499,7 @@
               <w:rPr>
                 <w:sz w:val="19"/>
               </w:rPr>
-              <w:t>03 Jan 2027</w:t>
+              <w:t>31 Jan 2027</w:t>
             </w:r>
           </w:p>
         </w:tc>
@@ -4513,7 +4513,7 @@
               <w:rPr>
                 <w:sz w:val="19"/>
               </w:rPr>
-              <w:t>14 Jan 2027</w:t>
+              <w:t>18 Feb 2027</w:t>
             </w:r>
           </w:p>
         </w:tc>
@@ -4527,7 +4527,7 @@
               <w:rPr>
                 <w:sz w:val="19"/>
               </w:rPr>
-              <w:t>32</w:t>
+              <w:t>21</w:t>
             </w:r>
           </w:p>
         </w:tc>
@@ -4543,7 +4543,7 @@
               <w:rPr>
                 <w:sz w:val="19"/>
               </w:rPr>
-              <w:t>HMK-E1010</w:t>
+              <w:t>PRJ-A2020</w:t>
             </w:r>
           </w:p>
         </w:tc>
@@ -4557,7 +4557,7 @@
               <w:rPr>
                 <w:sz w:val="19"/>
               </w:rPr>
-              <w:t>Survey: submittal of site survey and as-found report - Makkah</w:t>
+              <w:t>SAR review and approval of detailed baseline</w:t>
             </w:r>
           </w:p>
         </w:tc>
@@ -4571,7 +4571,7 @@
               <w:rPr>
                 <w:sz w:val="19"/>
               </w:rPr>
-              <w:t>03 Jan 2027</w:t>
+              <w:t>21 Feb 2027</w:t>
             </w:r>
           </w:p>
         </w:tc>
@@ -4585,7 +4585,7 @@
               <w:rPr>
                 <w:sz w:val="19"/>
               </w:rPr>
-              <w:t>28 Jan 2027</w:t>
+              <w:t>21 Mar 2027</w:t>
             </w:r>
           </w:p>
         </w:tc>
@@ -4599,7 +4599,7 @@
               <w:rPr>
                 <w:sz w:val="19"/>
               </w:rPr>
-              <w:t>22</w:t>
+              <w:t>21</w:t>
             </w:r>
           </w:p>
         </w:tc>
@@ -4615,7 +4615,7 @@
               <w:rPr>
                 <w:sz w:val="19"/>
               </w:rPr>
-              <w:t>PRJ-A2010</w:t>
+              <w:t>NQR-E1010</w:t>
             </w:r>
           </w:p>
         </w:tc>
@@ -4629,7 +4629,7 @@
               <w:rPr>
                 <w:sz w:val="19"/>
               </w:rPr>
-              <w:t>Detailed baseline programme (within 21 days after survey)</w:t>
+              <w:t>Survey: submittal of site survey and as-found report - Al Qurayyat</w:t>
             </w:r>
           </w:p>
         </w:tc>
@@ -4643,7 +4643,7 @@
               <w:rPr>
                 <w:sz w:val="19"/>
               </w:rPr>
-              <w:t>31 Jan 2027</w:t>
+              <w:t>18 Jul 2028</w:t>
             </w:r>
           </w:p>
         </w:tc>
@@ -4657,7 +4657,7 @@
               <w:rPr>
                 <w:sz w:val="19"/>
               </w:rPr>
-              <w:t>18 Feb 2027</w:t>
+              <w:t>31 Jul 2028</w:t>
             </w:r>
           </w:p>
         </w:tc>
@@ -4671,7 +4671,7 @@
               <w:rPr>
                 <w:sz w:val="19"/>
               </w:rPr>
-              <w:t>22</w:t>
+              <w:t>21</w:t>
             </w:r>
           </w:p>
         </w:tc>
@@ -4687,7 +4687,7 @@
               <w:rPr>
                 <w:sz w:val="19"/>
               </w:rPr>
-              <w:t>PRJ-A2020</w:t>
+              <w:t>NQR-E1030</w:t>
             </w:r>
           </w:p>
         </w:tc>
@@ -4701,7 +4701,7 @@
               <w:rPr>
                 <w:sz w:val="19"/>
               </w:rPr>
-              <w:t>SAR review and approval of detailed baseline</w:t>
+              <w:t>Concept design: submittal - Al Qurayyat</w:t>
             </w:r>
           </w:p>
         </w:tc>
@@ -4715,7 +4715,7 @@
               <w:rPr>
                 <w:sz w:val="19"/>
               </w:rPr>
-              <w:t>21 Feb 2027</w:t>
+              <w:t>01 Aug 2028</w:t>
             </w:r>
           </w:p>
         </w:tc>
@@ -4729,7 +4729,7 @@
               <w:rPr>
                 <w:sz w:val="19"/>
               </w:rPr>
-              <w:t>21 Mar 2027</w:t>
+              <w:t>13 Aug 2028</w:t>
             </w:r>
           </w:p>
         </w:tc>
@@ -4743,7 +4743,7 @@
               <w:rPr>
                 <w:sz w:val="19"/>
               </w:rPr>
-              <w:t>22</w:t>
+              <w:t>21</w:t>
             </w:r>
           </w:p>
         </w:tc>
@@ -4759,7 +4759,7 @@
               <w:rPr>
                 <w:sz w:val="19"/>
               </w:rPr>
-              <w:t>NQR-E1005</w:t>
+              <w:t>NQR-E1050</w:t>
             </w:r>
           </w:p>
         </w:tc>
@@ -4773,7 +4773,7 @@
               <w:rPr>
                 <w:sz w:val="19"/>
               </w:rPr>
-              <w:t>Mobilization: site access permit for the survey - application and approval (two months) - Al Qurayyat</w:t>
+              <w:t>Preliminary design: submittal - Al Qurayyat</w:t>
             </w:r>
           </w:p>
         </w:tc>
@@ -4787,7 +4787,7 @@
               <w:rPr>
                 <w:sz w:val="19"/>
               </w:rPr>
-              <w:t>14 May 2028</w:t>
+              <w:t>14 Aug 2028</w:t>
             </w:r>
           </w:p>
         </w:tc>
@@ -4801,7 +4801,7 @@
               <w:rPr>
                 <w:sz w:val="19"/>
               </w:rPr>
-              <w:t>13 Jul 2028</w:t>
+              <w:t>04 Sep 2028</w:t>
             </w:r>
           </w:p>
         </w:tc>
@@ -4815,7 +4815,7 @@
               <w:rPr>
                 <w:sz w:val="19"/>
               </w:rPr>
-              <w:t>22</w:t>
+              <w:t>21</w:t>
             </w:r>
           </w:p>
         </w:tc>
@@ -4831,7 +4831,7 @@
               <w:rPr>
                 <w:sz w:val="19"/>
               </w:rPr>
-              <w:t>NQR-E1010</w:t>
+              <w:t>NQR-E1070</w:t>
             </w:r>
           </w:p>
         </w:tc>
@@ -4845,7 +4845,7 @@
               <w:rPr>
                 <w:sz w:val="19"/>
               </w:rPr>
-              <w:t>Survey: submittal of site survey and as-found report - Al Qurayyat</w:t>
+              <w:t>Detailed design: submittal (drawings, BOQ, data sheets) - Al Qurayyat</w:t>
             </w:r>
           </w:p>
         </w:tc>
@@ -4859,7 +4859,7 @@
               <w:rPr>
                 <w:sz w:val="19"/>
               </w:rPr>
-              <w:t>16 Jul 2028</w:t>
+              <w:t>05 Sep 2028</w:t>
             </w:r>
           </w:p>
         </w:tc>
@@ -4873,7 +4873,7 @@
               <w:rPr>
                 <w:sz w:val="19"/>
               </w:rPr>
-              <w:t>27 Jul 2028</w:t>
+              <w:t>09 Oct 2028</w:t>
             </w:r>
           </w:p>
         </w:tc>
@@ -4887,7 +4887,7 @@
               <w:rPr>
                 <w:sz w:val="19"/>
               </w:rPr>
-              <w:t>22</w:t>
+              <w:t>21</w:t>
             </w:r>
           </w:p>
         </w:tc>
@@ -4903,7 +4903,7 @@
               <w:rPr>
                 <w:sz w:val="19"/>
               </w:rPr>
-              <w:t>NQR-E1030</w:t>
+              <w:t>NQR-E1110</w:t>
             </w:r>
           </w:p>
         </w:tc>
@@ -4917,7 +4917,7 @@
               <w:rPr>
                 <w:sz w:val="19"/>
               </w:rPr>
-              <w:t>Concept design: submittal - Al Qurayyat</w:t>
+              <w:t>HCIS Stage 3 and 4 documents: preparation - Al Qurayyat</w:t>
             </w:r>
           </w:p>
         </w:tc>
@@ -4931,7 +4931,7 @@
               <w:rPr>
                 <w:sz w:val="19"/>
               </w:rPr>
-              <w:t>30 Jul 2028</w:t>
+              <w:t>18 Sep 2028</w:t>
             </w:r>
           </w:p>
         </w:tc>
@@ -4945,7 +4945,7 @@
               <w:rPr>
                 <w:sz w:val="19"/>
               </w:rPr>
-              <w:t>10 Aug 2028</w:t>
+              <w:t>26 Oct 2028</w:t>
             </w:r>
           </w:p>
         </w:tc>
@@ -4959,7 +4959,7 @@
               <w:rPr>
                 <w:sz w:val="19"/>
               </w:rPr>
-              <w:t>22</w:t>
+              <w:t>21</w:t>
             </w:r>
           </w:p>
         </w:tc>
@@ -4975,7 +4975,7 @@
               <w:rPr>
                 <w:sz w:val="19"/>
               </w:rPr>
-              <w:t>NQR-E1050</w:t>
+              <w:t>NQR-E1080</w:t>
             </w:r>
           </w:p>
         </w:tc>
@@ -4989,7 +4989,7 @@
               <w:rPr>
                 <w:sz w:val="19"/>
               </w:rPr>
-              <w:t>Preliminary design: submittal - Al Qurayyat</w:t>
+              <w:t>Detailed design: SAR review and approval - Al Qurayyat</w:t>
             </w:r>
           </w:p>
         </w:tc>
@@ -5003,7 +5003,7 @@
               <w:rPr>
                 <w:sz w:val="19"/>
               </w:rPr>
-              <w:t>13 Aug 2028</w:t>
+              <w:t>10 Oct 2028</w:t>
             </w:r>
           </w:p>
         </w:tc>
@@ -5017,7 +5017,7 @@
               <w:rPr>
                 <w:sz w:val="19"/>
               </w:rPr>
-              <w:t>03 Sep 2028</w:t>
+              <w:t>30 Oct 2028</w:t>
             </w:r>
           </w:p>
         </w:tc>
@@ -5031,7 +5031,7 @@
               <w:rPr>
                 <w:sz w:val="19"/>
               </w:rPr>
-              <w:t>22</w:t>
+              <w:t>34</w:t>
             </w:r>
           </w:p>
         </w:tc>
@@ -5047,7 +5047,7 @@
               <w:rPr>
                 <w:sz w:val="19"/>
               </w:rPr>
-              <w:t>NQR-E1070</w:t>
+              <w:t>NQR-E1090</w:t>
             </w:r>
           </w:p>
         </w:tc>
@@ -5061,7 +5061,7 @@
               <w:rPr>
                 <w:sz w:val="19"/>
               </w:rPr>
-              <w:t>Detailed design: submittal (drawings, BOQ, data sheets) - Al Qurayyat</w:t>
+              <w:t>IFC and shop drawings: submittal - Al Qurayyat</w:t>
             </w:r>
           </w:p>
         </w:tc>
@@ -5075,7 +5075,7 @@
               <w:rPr>
                 <w:sz w:val="19"/>
               </w:rPr>
-              <w:t>04 Sep 2028</w:t>
+              <w:t>10 Oct 2028</w:t>
             </w:r>
           </w:p>
         </w:tc>
@@ -5089,7 +5089,7 @@
               <w:rPr>
                 <w:sz w:val="19"/>
               </w:rPr>
-              <w:t>09 Oct 2028</w:t>
+              <w:t>26 Oct 2028</w:t>
             </w:r>
           </w:p>
         </w:tc>
@@ -5103,7 +5103,7 @@
               <w:rPr>
                 <w:sz w:val="19"/>
               </w:rPr>
-              <w:t>22</w:t>
+              <w:t>21</w:t>
             </w:r>
           </w:p>
         </w:tc>
@@ -5119,7 +5119,7 @@
               <w:rPr>
                 <w:sz w:val="19"/>
               </w:rPr>
-              <w:t>NQR-E1110</w:t>
+              <w:t>NQR-E1100</w:t>
             </w:r>
           </w:p>
         </w:tc>
@@ -5133,7 +5133,7 @@
               <w:rPr>
                 <w:sz w:val="19"/>
               </w:rPr>
-              <w:t>HCIS Stage 3 and 4 documents: preparation - Al Qurayyat</w:t>
+              <w:t>IFC and shop drawings: SAR approval and release - Al Qurayyat</w:t>
             </w:r>
           </w:p>
         </w:tc>
@@ -5147,7 +5147,7 @@
               <w:rPr>
                 <w:sz w:val="19"/>
               </w:rPr>
-              <w:t>18 Sep 2028</w:t>
+              <w:t>29 Oct 2028</w:t>
             </w:r>
           </w:p>
         </w:tc>
@@ -5161,7 +5161,7 @@
               <w:rPr>
                 <w:sz w:val="19"/>
               </w:rPr>
-              <w:t>25 Oct 2028</w:t>
+              <w:t>16 Nov 2028</w:t>
             </w:r>
           </w:p>
         </w:tc>
@@ -5175,7 +5175,7 @@
               <w:rPr>
                 <w:sz w:val="19"/>
               </w:rPr>
-              <w:t>22</w:t>
+              <w:t>21</w:t>
             </w:r>
           </w:p>
         </w:tc>
@@ -5191,7 +5191,7 @@
               <w:rPr>
                 <w:sz w:val="19"/>
               </w:rPr>
-              <w:t>NQR-E1080</w:t>
+              <w:t>NQR-E1120</w:t>
             </w:r>
           </w:p>
         </w:tc>
@@ -5205,7 +5205,7 @@
               <w:rPr>
                 <w:sz w:val="19"/>
               </w:rPr>
-              <w:t>Detailed design: SAR review and approval - Al Qurayyat</w:t>
+              <w:t>HCIS Stage 3 and 4 documents: SAR final review and HCIS submission - Al Qurayyat</w:t>
             </w:r>
           </w:p>
         </w:tc>
@@ -5219,7 +5219,7 @@
               <w:rPr>
                 <w:sz w:val="19"/>
               </w:rPr>
-              <w:t>10 Oct 2028</w:t>
+              <w:t>29 Oct 2028</w:t>
             </w:r>
           </w:p>
         </w:tc>
@@ -5233,7 +5233,7 @@
               <w:rPr>
                 <w:sz w:val="19"/>
               </w:rPr>
-              <w:t>30 Oct 2028</w:t>
+              <w:t>16 Nov 2028</w:t>
             </w:r>
           </w:p>
         </w:tc>
@@ -5247,7 +5247,7 @@
               <w:rPr>
                 <w:sz w:val="19"/>
               </w:rPr>
-              <w:t>34</w:t>
+              <w:t>21</w:t>
             </w:r>
           </w:p>
         </w:tc>
@@ -5263,7 +5263,7 @@
               <w:rPr>
                 <w:sz w:val="19"/>
               </w:rPr>
-              <w:t>NQR-E1090</w:t>
+              <w:t>NQR-P1010</w:t>
             </w:r>
           </w:p>
         </w:tc>
@@ -5277,7 +5277,7 @@
               <w:rPr>
                 <w:sz w:val="19"/>
               </w:rPr>
-              <w:t>IFC and shop drawings: submittal - Al Qurayyat</w:t>
+              <w:t>Manufacture CCTV cameras and analytics - Al Qurayyat</w:t>
             </w:r>
           </w:p>
         </w:tc>
@@ -5291,7 +5291,7 @@
               <w:rPr>
                 <w:sz w:val="19"/>
               </w:rPr>
-              <w:t>10 Oct 2028</w:t>
+              <w:t>19 Nov 2028</w:t>
             </w:r>
           </w:p>
         </w:tc>
@@ -5305,7 +5305,7 @@
               <w:rPr>
                 <w:sz w:val="19"/>
               </w:rPr>
-              <w:t>25 Oct 2028</w:t>
+              <w:t>04 Mar 2029</w:t>
             </w:r>
           </w:p>
         </w:tc>
@@ -5319,7 +5319,7 @@
               <w:rPr>
                 <w:sz w:val="19"/>
               </w:rPr>
-              <w:t>22</w:t>
+              <w:t>21</w:t>
             </w:r>
           </w:p>
         </w:tc>
@@ -5335,7 +5335,7 @@
               <w:rPr>
                 <w:sz w:val="19"/>
               </w:rPr>
-              <w:t>NQR-E1100</w:t>
+              <w:t>NQR-P1020</w:t>
             </w:r>
           </w:p>
         </w:tc>
@@ -5349,7 +5349,7 @@
               <w:rPr>
                 <w:sz w:val="19"/>
               </w:rPr>
-              <w:t>IFC and shop drawings: SAR approval and release - Al Qurayyat</w:t>
+              <w:t>Manufacture video management servers, storage and video wall - Al Qurayyat</w:t>
             </w:r>
           </w:p>
         </w:tc>
@@ -5363,7 +5363,7 @@
               <w:rPr>
                 <w:sz w:val="19"/>
               </w:rPr>
-              <w:t>26 Oct 2028</w:t>
+              <w:t>19 Nov 2028</w:t>
             </w:r>
           </w:p>
         </w:tc>
@@ -5377,7 +5377,7 @@
               <w:rPr>
                 <w:sz w:val="19"/>
               </w:rPr>
-              <w:t>15 Nov 2028</w:t>
+              <w:t>04 Mar 2029</w:t>
             </w:r>
           </w:p>
         </w:tc>
@@ -5391,7 +5391,7 @@
               <w:rPr>
                 <w:sz w:val="19"/>
               </w:rPr>
-              <w:t>22</w:t>
+              <w:t>21</w:t>
             </w:r>
           </w:p>
         </w:tc>
@@ -5407,7 +5407,7 @@
               <w:rPr>
                 <w:sz w:val="19"/>
               </w:rPr>
-              <w:t>NQR-E1120</w:t>
+              <w:t>NQR-P1030</w:t>
             </w:r>
           </w:p>
         </w:tc>
@@ -5421,7 +5421,7 @@
               <w:rPr>
                 <w:sz w:val="19"/>
               </w:rPr>
-              <w:t>HCIS Stage 3 and 4 documents: SAR final review and HCIS submission - Al Qurayyat</w:t>
+              <w:t>Manufacture access control and intercom equipment - Al Qurayyat</w:t>
             </w:r>
           </w:p>
         </w:tc>
@@ -5435,7 +5435,7 @@
               <w:rPr>
                 <w:sz w:val="19"/>
               </w:rPr>
-              <w:t>26 Oct 2028</w:t>
+              <w:t>19 Nov 2028</w:t>
             </w:r>
           </w:p>
         </w:tc>
@@ -5449,7 +5449,7 @@
               <w:rPr>
                 <w:sz w:val="19"/>
               </w:rPr>
-              <w:t>15 Nov 2028</w:t>
+              <w:t>04 Mar 2029</w:t>
             </w:r>
           </w:p>
         </w:tc>
@@ -5463,7 +5463,7 @@
               <w:rPr>
                 <w:sz w:val="19"/>
               </w:rPr>
-              <w:t>22</w:t>
+              <w:t>21</w:t>
             </w:r>
           </w:p>
         </w:tc>
@@ -5479,7 +5479,7 @@
               <w:rPr>
                 <w:sz w:val="19"/>
               </w:rPr>
-              <w:t>NQR-P1010</w:t>
+              <w:t>NQR-P1040</w:t>
             </w:r>
           </w:p>
         </w:tc>
@@ -5493,7 +5493,7 @@
               <w:rPr>
                 <w:sz w:val="19"/>
               </w:rPr>
-              <w:t>Manufacture CCTV cameras and analytics - Al Qurayyat</w:t>
+              <w:t>Manufacture UPS, network switches and field cabinets - Al Qurayyat</w:t>
             </w:r>
           </w:p>
         </w:tc>
@@ -5507,7 +5507,7 @@
               <w:rPr>
                 <w:sz w:val="19"/>
               </w:rPr>
-              <w:t>16 Nov 2028</w:t>
+              <w:t>19 Nov 2028</w:t>
             </w:r>
           </w:p>
         </w:tc>
@@ -5521,7 +5521,7 @@
               <w:rPr>
                 <w:sz w:val="19"/>
               </w:rPr>
-              <w:t>01 Mar 2029</w:t>
+              <w:t>04 Mar 2029</w:t>
             </w:r>
           </w:p>
         </w:tc>
@@ -5535,7 +5535,7 @@
               <w:rPr>
                 <w:sz w:val="19"/>
               </w:rPr>
-              <w:t>22</w:t>
+              <w:t>21</w:t>
             </w:r>
           </w:p>
         </w:tc>
@@ -5551,7 +5551,7 @@
               <w:rPr>
                 <w:sz w:val="19"/>
               </w:rPr>
-              <w:t>NQR-P1020</w:t>
+              <w:t>NQR-P1050</w:t>
             </w:r>
           </w:p>
         </w:tc>
@@ -5565,7 +5565,7 @@
               <w:rPr>
                 <w:sz w:val="19"/>
               </w:rPr>
-              <w:t>Manufacture video management servers, storage and video wall - Al Qurayyat</w:t>
+              <w:t>Factory acceptance test at vendor premises - Al Qurayyat</w:t>
             </w:r>
           </w:p>
         </w:tc>
@@ -5579,7 +5579,7 @@
               <w:rPr>
                 <w:sz w:val="19"/>
               </w:rPr>
-              <w:t>16 Nov 2028</w:t>
+              <w:t>05 Mar 2029</w:t>
             </w:r>
           </w:p>
         </w:tc>
@@ -5593,7 +5593,7 @@
               <w:rPr>
                 <w:sz w:val="19"/>
               </w:rPr>
-              <w:t>01 Mar 2029</w:t>
+              <w:t>18 Mar 2029</w:t>
             </w:r>
           </w:p>
         </w:tc>
@@ -5607,7 +5607,7 @@
               <w:rPr>
                 <w:sz w:val="19"/>
               </w:rPr>
-              <w:t>22</w:t>
+              <w:t>21</w:t>
             </w:r>
           </w:p>
         </w:tc>
@@ -5623,7 +5623,7 @@
               <w:rPr>
                 <w:sz w:val="19"/>
               </w:rPr>
-              <w:t>NQR-P1030</w:t>
+              <w:t>NQR-P1060</w:t>
             </w:r>
           </w:p>
         </w:tc>
@@ -5637,7 +5637,7 @@
               <w:rPr>
                 <w:sz w:val="19"/>
               </w:rPr>
-              <w:t>Manufacture access control and intercom equipment - Al Qurayyat</w:t>
+              <w:t>Shipping and customs clearance - Al Qurayyat</w:t>
             </w:r>
           </w:p>
         </w:tc>
@@ -5651,7 +5651,7 @@
               <w:rPr>
                 <w:sz w:val="19"/>
               </w:rPr>
-              <w:t>16 Nov 2028</w:t>
+              <w:t>19 Mar 2029</w:t>
             </w:r>
           </w:p>
         </w:tc>
@@ -5665,7 +5665,7 @@
               <w:rPr>
                 <w:sz w:val="19"/>
               </w:rPr>
-              <w:t>01 Mar 2029</w:t>
+              <w:t>29 Apr 2029</w:t>
             </w:r>
           </w:p>
         </w:tc>
@@ -5679,7 +5679,7 @@
               <w:rPr>
                 <w:sz w:val="19"/>
               </w:rPr>
-              <w:t>22</w:t>
+              <w:t>21</w:t>
             </w:r>
           </w:p>
         </w:tc>
@@ -5695,7 +5695,7 @@
               <w:rPr>
                 <w:sz w:val="19"/>
               </w:rPr>
-              <w:t>NQR-P1040</w:t>
+              <w:t>NQR-P1070</w:t>
             </w:r>
           </w:p>
         </w:tc>
@@ -5709,7 +5709,7 @@
               <w:rPr>
                 <w:sz w:val="19"/>
               </w:rPr>
-              <w:t>Manufacture UPS, network switches and field cabinets - Al Qurayyat</w:t>
+              <w:t>Delivery to station and receiving inspection - Al Qurayyat</w:t>
             </w:r>
           </w:p>
         </w:tc>
@@ -5723,7 +5723,7 @@
               <w:rPr>
                 <w:sz w:val="19"/>
               </w:rPr>
-              <w:t>16 Nov 2028</w:t>
+              <w:t>30 Apr 2029</w:t>
             </w:r>
           </w:p>
         </w:tc>
@@ -5737,7 +5737,7 @@
               <w:rPr>
                 <w:sz w:val="19"/>
               </w:rPr>
-              <w:t>01 Mar 2029</w:t>
+              <w:t>06 May 2029</w:t>
             </w:r>
           </w:p>
         </w:tc>
@@ -5751,7 +5751,7 @@
               <w:rPr>
                 <w:sz w:val="19"/>
               </w:rPr>
-              <w:t>22</w:t>
+              <w:t>21</w:t>
             </w:r>
           </w:p>
         </w:tc>
@@ -5767,7 +5767,7 @@
               <w:rPr>
                 <w:sz w:val="19"/>
               </w:rPr>
-              <w:t>NQR-P1050</w:t>
+              <w:t>NQR-C2010</w:t>
             </w:r>
           </w:p>
         </w:tc>
@@ -5781,7 +5781,7 @@
               <w:rPr>
                 <w:sz w:val="19"/>
               </w:rPr>
-              <w:t>Factory acceptance test at vendor premises - Al Qurayyat</w:t>
+              <w:t>Install UPS, network switches and field cabinets - Al Qurayyat</w:t>
             </w:r>
           </w:p>
         </w:tc>
@@ -5795,7 +5795,7 @@
               <w:rPr>
                 <w:sz w:val="19"/>
               </w:rPr>
-              <w:t>04 Mar 2029</w:t>
+              <w:t>07 May 2029</w:t>
             </w:r>
           </w:p>
         </w:tc>
@@ -5809,7 +5809,7 @@
               <w:rPr>
                 <w:sz w:val="19"/>
               </w:rPr>
-              <w:t>15 Mar 2029</w:t>
+              <w:t>21 May 2029</w:t>
             </w:r>
           </w:p>
         </w:tc>
@@ -5823,7 +5823,7 @@
               <w:rPr>
                 <w:sz w:val="19"/>
               </w:rPr>
-              <w:t>22</w:t>
+              <w:t>21</w:t>
             </w:r>
           </w:p>
         </w:tc>

</xml_diff>

<commit_message>
Remove proof-of-concept activities from the baseline
Co-Authored-By: Claude Sonnet 5.5 <noreply@anthropic.com>
Claude-Session: https://claude.ai/code/session_01DZdGPWRxvKXCnMyT6qFPZb
</commit_message>
<xml_diff>
--- a/p6/0580_Schedule_Narrative.docx
+++ b/p6/0580_Schedule_Narrative.docx
@@ -67,7 +67,7 @@
         <w:rPr>
           <w:b w:val="0"/>
         </w:rPr>
-        <w:t>This narrative describes the baseline programme (Rev 1) of project 0580-Security Technology Salutation after eliminating Passenger Checking Roles, covering 14 stations on three railways (North South Railway, East West Railway and Haramain High Speed Rail). It is delivered as a Primavera P6 24 XER file with 601 activities (509 tasks and 92 milestones) and 927 logic links. It runs from the Notice to Proceed milestone on 01 Nov 2026 to the contract completion milestone on 31 Oct 2029.</w:t>
+        <w:t>This narrative describes the baseline programme (Rev 1) of project 0580-Security Technology Salutation after eliminating Passenger Checking Roles, covering 14 stations on three railways (North South Railway, East West Railway and Haramain High Speed Rail). It is delivered as a Primavera P6 24 XER file with 591 activities (500 tasks and 91 milestones) and 913 logic links. It runs from the Notice to Proceed milestone on 01 Nov 2026 to the contract completion milestone on 31 Oct 2029.</w:t>
       </w:r>
     </w:p>
     <w:p>
@@ -219,36 +219,6 @@
                 <w:sz w:val="19"/>
               </w:rPr>
               <w:t>Makkah and Riyadh (Thumamah) are Priority 1 and run works in parallel with design. Riyadh (Malaz) is Priority 2.</w:t>
-            </w:r>
-          </w:p>
-        </w:tc>
-      </w:tr>
-      <w:tr>
-        <w:tc>
-          <w:tcPr>
-            <w:tcW w:type="dxa" w:w="1984"/>
-          </w:tcPr>
-          <w:p>
-            <w:r/>
-            <w:r>
-              <w:rPr>
-                <w:sz w:val="19"/>
-              </w:rPr>
-              <w:t>Proof of concept</w:t>
-            </w:r>
-          </w:p>
-        </w:tc>
-        <w:tc>
-          <w:tcPr>
-            <w:tcW w:type="dxa" w:w="7087"/>
-          </w:tcPr>
-          <w:p>
-            <w:r/>
-            <w:r>
-              <w:rPr>
-                <w:sz w:val="19"/>
-              </w:rPr>
-              <w:t>POC at Riyadh (Thumamah) for CCTV, inspection and access control, and network, with one month for consultant inspection and approval.</w:t>
             </w:r>
           </w:p>
         </w:tc>
@@ -2135,853 +2105,6 @@
         <w:pStyle w:val="Heading1"/>
       </w:pPr>
       <w:r>
-        <w:t>6. Proof of concept at Riyadh (Thumamah)</w:t>
-      </w:r>
-    </w:p>
-    <w:p>
-      <w:r>
-        <w:rPr>
-          <w:b w:val="0"/>
-        </w:rPr>
-        <w:t>The POC covers three systems: CCTV, inspection and access control (Annex 3 section A3), and the network. It sits inside engineering because it validates the design before manufacture. SAR and the consultant approve the POC plan within 21 days, the Contractor builds and tests the POC, and the consultant then inspects and approves it within one month (22 working days: 10 for site inspection and 12 for approval). POC approval is a predecessor of the engineering approval milestone MS3 at this station, so manufacture of its equipment waits for it.</w:t>
-      </w:r>
-    </w:p>
-    <w:tbl>
-      <w:tblPr>
-        <w:tblStyle w:val="TableGrid"/>
-        <w:tblW w:type="auto" w:w="0"/>
-        <w:tblLayout w:type="fixed"/>
-        <w:tblLook w:firstColumn="1" w:firstRow="1" w:lastColumn="0" w:lastRow="0" w:noHBand="0" w:noVBand="1" w:val="04A0"/>
-      </w:tblPr>
-      <w:tblGrid>
-        <w:gridCol w:w="1587"/>
-        <w:gridCol w:w="4649"/>
-        <w:gridCol w:w="1304"/>
-        <w:gridCol w:w="1304"/>
-        <w:gridCol w:w="680"/>
-      </w:tblGrid>
-      <w:tr>
-        <w:tc>
-          <w:tcPr>
-            <w:tcW w:type="dxa" w:w="1587"/>
-            <w:shd w:val="clear" w:fill="00778B"/>
-          </w:tcPr>
-          <w:p>
-            <w:r/>
-            <w:r>
-              <w:rPr>
-                <w:b/>
-                <w:color w:val="FFFFFF"/>
-                <w:sz w:val="19"/>
-              </w:rPr>
-              <w:t>ID</w:t>
-            </w:r>
-          </w:p>
-        </w:tc>
-        <w:tc>
-          <w:tcPr>
-            <w:tcW w:type="dxa" w:w="4649"/>
-            <w:shd w:val="clear" w:fill="00778B"/>
-          </w:tcPr>
-          <w:p>
-            <w:r/>
-            <w:r>
-              <w:rPr>
-                <w:b/>
-                <w:color w:val="FFFFFF"/>
-                <w:sz w:val="19"/>
-              </w:rPr>
-              <w:t>Activity</w:t>
-            </w:r>
-          </w:p>
-        </w:tc>
-        <w:tc>
-          <w:tcPr>
-            <w:tcW w:type="dxa" w:w="1304"/>
-            <w:shd w:val="clear" w:fill="00778B"/>
-          </w:tcPr>
-          <w:p>
-            <w:r/>
-            <w:r>
-              <w:rPr>
-                <w:b/>
-                <w:color w:val="FFFFFF"/>
-                <w:sz w:val="19"/>
-              </w:rPr>
-              <w:t>Start</w:t>
-            </w:r>
-          </w:p>
-        </w:tc>
-        <w:tc>
-          <w:tcPr>
-            <w:tcW w:type="dxa" w:w="1304"/>
-            <w:shd w:val="clear" w:fill="00778B"/>
-          </w:tcPr>
-          <w:p>
-            <w:r/>
-            <w:r>
-              <w:rPr>
-                <w:b/>
-                <w:color w:val="FFFFFF"/>
-                <w:sz w:val="19"/>
-              </w:rPr>
-              <w:t>Finish</w:t>
-            </w:r>
-          </w:p>
-        </w:tc>
-        <w:tc>
-          <w:tcPr>
-            <w:tcW w:type="dxa" w:w="680"/>
-            <w:shd w:val="clear" w:fill="00778B"/>
-          </w:tcPr>
-          <w:p>
-            <w:r/>
-            <w:r>
-              <w:rPr>
-                <w:b/>
-                <w:color w:val="FFFFFF"/>
-                <w:sz w:val="19"/>
-              </w:rPr>
-              <w:t>Days</w:t>
-            </w:r>
-          </w:p>
-        </w:tc>
-      </w:tr>
-      <w:tr>
-        <w:tc>
-          <w:tcPr>
-            <w:tcW w:type="dxa" w:w="1587"/>
-          </w:tcPr>
-          <w:p>
-            <w:r/>
-            <w:r>
-              <w:rPr>
-                <w:sz w:val="19"/>
-              </w:rPr>
-              <w:t>NRY-POC1010</w:t>
-            </w:r>
-          </w:p>
-        </w:tc>
-        <w:tc>
-          <w:tcPr>
-            <w:tcW w:type="dxa" w:w="4649"/>
-          </w:tcPr>
-          <w:p>
-            <w:r/>
-            <w:r>
-              <w:rPr>
-                <w:sz w:val="19"/>
-              </w:rPr>
-              <w:t>POC plan and test procedure: submittal - Riyadh (Thumamah)</w:t>
-            </w:r>
-          </w:p>
-        </w:tc>
-        <w:tc>
-          <w:tcPr>
-            <w:tcW w:type="dxa" w:w="1304"/>
-          </w:tcPr>
-          <w:p>
-            <w:r/>
-            <w:r>
-              <w:rPr>
-                <w:sz w:val="19"/>
-              </w:rPr>
-              <w:t>03 Jan 2027</w:t>
-            </w:r>
-          </w:p>
-        </w:tc>
-        <w:tc>
-          <w:tcPr>
-            <w:tcW w:type="dxa" w:w="1304"/>
-          </w:tcPr>
-          <w:p>
-            <w:r/>
-            <w:r>
-              <w:rPr>
-                <w:sz w:val="19"/>
-              </w:rPr>
-              <w:t>07 Jan 2027</w:t>
-            </w:r>
-          </w:p>
-        </w:tc>
-        <w:tc>
-          <w:tcPr>
-            <w:tcW w:type="dxa" w:w="680"/>
-          </w:tcPr>
-          <w:p>
-            <w:r/>
-            <w:r>
-              <w:rPr>
-                <w:sz w:val="19"/>
-              </w:rPr>
-              <w:t>5</w:t>
-            </w:r>
-          </w:p>
-        </w:tc>
-      </w:tr>
-      <w:tr>
-        <w:tc>
-          <w:tcPr>
-            <w:tcW w:type="dxa" w:w="1587"/>
-          </w:tcPr>
-          <w:p>
-            <w:r/>
-            <w:r>
-              <w:rPr>
-                <w:sz w:val="19"/>
-              </w:rPr>
-              <w:t>NRY-POC1020</w:t>
-            </w:r>
-          </w:p>
-        </w:tc>
-        <w:tc>
-          <w:tcPr>
-            <w:tcW w:type="dxa" w:w="4649"/>
-          </w:tcPr>
-          <w:p>
-            <w:r/>
-            <w:r>
-              <w:rPr>
-                <w:sz w:val="19"/>
-              </w:rPr>
-              <w:t>POC plan: SAR and consultant review and approval (21 days) - Riyadh (Thumamah)</w:t>
-            </w:r>
-          </w:p>
-        </w:tc>
-        <w:tc>
-          <w:tcPr>
-            <w:tcW w:type="dxa" w:w="1304"/>
-          </w:tcPr>
-          <w:p>
-            <w:r/>
-            <w:r>
-              <w:rPr>
-                <w:sz w:val="19"/>
-              </w:rPr>
-              <w:t>10 Jan 2027</w:t>
-            </w:r>
-          </w:p>
-        </w:tc>
-        <w:tc>
-          <w:tcPr>
-            <w:tcW w:type="dxa" w:w="1304"/>
-          </w:tcPr>
-          <w:p>
-            <w:r/>
-            <w:r>
-              <w:rPr>
-                <w:sz w:val="19"/>
-              </w:rPr>
-              <w:t>28 Jan 2027</w:t>
-            </w:r>
-          </w:p>
-        </w:tc>
-        <w:tc>
-          <w:tcPr>
-            <w:tcW w:type="dxa" w:w="680"/>
-          </w:tcPr>
-          <w:p>
-            <w:r/>
-            <w:r>
-              <w:rPr>
-                <w:sz w:val="19"/>
-              </w:rPr>
-              <w:t>15</w:t>
-            </w:r>
-          </w:p>
-        </w:tc>
-      </w:tr>
-      <w:tr>
-        <w:tc>
-          <w:tcPr>
-            <w:tcW w:type="dxa" w:w="1587"/>
-          </w:tcPr>
-          <w:p>
-            <w:r/>
-            <w:r>
-              <w:rPr>
-                <w:sz w:val="19"/>
-              </w:rPr>
-              <w:t>NRY-POC2010</w:t>
-            </w:r>
-          </w:p>
-        </w:tc>
-        <w:tc>
-          <w:tcPr>
-            <w:tcW w:type="dxa" w:w="4649"/>
-          </w:tcPr>
-          <w:p>
-            <w:r/>
-            <w:r>
-              <w:rPr>
-                <w:sz w:val="19"/>
-              </w:rPr>
-              <w:t>POC network: install test bed and fibre/IP backbone - Riyadh (Thumamah)</w:t>
-            </w:r>
-          </w:p>
-        </w:tc>
-        <w:tc>
-          <w:tcPr>
-            <w:tcW w:type="dxa" w:w="1304"/>
-          </w:tcPr>
-          <w:p>
-            <w:r/>
-            <w:r>
-              <w:rPr>
-                <w:sz w:val="19"/>
-              </w:rPr>
-              <w:t>31 Jan 2027</w:t>
-            </w:r>
-          </w:p>
-        </w:tc>
-        <w:tc>
-          <w:tcPr>
-            <w:tcW w:type="dxa" w:w="1304"/>
-          </w:tcPr>
-          <w:p>
-            <w:r/>
-            <w:r>
-              <w:rPr>
-                <w:sz w:val="19"/>
-              </w:rPr>
-              <w:t>09 Feb 2027</w:t>
-            </w:r>
-          </w:p>
-        </w:tc>
-        <w:tc>
-          <w:tcPr>
-            <w:tcW w:type="dxa" w:w="680"/>
-          </w:tcPr>
-          <w:p>
-            <w:r/>
-            <w:r>
-              <w:rPr>
-                <w:sz w:val="19"/>
-              </w:rPr>
-              <w:t>8</w:t>
-            </w:r>
-          </w:p>
-        </w:tc>
-      </w:tr>
-      <w:tr>
-        <w:tc>
-          <w:tcPr>
-            <w:tcW w:type="dxa" w:w="1587"/>
-          </w:tcPr>
-          <w:p>
-            <w:r/>
-            <w:r>
-              <w:rPr>
-                <w:sz w:val="19"/>
-              </w:rPr>
-              <w:t>NRY-POC2020</w:t>
-            </w:r>
-          </w:p>
-        </w:tc>
-        <w:tc>
-          <w:tcPr>
-            <w:tcW w:type="dxa" w:w="4649"/>
-          </w:tcPr>
-          <w:p>
-            <w:r/>
-            <w:r>
-              <w:rPr>
-                <w:sz w:val="19"/>
-              </w:rPr>
-              <w:t>POC CCTV: install and configure demonstration cameras and analytics - Riyadh (Thumamah)</w:t>
-            </w:r>
-          </w:p>
-        </w:tc>
-        <w:tc>
-          <w:tcPr>
-            <w:tcW w:type="dxa" w:w="1304"/>
-          </w:tcPr>
-          <w:p>
-            <w:r/>
-            <w:r>
-              <w:rPr>
-                <w:sz w:val="19"/>
-              </w:rPr>
-              <w:t>10 Feb 2027</w:t>
-            </w:r>
-          </w:p>
-        </w:tc>
-        <w:tc>
-          <w:tcPr>
-            <w:tcW w:type="dxa" w:w="1304"/>
-          </w:tcPr>
-          <w:p>
-            <w:r/>
-            <w:r>
-              <w:rPr>
-                <w:sz w:val="19"/>
-              </w:rPr>
-              <w:t>28 Feb 2027</w:t>
-            </w:r>
-          </w:p>
-        </w:tc>
-        <w:tc>
-          <w:tcPr>
-            <w:tcW w:type="dxa" w:w="680"/>
-          </w:tcPr>
-          <w:p>
-            <w:r/>
-            <w:r>
-              <w:rPr>
-                <w:sz w:val="19"/>
-              </w:rPr>
-              <w:t>12</w:t>
-            </w:r>
-          </w:p>
-        </w:tc>
-      </w:tr>
-      <w:tr>
-        <w:tc>
-          <w:tcPr>
-            <w:tcW w:type="dxa" w:w="1587"/>
-          </w:tcPr>
-          <w:p>
-            <w:r/>
-            <w:r>
-              <w:rPr>
-                <w:sz w:val="19"/>
-              </w:rPr>
-              <w:t>NRY-POC2030</w:t>
-            </w:r>
-          </w:p>
-        </w:tc>
-        <w:tc>
-          <w:tcPr>
-            <w:tcW w:type="dxa" w:w="4649"/>
-          </w:tcPr>
-          <w:p>
-            <w:r/>
-            <w:r>
-              <w:rPr>
-                <w:sz w:val="19"/>
-              </w:rPr>
-              <w:t>POC inspection and access control: install and configure demonstration points - Riyadh (Thumamah)</w:t>
-            </w:r>
-          </w:p>
-        </w:tc>
-        <w:tc>
-          <w:tcPr>
-            <w:tcW w:type="dxa" w:w="1304"/>
-          </w:tcPr>
-          <w:p>
-            <w:r/>
-            <w:r>
-              <w:rPr>
-                <w:sz w:val="19"/>
-              </w:rPr>
-              <w:t>10 Feb 2027</w:t>
-            </w:r>
-          </w:p>
-        </w:tc>
-        <w:tc>
-          <w:tcPr>
-            <w:tcW w:type="dxa" w:w="1304"/>
-          </w:tcPr>
-          <w:p>
-            <w:r/>
-            <w:r>
-              <w:rPr>
-                <w:sz w:val="19"/>
-              </w:rPr>
-              <w:t>28 Feb 2027</w:t>
-            </w:r>
-          </w:p>
-        </w:tc>
-        <w:tc>
-          <w:tcPr>
-            <w:tcW w:type="dxa" w:w="680"/>
-          </w:tcPr>
-          <w:p>
-            <w:r/>
-            <w:r>
-              <w:rPr>
-                <w:sz w:val="19"/>
-              </w:rPr>
-              <w:t>12</w:t>
-            </w:r>
-          </w:p>
-        </w:tc>
-      </w:tr>
-      <w:tr>
-        <w:tc>
-          <w:tcPr>
-            <w:tcW w:type="dxa" w:w="1587"/>
-          </w:tcPr>
-          <w:p>
-            <w:r/>
-            <w:r>
-              <w:rPr>
-                <w:sz w:val="19"/>
-              </w:rPr>
-              <w:t>NRY-POC3010</w:t>
-            </w:r>
-          </w:p>
-        </w:tc>
-        <w:tc>
-          <w:tcPr>
-            <w:tcW w:type="dxa" w:w="4649"/>
-          </w:tcPr>
-          <w:p>
-            <w:r/>
-            <w:r>
-              <w:rPr>
-                <w:sz w:val="19"/>
-              </w:rPr>
-              <w:t>POC integrated testing and demonstration (cameras, inspection, network) - Riyadh (Thumamah)</w:t>
-            </w:r>
-          </w:p>
-        </w:tc>
-        <w:tc>
-          <w:tcPr>
-            <w:tcW w:type="dxa" w:w="1304"/>
-          </w:tcPr>
-          <w:p>
-            <w:r/>
-            <w:r>
-              <w:rPr>
-                <w:sz w:val="19"/>
-              </w:rPr>
-              <w:t>01 Mar 2027</w:t>
-            </w:r>
-          </w:p>
-        </w:tc>
-        <w:tc>
-          <w:tcPr>
-            <w:tcW w:type="dxa" w:w="1304"/>
-          </w:tcPr>
-          <w:p>
-            <w:r/>
-            <w:r>
-              <w:rPr>
-                <w:sz w:val="19"/>
-              </w:rPr>
-              <w:t>17 Mar 2027</w:t>
-            </w:r>
-          </w:p>
-        </w:tc>
-        <w:tc>
-          <w:tcPr>
-            <w:tcW w:type="dxa" w:w="680"/>
-          </w:tcPr>
-          <w:p>
-            <w:r/>
-            <w:r>
-              <w:rPr>
-                <w:sz w:val="19"/>
-              </w:rPr>
-              <w:t>8</w:t>
-            </w:r>
-          </w:p>
-        </w:tc>
-      </w:tr>
-      <w:tr>
-        <w:tc>
-          <w:tcPr>
-            <w:tcW w:type="dxa" w:w="1587"/>
-          </w:tcPr>
-          <w:p>
-            <w:r/>
-            <w:r>
-              <w:rPr>
-                <w:sz w:val="19"/>
-              </w:rPr>
-              <w:t>NRY-POC3020</w:t>
-            </w:r>
-          </w:p>
-        </w:tc>
-        <w:tc>
-          <w:tcPr>
-            <w:tcW w:type="dxa" w:w="4649"/>
-          </w:tcPr>
-          <w:p>
-            <w:r/>
-            <w:r>
-              <w:rPr>
-                <w:sz w:val="19"/>
-              </w:rPr>
-              <w:t>POC test report: submittal - Riyadh (Thumamah)</w:t>
-            </w:r>
-          </w:p>
-        </w:tc>
-        <w:tc>
-          <w:tcPr>
-            <w:tcW w:type="dxa" w:w="1304"/>
-          </w:tcPr>
-          <w:p>
-            <w:r/>
-            <w:r>
-              <w:rPr>
-                <w:sz w:val="19"/>
-              </w:rPr>
-              <w:t>18 Mar 2027</w:t>
-            </w:r>
-          </w:p>
-        </w:tc>
-        <w:tc>
-          <w:tcPr>
-            <w:tcW w:type="dxa" w:w="1304"/>
-          </w:tcPr>
-          <w:p>
-            <w:r/>
-            <w:r>
-              <w:rPr>
-                <w:sz w:val="19"/>
-              </w:rPr>
-              <w:t>24 Mar 2027</w:t>
-            </w:r>
-          </w:p>
-        </w:tc>
-        <w:tc>
-          <w:tcPr>
-            <w:tcW w:type="dxa" w:w="680"/>
-          </w:tcPr>
-          <w:p>
-            <w:r/>
-            <w:r>
-              <w:rPr>
-                <w:sz w:val="19"/>
-              </w:rPr>
-              <w:t>5</w:t>
-            </w:r>
-          </w:p>
-        </w:tc>
-      </w:tr>
-      <w:tr>
-        <w:tc>
-          <w:tcPr>
-            <w:tcW w:type="dxa" w:w="1587"/>
-          </w:tcPr>
-          <w:p>
-            <w:r/>
-            <w:r>
-              <w:rPr>
-                <w:sz w:val="19"/>
-              </w:rPr>
-              <w:t>NRY-POC4010</w:t>
-            </w:r>
-          </w:p>
-        </w:tc>
-        <w:tc>
-          <w:tcPr>
-            <w:tcW w:type="dxa" w:w="4649"/>
-          </w:tcPr>
-          <w:p>
-            <w:r/>
-            <w:r>
-              <w:rPr>
-                <w:sz w:val="19"/>
-              </w:rPr>
-              <w:t>POC site inspection and witnessing with consultant - Riyadh (Thumamah)</w:t>
-            </w:r>
-          </w:p>
-        </w:tc>
-        <w:tc>
-          <w:tcPr>
-            <w:tcW w:type="dxa" w:w="1304"/>
-          </w:tcPr>
-          <w:p>
-            <w:r/>
-            <w:r>
-              <w:rPr>
-                <w:sz w:val="19"/>
-              </w:rPr>
-              <w:t>25 Mar 2027</w:t>
-            </w:r>
-          </w:p>
-        </w:tc>
-        <w:tc>
-          <w:tcPr>
-            <w:tcW w:type="dxa" w:w="1304"/>
-          </w:tcPr>
-          <w:p>
-            <w:r/>
-            <w:r>
-              <w:rPr>
-                <w:sz w:val="19"/>
-              </w:rPr>
-              <w:t>07 Apr 2027</w:t>
-            </w:r>
-          </w:p>
-        </w:tc>
-        <w:tc>
-          <w:tcPr>
-            <w:tcW w:type="dxa" w:w="680"/>
-          </w:tcPr>
-          <w:p>
-            <w:r/>
-            <w:r>
-              <w:rPr>
-                <w:sz w:val="19"/>
-              </w:rPr>
-              <w:t>10</w:t>
-            </w:r>
-          </w:p>
-        </w:tc>
-      </w:tr>
-      <w:tr>
-        <w:tc>
-          <w:tcPr>
-            <w:tcW w:type="dxa" w:w="1587"/>
-          </w:tcPr>
-          <w:p>
-            <w:r/>
-            <w:r>
-              <w:rPr>
-                <w:sz w:val="19"/>
-              </w:rPr>
-              <w:t>NRY-POC4020</w:t>
-            </w:r>
-          </w:p>
-        </w:tc>
-        <w:tc>
-          <w:tcPr>
-            <w:tcW w:type="dxa" w:w="4649"/>
-          </w:tcPr>
-          <w:p>
-            <w:r/>
-            <w:r>
-              <w:rPr>
-                <w:sz w:val="19"/>
-              </w:rPr>
-              <w:t>POC approval by SAR and consultant (inspection and approval within one month) - Riyadh (Thumamah)</w:t>
-            </w:r>
-          </w:p>
-        </w:tc>
-        <w:tc>
-          <w:tcPr>
-            <w:tcW w:type="dxa" w:w="1304"/>
-          </w:tcPr>
-          <w:p>
-            <w:r/>
-            <w:r>
-              <w:rPr>
-                <w:sz w:val="19"/>
-              </w:rPr>
-              <w:t>08 Apr 2027</w:t>
-            </w:r>
-          </w:p>
-        </w:tc>
-        <w:tc>
-          <w:tcPr>
-            <w:tcW w:type="dxa" w:w="1304"/>
-          </w:tcPr>
-          <w:p>
-            <w:r/>
-            <w:r>
-              <w:rPr>
-                <w:sz w:val="19"/>
-              </w:rPr>
-              <w:t>25 Apr 2027</w:t>
-            </w:r>
-          </w:p>
-        </w:tc>
-        <w:tc>
-          <w:tcPr>
-            <w:tcW w:type="dxa" w:w="680"/>
-          </w:tcPr>
-          <w:p>
-            <w:r/>
-            <w:r>
-              <w:rPr>
-                <w:sz w:val="19"/>
-              </w:rPr>
-              <w:t>12</w:t>
-            </w:r>
-          </w:p>
-        </w:tc>
-      </w:tr>
-      <w:tr>
-        <w:tc>
-          <w:tcPr>
-            <w:tcW w:type="dxa" w:w="1587"/>
-          </w:tcPr>
-          <w:p>
-            <w:r/>
-            <w:r>
-              <w:rPr>
-                <w:sz w:val="19"/>
-              </w:rPr>
-              <w:t>NRY-POC4100</w:t>
-            </w:r>
-          </w:p>
-        </w:tc>
-        <w:tc>
-          <w:tcPr>
-            <w:tcW w:type="dxa" w:w="4649"/>
-          </w:tcPr>
-          <w:p>
-            <w:r/>
-            <w:r>
-              <w:rPr>
-                <w:sz w:val="19"/>
-              </w:rPr>
-              <w:t>POC approved - Riyadh (Thumamah)</w:t>
-            </w:r>
-          </w:p>
-        </w:tc>
-        <w:tc>
-          <w:tcPr>
-            <w:tcW w:type="dxa" w:w="1304"/>
-          </w:tcPr>
-          <w:p>
-            <w:r/>
-            <w:r>
-              <w:rPr>
-                <w:sz w:val="19"/>
-              </w:rPr>
-              <w:t>26 Apr 2027</w:t>
-            </w:r>
-          </w:p>
-        </w:tc>
-        <w:tc>
-          <w:tcPr>
-            <w:tcW w:type="dxa" w:w="1304"/>
-          </w:tcPr>
-          <w:p>
-            <w:r/>
-            <w:r>
-              <w:rPr>
-                <w:sz w:val="19"/>
-              </w:rPr>
-              <w:t>25 Apr 2027</w:t>
-            </w:r>
-          </w:p>
-        </w:tc>
-        <w:tc>
-          <w:tcPr>
-            <w:tcW w:type="dxa" w:w="680"/>
-          </w:tcPr>
-          <w:p>
-            <w:r/>
-            <w:r>
-              <w:rPr>
-                <w:sz w:val="19"/>
-              </w:rPr>
-              <w:t>0</w:t>
-            </w:r>
-          </w:p>
-        </w:tc>
-      </w:tr>
-    </w:tbl>
-    <w:p/>
-    <w:p>
-      <w:r>
-        <w:rPr>
-          <w:b w:val="0"/>
-        </w:rPr>
-        <w:t>Cost note: Annex 3 has no separate POC item. The POC activities are funded from 15% of the Riyadh (Thumamah) design and engineering milestones (MS2 and MS3) until SAR confirms otherwise.</w:t>
-      </w:r>
-    </w:p>
-    <w:p>
-      <w:pPr>
-        <w:pStyle w:val="Heading1"/>
-      </w:pPr>
-      <w:r>
         <w:t>7. Review and approval periods</w:t>
       </w:r>
     </w:p>
@@ -2998,7 +2121,7 @@
         <w:rPr>
           <w:b w:val="0"/>
         </w:rPr>
-        <w:t>105 approval activities are loaded. Their durations: 10 days x 1, 12 days x 1, 15 days x 101, 22 days x 1, 45 days x 1 (working days).</w:t>
+        <w:t>102 approval activities are loaded. Their durations: 15 days x 100, 22 days x 1, 45 days x 1 (working days).</w:t>
       </w:r>
     </w:p>
     <w:p>
@@ -3633,7 +2756,7 @@
         <w:rPr>
           <w:b w:val="0"/>
         </w:rPr>
-        <w:t>The WBS follows EPC. Level 1 is the project (0580), level 2 the EPC phase (Engineering, Procurement, Construction, Commissioning and handover, plus Project management), level 3 the station, level 4 the design stage or work package (enabling works, civil, installation, POC), and level 5 the submittal, approval or area. There are 520 nodes. The survey access permits sit under Project management and mobilization, in the Mobilization branch (one node per station). Levels 6 to 8 are not used because the contract gives no zone-level data; they can be added when it does.</w:t>
+        <w:t>The WBS follows EPC. Level 1 is the project (0580), level 2 the EPC phase (Engineering, Procurement, Construction, Commissioning and handover, plus Project management), level 3 the station, level 4 the design stage or work package (enabling works, civil, installation, POC), and level 5 the submittal, approval or area. There are 514 nodes. The survey access permits sit under Project management and mobilization, in the Mobilization branch (one node per station). Levels 6 to 8 are not used because the contract gives no zone-level data; they can be added when it does.</w:t>
       </w:r>
     </w:p>
     <w:tbl>
@@ -3798,7 +2921,7 @@
               <w:rPr>
                 <w:sz w:val="19"/>
               </w:rPr>
-              <w:t>254</w:t>
+              <w:t>253</w:t>
             </w:r>
           </w:p>
         </w:tc>
@@ -3828,7 +2951,7 @@
               <w:rPr>
                 <w:sz w:val="19"/>
               </w:rPr>
-              <w:t>201</w:t>
+              <w:t>196</w:t>
             </w:r>
           </w:p>
         </w:tc>
@@ -6876,7 +5999,7 @@
         <w:pStyle w:val="ListBullet"/>
       </w:pPr>
       <w:r>
-        <w:t>Confirm the priority order and the POC scope with SAR.</w:t>
+        <w:t>Confirm the priority order with SAR.</w:t>
       </w:r>
     </w:p>
     <w:p>

</xml_diff>

<commit_message>
Durations driven by BOQ quantities per station (cameras, equipment SAR, civil SAR)
Co-Authored-By: Claude Sonnet 5.5 <noreply@anthropic.com>
Claude-Session: https://claude.ai/code/session_01DZdGPWRxvKXCnMyT6qFPZb
</commit_message>
<xml_diff>
--- a/p6/0580_Schedule_Narrative.docx
+++ b/p6/0580_Schedule_Narrative.docx
@@ -559,7 +559,7 @@
               <w:rPr>
                 <w:sz w:val="19"/>
               </w:rPr>
-              <w:t>21 Mar 2027</w:t>
+              <w:t>28 Mar 2027</w:t>
             </w:r>
           </w:p>
         </w:tc>
@@ -1157,7 +1157,7 @@
               <w:rPr>
                 <w:sz w:val="19"/>
               </w:rPr>
-              <w:t>07 Feb 2028</w:t>
+              <w:t>24 Jan 2028</w:t>
             </w:r>
           </w:p>
         </w:tc>
@@ -1229,7 +1229,7 @@
               <w:rPr>
                 <w:sz w:val="19"/>
               </w:rPr>
-              <w:t>07 Aug 2028</w:t>
+              <w:t>27 Jun 2028</w:t>
             </w:r>
           </w:p>
         </w:tc>
@@ -1301,7 +1301,7 @@
               <w:rPr>
                 <w:sz w:val="19"/>
               </w:rPr>
-              <w:t>30 Jan 2028</w:t>
+              <w:t>05 Jan 2028</w:t>
             </w:r>
           </w:p>
         </w:tc>
@@ -1359,7 +1359,7 @@
               <w:rPr>
                 <w:sz w:val="19"/>
               </w:rPr>
-              <w:t>22 Mar 2027</w:t>
+              <w:t>29 Mar 2027</w:t>
             </w:r>
           </w:p>
         </w:tc>
@@ -1373,7 +1373,7 @@
               <w:rPr>
                 <w:sz w:val="19"/>
               </w:rPr>
-              <w:t>28 Sep 2028</w:t>
+              <w:t>23 Aug 2028</w:t>
             </w:r>
           </w:p>
         </w:tc>
@@ -1431,7 +1431,7 @@
               <w:rPr>
                 <w:sz w:val="19"/>
               </w:rPr>
-              <w:t>08 Jun 2027</w:t>
+              <w:t>17 Jun 2027</w:t>
             </w:r>
           </w:p>
         </w:tc>
@@ -1445,7 +1445,7 @@
               <w:rPr>
                 <w:sz w:val="19"/>
               </w:rPr>
-              <w:t>27 Jul 2028</w:t>
+              <w:t>27 Jun 2028</w:t>
             </w:r>
           </w:p>
         </w:tc>
@@ -1503,7 +1503,7 @@
               <w:rPr>
                 <w:sz w:val="19"/>
               </w:rPr>
-              <w:t>28 Jul 2027</w:t>
+              <w:t>10 Aug 2027</w:t>
             </w:r>
           </w:p>
         </w:tc>
@@ -1517,7 +1517,7 @@
               <w:rPr>
                 <w:sz w:val="19"/>
               </w:rPr>
-              <w:t>24 Sep 2028</w:t>
+              <w:t>10 Sep 2028</w:t>
             </w:r>
           </w:p>
         </w:tc>
@@ -1575,7 +1575,7 @@
               <w:rPr>
                 <w:sz w:val="19"/>
               </w:rPr>
-              <w:t>28 Jul 2027</w:t>
+              <w:t>10 Aug 2027</w:t>
             </w:r>
           </w:p>
         </w:tc>
@@ -1589,7 +1589,7 @@
               <w:rPr>
                 <w:sz w:val="19"/>
               </w:rPr>
-              <w:t>14 Sep 2028</w:t>
+              <w:t>16 Aug 2028</w:t>
             </w:r>
           </w:p>
         </w:tc>
@@ -1647,7 +1647,7 @@
               <w:rPr>
                 <w:sz w:val="19"/>
               </w:rPr>
-              <w:t>13 Sep 2027</w:t>
+              <w:t>28 Sep 2027</w:t>
             </w:r>
           </w:p>
         </w:tc>
@@ -1661,7 +1661,7 @@
               <w:rPr>
                 <w:sz w:val="19"/>
               </w:rPr>
-              <w:t>09 Nov 2028</w:t>
+              <w:t>29 Oct 2028</w:t>
             </w:r>
           </w:p>
         </w:tc>
@@ -1719,7 +1719,7 @@
               <w:rPr>
                 <w:sz w:val="19"/>
               </w:rPr>
-              <w:t>05 Jan 2028</w:t>
+              <w:t>25 Jan 2028</w:t>
             </w:r>
           </w:p>
         </w:tc>
@@ -1733,7 +1733,7 @@
               <w:rPr>
                 <w:sz w:val="19"/>
               </w:rPr>
-              <w:t>11 Jun 2029</w:t>
+              <w:t>03 May 2029</w:t>
             </w:r>
           </w:p>
         </w:tc>
@@ -1791,7 +1791,7 @@
               <w:rPr>
                 <w:sz w:val="19"/>
               </w:rPr>
-              <w:t>05 Jan 2028</w:t>
+              <w:t>25 Jan 2028</w:t>
             </w:r>
           </w:p>
         </w:tc>
@@ -1805,7 +1805,7 @@
               <w:rPr>
                 <w:sz w:val="19"/>
               </w:rPr>
-              <w:t>17 Jun 2029</w:t>
+              <w:t>09 May 2029</w:t>
             </w:r>
           </w:p>
         </w:tc>
@@ -1863,7 +1863,7 @@
               <w:rPr>
                 <w:sz w:val="19"/>
               </w:rPr>
-              <w:t>27 Feb 2028</w:t>
+              <w:t>20 Mar 2028</w:t>
             </w:r>
           </w:p>
         </w:tc>
@@ -1877,7 +1877,7 @@
               <w:rPr>
                 <w:sz w:val="19"/>
               </w:rPr>
-              <w:t>04 Apr 2029</w:t>
+              <w:t>01 Mar 2029</w:t>
             </w:r>
           </w:p>
         </w:tc>
@@ -1935,7 +1935,7 @@
               <w:rPr>
                 <w:sz w:val="19"/>
               </w:rPr>
-              <w:t>20 Mar 2028</w:t>
+              <w:t>12 Apr 2028</w:t>
             </w:r>
           </w:p>
         </w:tc>
@@ -1949,7 +1949,7 @@
               <w:rPr>
                 <w:sz w:val="19"/>
               </w:rPr>
-              <w:t>20 May 2029</w:t>
+              <w:t>14 May 2029</w:t>
             </w:r>
           </w:p>
         </w:tc>
@@ -2007,7 +2007,7 @@
               <w:rPr>
                 <w:sz w:val="19"/>
               </w:rPr>
-              <w:t>04 Jun 2028</w:t>
+              <w:t>29 Jun 2028</w:t>
             </w:r>
           </w:p>
         </w:tc>
@@ -2021,7 +2021,7 @@
               <w:rPr>
                 <w:sz w:val="19"/>
               </w:rPr>
-              <w:t>02 Aug 2029</w:t>
+              <w:t>30 Jul 2029</w:t>
             </w:r>
           </w:p>
         </w:tc>
@@ -2079,7 +2079,7 @@
               <w:rPr>
                 <w:sz w:val="19"/>
               </w:rPr>
-              <w:t>18 Jul 2028</w:t>
+              <w:t>16 Aug 2028</w:t>
             </w:r>
           </w:p>
         </w:tc>
@@ -2094,6 +2094,2203 @@
                 <w:sz w:val="19"/>
               </w:rPr>
               <w:t>17 Sep 2029</w:t>
+            </w:r>
+          </w:p>
+        </w:tc>
+      </w:tr>
+    </w:tbl>
+    <w:p/>
+    <w:p>
+      <w:pPr>
+        <w:pStyle w:val="Heading1"/>
+      </w:pPr>
+      <w:r>
+        <w:t>6. Activity durations from station quantities</w:t>
+      </w:r>
+    </w:p>
+    <w:p>
+      <w:r>
+        <w:rPr>
+          <w:b w:val="0"/>
+        </w:rPr>
+        <w:t>Durations are driven by the BOQ quantities of each station (Annex 3), in working days (Sunday to Thursday). Survey: 5 days plus 1 day per 30 cameras. Design is fixed at four calendar months for every station, survey included. Manufacture lead time: 40 days plus 1 day per SAR 100,000 of equipment (cameras, VMS, access control, UPS and network), capped at 100. Shipping and customs: 20 days plus 1 day per SAR 250,000 of equipment. Civil works: 20 days plus 1 day per SAR 12,000 of civil works. Installation: 15 days plus 3 cameras per crew per day, with 1 crew below 150 cameras, 2 crews up to 349 and 3 crews from 350. SAT: 10 days plus 1 day per 30 cameras. Training 10 days, trial operation 30 days and taking over 15 days are fixed. The productivity rates are Contractor planning assumptions.</w:t>
+      </w:r>
+    </w:p>
+    <w:tbl>
+      <w:tblPr>
+        <w:tblStyle w:val="TableGrid"/>
+        <w:tblW w:type="auto" w:w="0"/>
+        <w:tblLayout w:type="fixed"/>
+        <w:tblLook w:firstColumn="1" w:firstRow="1" w:lastColumn="0" w:lastRow="0" w:noHBand="0" w:noVBand="1" w:val="04A0"/>
+      </w:tblPr>
+      <w:tblGrid>
+        <w:gridCol w:w="2041"/>
+        <w:gridCol w:w="850"/>
+        <w:gridCol w:w="964"/>
+        <w:gridCol w:w="964"/>
+        <w:gridCol w:w="794"/>
+        <w:gridCol w:w="794"/>
+        <w:gridCol w:w="680"/>
+        <w:gridCol w:w="680"/>
+        <w:gridCol w:w="794"/>
+        <w:gridCol w:w="680"/>
+      </w:tblGrid>
+      <w:tr>
+        <w:tc>
+          <w:tcPr>
+            <w:tcW w:type="dxa" w:w="2041"/>
+            <w:shd w:val="clear" w:fill="00778B"/>
+          </w:tcPr>
+          <w:p>
+            <w:r/>
+            <w:r>
+              <w:rPr>
+                <w:b/>
+                <w:color w:val="FFFFFF"/>
+                <w:sz w:val="19"/>
+              </w:rPr>
+              <w:t>Station</w:t>
+            </w:r>
+          </w:p>
+        </w:tc>
+        <w:tc>
+          <w:tcPr>
+            <w:tcW w:type="dxa" w:w="850"/>
+            <w:shd w:val="clear" w:fill="00778B"/>
+          </w:tcPr>
+          <w:p>
+            <w:r/>
+            <w:r>
+              <w:rPr>
+                <w:b/>
+                <w:color w:val="FFFFFF"/>
+                <w:sz w:val="19"/>
+              </w:rPr>
+              <w:t>Cameras</w:t>
+            </w:r>
+          </w:p>
+        </w:tc>
+        <w:tc>
+          <w:tcPr>
+            <w:tcW w:type="dxa" w:w="964"/>
+            <w:shd w:val="clear" w:fill="00778B"/>
+          </w:tcPr>
+          <w:p>
+            <w:r/>
+            <w:r>
+              <w:rPr>
+                <w:b/>
+                <w:color w:val="FFFFFF"/>
+                <w:sz w:val="19"/>
+              </w:rPr>
+              <w:t>Equip. SAR M</w:t>
+            </w:r>
+          </w:p>
+        </w:tc>
+        <w:tc>
+          <w:tcPr>
+            <w:tcW w:type="dxa" w:w="964"/>
+            <w:shd w:val="clear" w:fill="00778B"/>
+          </w:tcPr>
+          <w:p>
+            <w:r/>
+            <w:r>
+              <w:rPr>
+                <w:b/>
+                <w:color w:val="FFFFFF"/>
+                <w:sz w:val="19"/>
+              </w:rPr>
+              <w:t>Civil SAR M</w:t>
+            </w:r>
+          </w:p>
+        </w:tc>
+        <w:tc>
+          <w:tcPr>
+            <w:tcW w:type="dxa" w:w="794"/>
+            <w:shd w:val="clear" w:fill="00778B"/>
+          </w:tcPr>
+          <w:p>
+            <w:r/>
+            <w:r>
+              <w:rPr>
+                <w:b/>
+                <w:color w:val="FFFFFF"/>
+                <w:sz w:val="19"/>
+              </w:rPr>
+              <w:t>Survey</w:t>
+            </w:r>
+          </w:p>
+        </w:tc>
+        <w:tc>
+          <w:tcPr>
+            <w:tcW w:type="dxa" w:w="794"/>
+            <w:shd w:val="clear" w:fill="00778B"/>
+          </w:tcPr>
+          <w:p>
+            <w:r/>
+            <w:r>
+              <w:rPr>
+                <w:b/>
+                <w:color w:val="FFFFFF"/>
+                <w:sz w:val="19"/>
+              </w:rPr>
+              <w:t>Manuf.</w:t>
+            </w:r>
+          </w:p>
+        </w:tc>
+        <w:tc>
+          <w:tcPr>
+            <w:tcW w:type="dxa" w:w="680"/>
+            <w:shd w:val="clear" w:fill="00778B"/>
+          </w:tcPr>
+          <w:p>
+            <w:r/>
+            <w:r>
+              <w:rPr>
+                <w:b/>
+                <w:color w:val="FFFFFF"/>
+                <w:sz w:val="19"/>
+              </w:rPr>
+              <w:t>Ship</w:t>
+            </w:r>
+          </w:p>
+        </w:tc>
+        <w:tc>
+          <w:tcPr>
+            <w:tcW w:type="dxa" w:w="680"/>
+            <w:shd w:val="clear" w:fill="00778B"/>
+          </w:tcPr>
+          <w:p>
+            <w:r/>
+            <w:r>
+              <w:rPr>
+                <w:b/>
+                <w:color w:val="FFFFFF"/>
+                <w:sz w:val="19"/>
+              </w:rPr>
+              <w:t>Civil</w:t>
+            </w:r>
+          </w:p>
+        </w:tc>
+        <w:tc>
+          <w:tcPr>
+            <w:tcW w:type="dxa" w:w="794"/>
+            <w:shd w:val="clear" w:fill="00778B"/>
+          </w:tcPr>
+          <w:p>
+            <w:r/>
+            <w:r>
+              <w:rPr>
+                <w:b/>
+                <w:color w:val="FFFFFF"/>
+                <w:sz w:val="19"/>
+              </w:rPr>
+              <w:t>Install</w:t>
+            </w:r>
+          </w:p>
+        </w:tc>
+        <w:tc>
+          <w:tcPr>
+            <w:tcW w:type="dxa" w:w="680"/>
+            <w:shd w:val="clear" w:fill="00778B"/>
+          </w:tcPr>
+          <w:p>
+            <w:r/>
+            <w:r>
+              <w:rPr>
+                <w:b/>
+                <w:color w:val="FFFFFF"/>
+                <w:sz w:val="19"/>
+              </w:rPr>
+              <w:t>SAT</w:t>
+            </w:r>
+          </w:p>
+        </w:tc>
+      </w:tr>
+      <w:tr>
+        <w:tc>
+          <w:tcPr>
+            <w:tcW w:type="dxa" w:w="2041"/>
+          </w:tcPr>
+          <w:p>
+            <w:r/>
+            <w:r>
+              <w:rPr>
+                <w:sz w:val="19"/>
+              </w:rPr>
+              <w:t>Riyadh (Thumamah)</w:t>
+            </w:r>
+          </w:p>
+        </w:tc>
+        <w:tc>
+          <w:tcPr>
+            <w:tcW w:type="dxa" w:w="850"/>
+          </w:tcPr>
+          <w:p>
+            <w:r/>
+            <w:r>
+              <w:rPr>
+                <w:sz w:val="19"/>
+              </w:rPr>
+              <w:t>88</w:t>
+            </w:r>
+          </w:p>
+        </w:tc>
+        <w:tc>
+          <w:tcPr>
+            <w:tcW w:type="dxa" w:w="964"/>
+          </w:tcPr>
+          <w:p>
+            <w:r/>
+            <w:r>
+              <w:rPr>
+                <w:sz w:val="19"/>
+              </w:rPr>
+              <w:t>1.72</w:t>
+            </w:r>
+          </w:p>
+        </w:tc>
+        <w:tc>
+          <w:tcPr>
+            <w:tcW w:type="dxa" w:w="964"/>
+          </w:tcPr>
+          <w:p>
+            <w:r/>
+            <w:r>
+              <w:rPr>
+                <w:sz w:val="19"/>
+              </w:rPr>
+              <w:t>0.75</w:t>
+            </w:r>
+          </w:p>
+        </w:tc>
+        <w:tc>
+          <w:tcPr>
+            <w:tcW w:type="dxa" w:w="794"/>
+          </w:tcPr>
+          <w:p>
+            <w:r/>
+            <w:r>
+              <w:rPr>
+                <w:sz w:val="19"/>
+              </w:rPr>
+              <w:t>8</w:t>
+            </w:r>
+          </w:p>
+        </w:tc>
+        <w:tc>
+          <w:tcPr>
+            <w:tcW w:type="dxa" w:w="794"/>
+          </w:tcPr>
+          <w:p>
+            <w:r/>
+            <w:r>
+              <w:rPr>
+                <w:sz w:val="19"/>
+              </w:rPr>
+              <w:t>57</w:t>
+            </w:r>
+          </w:p>
+        </w:tc>
+        <w:tc>
+          <w:tcPr>
+            <w:tcW w:type="dxa" w:w="680"/>
+          </w:tcPr>
+          <w:p>
+            <w:r/>
+            <w:r>
+              <w:rPr>
+                <w:sz w:val="19"/>
+              </w:rPr>
+              <w:t>27</w:t>
+            </w:r>
+          </w:p>
+        </w:tc>
+        <w:tc>
+          <w:tcPr>
+            <w:tcW w:type="dxa" w:w="680"/>
+          </w:tcPr>
+          <w:p>
+            <w:r/>
+            <w:r>
+              <w:rPr>
+                <w:sz w:val="19"/>
+              </w:rPr>
+              <w:t>82</w:t>
+            </w:r>
+          </w:p>
+        </w:tc>
+        <w:tc>
+          <w:tcPr>
+            <w:tcW w:type="dxa" w:w="794"/>
+          </w:tcPr>
+          <w:p>
+            <w:r/>
+            <w:r>
+              <w:rPr>
+                <w:sz w:val="19"/>
+              </w:rPr>
+              <w:t>44</w:t>
+            </w:r>
+          </w:p>
+        </w:tc>
+        <w:tc>
+          <w:tcPr>
+            <w:tcW w:type="dxa" w:w="680"/>
+          </w:tcPr>
+          <w:p>
+            <w:r/>
+            <w:r>
+              <w:rPr>
+                <w:sz w:val="19"/>
+              </w:rPr>
+              <w:t>13</w:t>
+            </w:r>
+          </w:p>
+        </w:tc>
+      </w:tr>
+      <w:tr>
+        <w:tc>
+          <w:tcPr>
+            <w:tcW w:type="dxa" w:w="2041"/>
+          </w:tcPr>
+          <w:p>
+            <w:r/>
+            <w:r>
+              <w:rPr>
+                <w:sz w:val="19"/>
+              </w:rPr>
+              <w:t>Makkah</w:t>
+            </w:r>
+          </w:p>
+        </w:tc>
+        <w:tc>
+          <w:tcPr>
+            <w:tcW w:type="dxa" w:w="850"/>
+          </w:tcPr>
+          <w:p>
+            <w:r/>
+            <w:r>
+              <w:rPr>
+                <w:sz w:val="19"/>
+              </w:rPr>
+              <w:t>596</w:t>
+            </w:r>
+          </w:p>
+        </w:tc>
+        <w:tc>
+          <w:tcPr>
+            <w:tcW w:type="dxa" w:w="964"/>
+          </w:tcPr>
+          <w:p>
+            <w:r/>
+            <w:r>
+              <w:rPr>
+                <w:sz w:val="19"/>
+              </w:rPr>
+              <w:t>5.07</w:t>
+            </w:r>
+          </w:p>
+        </w:tc>
+        <w:tc>
+          <w:tcPr>
+            <w:tcW w:type="dxa" w:w="964"/>
+          </w:tcPr>
+          <w:p>
+            <w:r/>
+            <w:r>
+              <w:rPr>
+                <w:sz w:val="19"/>
+              </w:rPr>
+              <w:t>0.57</w:t>
+            </w:r>
+          </w:p>
+        </w:tc>
+        <w:tc>
+          <w:tcPr>
+            <w:tcW w:type="dxa" w:w="794"/>
+          </w:tcPr>
+          <w:p>
+            <w:r/>
+            <w:r>
+              <w:rPr>
+                <w:sz w:val="19"/>
+              </w:rPr>
+              <w:t>25</w:t>
+            </w:r>
+          </w:p>
+        </w:tc>
+        <w:tc>
+          <w:tcPr>
+            <w:tcW w:type="dxa" w:w="794"/>
+          </w:tcPr>
+          <w:p>
+            <w:r/>
+            <w:r>
+              <w:rPr>
+                <w:sz w:val="19"/>
+              </w:rPr>
+              <w:t>91</w:t>
+            </w:r>
+          </w:p>
+        </w:tc>
+        <w:tc>
+          <w:tcPr>
+            <w:tcW w:type="dxa" w:w="680"/>
+          </w:tcPr>
+          <w:p>
+            <w:r/>
+            <w:r>
+              <w:rPr>
+                <w:sz w:val="19"/>
+              </w:rPr>
+              <w:t>40</w:t>
+            </w:r>
+          </w:p>
+        </w:tc>
+        <w:tc>
+          <w:tcPr>
+            <w:tcW w:type="dxa" w:w="680"/>
+          </w:tcPr>
+          <w:p>
+            <w:r/>
+            <w:r>
+              <w:rPr>
+                <w:sz w:val="19"/>
+              </w:rPr>
+              <w:t>68</w:t>
+            </w:r>
+          </w:p>
+        </w:tc>
+        <w:tc>
+          <w:tcPr>
+            <w:tcW w:type="dxa" w:w="794"/>
+          </w:tcPr>
+          <w:p>
+            <w:r/>
+            <w:r>
+              <w:rPr>
+                <w:sz w:val="19"/>
+              </w:rPr>
+              <w:t>81</w:t>
+            </w:r>
+          </w:p>
+        </w:tc>
+        <w:tc>
+          <w:tcPr>
+            <w:tcW w:type="dxa" w:w="680"/>
+          </w:tcPr>
+          <w:p>
+            <w:r/>
+            <w:r>
+              <w:rPr>
+                <w:sz w:val="19"/>
+              </w:rPr>
+              <w:t>30</w:t>
+            </w:r>
+          </w:p>
+        </w:tc>
+      </w:tr>
+      <w:tr>
+        <w:tc>
+          <w:tcPr>
+            <w:tcW w:type="dxa" w:w="2041"/>
+          </w:tcPr>
+          <w:p>
+            <w:r/>
+            <w:r>
+              <w:rPr>
+                <w:sz w:val="19"/>
+              </w:rPr>
+              <w:t>Riyadh (Malaz)</w:t>
+            </w:r>
+          </w:p>
+        </w:tc>
+        <w:tc>
+          <w:tcPr>
+            <w:tcW w:type="dxa" w:w="850"/>
+          </w:tcPr>
+          <w:p>
+            <w:r/>
+            <w:r>
+              <w:rPr>
+                <w:sz w:val="19"/>
+              </w:rPr>
+              <w:t>68</w:t>
+            </w:r>
+          </w:p>
+        </w:tc>
+        <w:tc>
+          <w:tcPr>
+            <w:tcW w:type="dxa" w:w="964"/>
+          </w:tcPr>
+          <w:p>
+            <w:r/>
+            <w:r>
+              <w:rPr>
+                <w:sz w:val="19"/>
+              </w:rPr>
+              <w:t>1.27</w:t>
+            </w:r>
+          </w:p>
+        </w:tc>
+        <w:tc>
+          <w:tcPr>
+            <w:tcW w:type="dxa" w:w="964"/>
+          </w:tcPr>
+          <w:p>
+            <w:r/>
+            <w:r>
+              <w:rPr>
+                <w:sz w:val="19"/>
+              </w:rPr>
+              <w:t>0.70</w:t>
+            </w:r>
+          </w:p>
+        </w:tc>
+        <w:tc>
+          <w:tcPr>
+            <w:tcW w:type="dxa" w:w="794"/>
+          </w:tcPr>
+          <w:p>
+            <w:r/>
+            <w:r>
+              <w:rPr>
+                <w:sz w:val="19"/>
+              </w:rPr>
+              <w:t>8</w:t>
+            </w:r>
+          </w:p>
+        </w:tc>
+        <w:tc>
+          <w:tcPr>
+            <w:tcW w:type="dxa" w:w="794"/>
+          </w:tcPr>
+          <w:p>
+            <w:r/>
+            <w:r>
+              <w:rPr>
+                <w:sz w:val="19"/>
+              </w:rPr>
+              <w:t>53</w:t>
+            </w:r>
+          </w:p>
+        </w:tc>
+        <w:tc>
+          <w:tcPr>
+            <w:tcW w:type="dxa" w:w="680"/>
+          </w:tcPr>
+          <w:p>
+            <w:r/>
+            <w:r>
+              <w:rPr>
+                <w:sz w:val="19"/>
+              </w:rPr>
+              <w:t>25</w:t>
+            </w:r>
+          </w:p>
+        </w:tc>
+        <w:tc>
+          <w:tcPr>
+            <w:tcW w:type="dxa" w:w="680"/>
+          </w:tcPr>
+          <w:p>
+            <w:r/>
+            <w:r>
+              <w:rPr>
+                <w:sz w:val="19"/>
+              </w:rPr>
+              <w:t>78</w:t>
+            </w:r>
+          </w:p>
+        </w:tc>
+        <w:tc>
+          <w:tcPr>
+            <w:tcW w:type="dxa" w:w="794"/>
+          </w:tcPr>
+          <w:p>
+            <w:r/>
+            <w:r>
+              <w:rPr>
+                <w:sz w:val="19"/>
+              </w:rPr>
+              <w:t>38</w:t>
+            </w:r>
+          </w:p>
+        </w:tc>
+        <w:tc>
+          <w:tcPr>
+            <w:tcW w:type="dxa" w:w="680"/>
+          </w:tcPr>
+          <w:p>
+            <w:r/>
+            <w:r>
+              <w:rPr>
+                <w:sz w:val="19"/>
+              </w:rPr>
+              <w:t>12</w:t>
+            </w:r>
+          </w:p>
+        </w:tc>
+      </w:tr>
+      <w:tr>
+        <w:tc>
+          <w:tcPr>
+            <w:tcW w:type="dxa" w:w="2041"/>
+          </w:tcPr>
+          <w:p>
+            <w:r/>
+            <w:r>
+              <w:rPr>
+                <w:sz w:val="19"/>
+              </w:rPr>
+              <w:t>Jeddah</w:t>
+            </w:r>
+          </w:p>
+        </w:tc>
+        <w:tc>
+          <w:tcPr>
+            <w:tcW w:type="dxa" w:w="850"/>
+          </w:tcPr>
+          <w:p>
+            <w:r/>
+            <w:r>
+              <w:rPr>
+                <w:sz w:val="19"/>
+              </w:rPr>
+              <w:t>475</w:t>
+            </w:r>
+          </w:p>
+        </w:tc>
+        <w:tc>
+          <w:tcPr>
+            <w:tcW w:type="dxa" w:w="964"/>
+          </w:tcPr>
+          <w:p>
+            <w:r/>
+            <w:r>
+              <w:rPr>
+                <w:sz w:val="19"/>
+              </w:rPr>
+              <w:t>5.03</w:t>
+            </w:r>
+          </w:p>
+        </w:tc>
+        <w:tc>
+          <w:tcPr>
+            <w:tcW w:type="dxa" w:w="964"/>
+          </w:tcPr>
+          <w:p>
+            <w:r/>
+            <w:r>
+              <w:rPr>
+                <w:sz w:val="19"/>
+              </w:rPr>
+              <w:t>0.52</w:t>
+            </w:r>
+          </w:p>
+        </w:tc>
+        <w:tc>
+          <w:tcPr>
+            <w:tcW w:type="dxa" w:w="794"/>
+          </w:tcPr>
+          <w:p>
+            <w:r/>
+            <w:r>
+              <w:rPr>
+                <w:sz w:val="19"/>
+              </w:rPr>
+              <w:t>21</w:t>
+            </w:r>
+          </w:p>
+        </w:tc>
+        <w:tc>
+          <w:tcPr>
+            <w:tcW w:type="dxa" w:w="794"/>
+          </w:tcPr>
+          <w:p>
+            <w:r/>
+            <w:r>
+              <w:rPr>
+                <w:sz w:val="19"/>
+              </w:rPr>
+              <w:t>90</w:t>
+            </w:r>
+          </w:p>
+        </w:tc>
+        <w:tc>
+          <w:tcPr>
+            <w:tcW w:type="dxa" w:w="680"/>
+          </w:tcPr>
+          <w:p>
+            <w:r/>
+            <w:r>
+              <w:rPr>
+                <w:sz w:val="19"/>
+              </w:rPr>
+              <w:t>40</w:t>
+            </w:r>
+          </w:p>
+        </w:tc>
+        <w:tc>
+          <w:tcPr>
+            <w:tcW w:type="dxa" w:w="680"/>
+          </w:tcPr>
+          <w:p>
+            <w:r/>
+            <w:r>
+              <w:rPr>
+                <w:sz w:val="19"/>
+              </w:rPr>
+              <w:t>63</w:t>
+            </w:r>
+          </w:p>
+        </w:tc>
+        <w:tc>
+          <w:tcPr>
+            <w:tcW w:type="dxa" w:w="794"/>
+          </w:tcPr>
+          <w:p>
+            <w:r/>
+            <w:r>
+              <w:rPr>
+                <w:sz w:val="19"/>
+              </w:rPr>
+              <w:t>68</w:t>
+            </w:r>
+          </w:p>
+        </w:tc>
+        <w:tc>
+          <w:tcPr>
+            <w:tcW w:type="dxa" w:w="680"/>
+          </w:tcPr>
+          <w:p>
+            <w:r/>
+            <w:r>
+              <w:rPr>
+                <w:sz w:val="19"/>
+              </w:rPr>
+              <w:t>26</w:t>
+            </w:r>
+          </w:p>
+        </w:tc>
+      </w:tr>
+      <w:tr>
+        <w:tc>
+          <w:tcPr>
+            <w:tcW w:type="dxa" w:w="2041"/>
+          </w:tcPr>
+          <w:p>
+            <w:r/>
+            <w:r>
+              <w:rPr>
+                <w:sz w:val="19"/>
+              </w:rPr>
+              <w:t>Dammam</w:t>
+            </w:r>
+          </w:p>
+        </w:tc>
+        <w:tc>
+          <w:tcPr>
+            <w:tcW w:type="dxa" w:w="850"/>
+          </w:tcPr>
+          <w:p>
+            <w:r/>
+            <w:r>
+              <w:rPr>
+                <w:sz w:val="19"/>
+              </w:rPr>
+              <w:t>68</w:t>
+            </w:r>
+          </w:p>
+        </w:tc>
+        <w:tc>
+          <w:tcPr>
+            <w:tcW w:type="dxa" w:w="964"/>
+          </w:tcPr>
+          <w:p>
+            <w:r/>
+            <w:r>
+              <w:rPr>
+                <w:sz w:val="19"/>
+              </w:rPr>
+              <w:t>1.33</w:t>
+            </w:r>
+          </w:p>
+        </w:tc>
+        <w:tc>
+          <w:tcPr>
+            <w:tcW w:type="dxa" w:w="964"/>
+          </w:tcPr>
+          <w:p>
+            <w:r/>
+            <w:r>
+              <w:rPr>
+                <w:sz w:val="19"/>
+              </w:rPr>
+              <w:t>0.70</w:t>
+            </w:r>
+          </w:p>
+        </w:tc>
+        <w:tc>
+          <w:tcPr>
+            <w:tcW w:type="dxa" w:w="794"/>
+          </w:tcPr>
+          <w:p>
+            <w:r/>
+            <w:r>
+              <w:rPr>
+                <w:sz w:val="19"/>
+              </w:rPr>
+              <w:t>8</w:t>
+            </w:r>
+          </w:p>
+        </w:tc>
+        <w:tc>
+          <w:tcPr>
+            <w:tcW w:type="dxa" w:w="794"/>
+          </w:tcPr>
+          <w:p>
+            <w:r/>
+            <w:r>
+              <w:rPr>
+                <w:sz w:val="19"/>
+              </w:rPr>
+              <w:t>53</w:t>
+            </w:r>
+          </w:p>
+        </w:tc>
+        <w:tc>
+          <w:tcPr>
+            <w:tcW w:type="dxa" w:w="680"/>
+          </w:tcPr>
+          <w:p>
+            <w:r/>
+            <w:r>
+              <w:rPr>
+                <w:sz w:val="19"/>
+              </w:rPr>
+              <w:t>25</w:t>
+            </w:r>
+          </w:p>
+        </w:tc>
+        <w:tc>
+          <w:tcPr>
+            <w:tcW w:type="dxa" w:w="680"/>
+          </w:tcPr>
+          <w:p>
+            <w:r/>
+            <w:r>
+              <w:rPr>
+                <w:sz w:val="19"/>
+              </w:rPr>
+              <w:t>78</w:t>
+            </w:r>
+          </w:p>
+        </w:tc>
+        <w:tc>
+          <w:tcPr>
+            <w:tcW w:type="dxa" w:w="794"/>
+          </w:tcPr>
+          <w:p>
+            <w:r/>
+            <w:r>
+              <w:rPr>
+                <w:sz w:val="19"/>
+              </w:rPr>
+              <w:t>38</w:t>
+            </w:r>
+          </w:p>
+        </w:tc>
+        <w:tc>
+          <w:tcPr>
+            <w:tcW w:type="dxa" w:w="680"/>
+          </w:tcPr>
+          <w:p>
+            <w:r/>
+            <w:r>
+              <w:rPr>
+                <w:sz w:val="19"/>
+              </w:rPr>
+              <w:t>12</w:t>
+            </w:r>
+          </w:p>
+        </w:tc>
+      </w:tr>
+      <w:tr>
+        <w:tc>
+          <w:tcPr>
+            <w:tcW w:type="dxa" w:w="2041"/>
+          </w:tcPr>
+          <w:p>
+            <w:r/>
+            <w:r>
+              <w:rPr>
+                <w:sz w:val="19"/>
+              </w:rPr>
+              <w:t>Al Qassim</w:t>
+            </w:r>
+          </w:p>
+        </w:tc>
+        <w:tc>
+          <w:tcPr>
+            <w:tcW w:type="dxa" w:w="850"/>
+          </w:tcPr>
+          <w:p>
+            <w:r/>
+            <w:r>
+              <w:rPr>
+                <w:sz w:val="19"/>
+              </w:rPr>
+              <w:t>88</w:t>
+            </w:r>
+          </w:p>
+        </w:tc>
+        <w:tc>
+          <w:tcPr>
+            <w:tcW w:type="dxa" w:w="964"/>
+          </w:tcPr>
+          <w:p>
+            <w:r/>
+            <w:r>
+              <w:rPr>
+                <w:sz w:val="19"/>
+              </w:rPr>
+              <w:t>1.66</w:t>
+            </w:r>
+          </w:p>
+        </w:tc>
+        <w:tc>
+          <w:tcPr>
+            <w:tcW w:type="dxa" w:w="964"/>
+          </w:tcPr>
+          <w:p>
+            <w:r/>
+            <w:r>
+              <w:rPr>
+                <w:sz w:val="19"/>
+              </w:rPr>
+              <w:t>0.75</w:t>
+            </w:r>
+          </w:p>
+        </w:tc>
+        <w:tc>
+          <w:tcPr>
+            <w:tcW w:type="dxa" w:w="794"/>
+          </w:tcPr>
+          <w:p>
+            <w:r/>
+            <w:r>
+              <w:rPr>
+                <w:sz w:val="19"/>
+              </w:rPr>
+              <w:t>8</w:t>
+            </w:r>
+          </w:p>
+        </w:tc>
+        <w:tc>
+          <w:tcPr>
+            <w:tcW w:type="dxa" w:w="794"/>
+          </w:tcPr>
+          <w:p>
+            <w:r/>
+            <w:r>
+              <w:rPr>
+                <w:sz w:val="19"/>
+              </w:rPr>
+              <w:t>57</w:t>
+            </w:r>
+          </w:p>
+        </w:tc>
+        <w:tc>
+          <w:tcPr>
+            <w:tcW w:type="dxa" w:w="680"/>
+          </w:tcPr>
+          <w:p>
+            <w:r/>
+            <w:r>
+              <w:rPr>
+                <w:sz w:val="19"/>
+              </w:rPr>
+              <w:t>27</w:t>
+            </w:r>
+          </w:p>
+        </w:tc>
+        <w:tc>
+          <w:tcPr>
+            <w:tcW w:type="dxa" w:w="680"/>
+          </w:tcPr>
+          <w:p>
+            <w:r/>
+            <w:r>
+              <w:rPr>
+                <w:sz w:val="19"/>
+              </w:rPr>
+              <w:t>82</w:t>
+            </w:r>
+          </w:p>
+        </w:tc>
+        <w:tc>
+          <w:tcPr>
+            <w:tcW w:type="dxa" w:w="794"/>
+          </w:tcPr>
+          <w:p>
+            <w:r/>
+            <w:r>
+              <w:rPr>
+                <w:sz w:val="19"/>
+              </w:rPr>
+              <w:t>44</w:t>
+            </w:r>
+          </w:p>
+        </w:tc>
+        <w:tc>
+          <w:tcPr>
+            <w:tcW w:type="dxa" w:w="680"/>
+          </w:tcPr>
+          <w:p>
+            <w:r/>
+            <w:r>
+              <w:rPr>
+                <w:sz w:val="19"/>
+              </w:rPr>
+              <w:t>13</w:t>
+            </w:r>
+          </w:p>
+        </w:tc>
+      </w:tr>
+      <w:tr>
+        <w:tc>
+          <w:tcPr>
+            <w:tcW w:type="dxa" w:w="2041"/>
+          </w:tcPr>
+          <w:p>
+            <w:r/>
+            <w:r>
+              <w:rPr>
+                <w:sz w:val="19"/>
+              </w:rPr>
+              <w:t>Hufuf</w:t>
+            </w:r>
+          </w:p>
+        </w:tc>
+        <w:tc>
+          <w:tcPr>
+            <w:tcW w:type="dxa" w:w="850"/>
+          </w:tcPr>
+          <w:p>
+            <w:r/>
+            <w:r>
+              <w:rPr>
+                <w:sz w:val="19"/>
+              </w:rPr>
+              <w:t>60</w:t>
+            </w:r>
+          </w:p>
+        </w:tc>
+        <w:tc>
+          <w:tcPr>
+            <w:tcW w:type="dxa" w:w="964"/>
+          </w:tcPr>
+          <w:p>
+            <w:r/>
+            <w:r>
+              <w:rPr>
+                <w:sz w:val="19"/>
+              </w:rPr>
+              <w:t>1.14</w:t>
+            </w:r>
+          </w:p>
+        </w:tc>
+        <w:tc>
+          <w:tcPr>
+            <w:tcW w:type="dxa" w:w="964"/>
+          </w:tcPr>
+          <w:p>
+            <w:r/>
+            <w:r>
+              <w:rPr>
+                <w:sz w:val="19"/>
+              </w:rPr>
+              <w:t>0.66</w:t>
+            </w:r>
+          </w:p>
+        </w:tc>
+        <w:tc>
+          <w:tcPr>
+            <w:tcW w:type="dxa" w:w="794"/>
+          </w:tcPr>
+          <w:p>
+            <w:r/>
+            <w:r>
+              <w:rPr>
+                <w:sz w:val="19"/>
+              </w:rPr>
+              <w:t>8</w:t>
+            </w:r>
+          </w:p>
+        </w:tc>
+        <w:tc>
+          <w:tcPr>
+            <w:tcW w:type="dxa" w:w="794"/>
+          </w:tcPr>
+          <w:p>
+            <w:r/>
+            <w:r>
+              <w:rPr>
+                <w:sz w:val="19"/>
+              </w:rPr>
+              <w:t>51</w:t>
+            </w:r>
+          </w:p>
+        </w:tc>
+        <w:tc>
+          <w:tcPr>
+            <w:tcW w:type="dxa" w:w="680"/>
+          </w:tcPr>
+          <w:p>
+            <w:r/>
+            <w:r>
+              <w:rPr>
+                <w:sz w:val="19"/>
+              </w:rPr>
+              <w:t>25</w:t>
+            </w:r>
+          </w:p>
+        </w:tc>
+        <w:tc>
+          <w:tcPr>
+            <w:tcW w:type="dxa" w:w="680"/>
+          </w:tcPr>
+          <w:p>
+            <w:r/>
+            <w:r>
+              <w:rPr>
+                <w:sz w:val="19"/>
+              </w:rPr>
+              <w:t>75</w:t>
+            </w:r>
+          </w:p>
+        </w:tc>
+        <w:tc>
+          <w:tcPr>
+            <w:tcW w:type="dxa" w:w="794"/>
+          </w:tcPr>
+          <w:p>
+            <w:r/>
+            <w:r>
+              <w:rPr>
+                <w:sz w:val="19"/>
+              </w:rPr>
+              <w:t>35</w:t>
+            </w:r>
+          </w:p>
+        </w:tc>
+        <w:tc>
+          <w:tcPr>
+            <w:tcW w:type="dxa" w:w="680"/>
+          </w:tcPr>
+          <w:p>
+            <w:r/>
+            <w:r>
+              <w:rPr>
+                <w:sz w:val="19"/>
+              </w:rPr>
+              <w:t>12</w:t>
+            </w:r>
+          </w:p>
+        </w:tc>
+      </w:tr>
+      <w:tr>
+        <w:tc>
+          <w:tcPr>
+            <w:tcW w:type="dxa" w:w="2041"/>
+          </w:tcPr>
+          <w:p>
+            <w:r/>
+            <w:r>
+              <w:rPr>
+                <w:sz w:val="19"/>
+              </w:rPr>
+              <w:t>Al Majma'ah</w:t>
+            </w:r>
+          </w:p>
+        </w:tc>
+        <w:tc>
+          <w:tcPr>
+            <w:tcW w:type="dxa" w:w="850"/>
+          </w:tcPr>
+          <w:p>
+            <w:r/>
+            <w:r>
+              <w:rPr>
+                <w:sz w:val="19"/>
+              </w:rPr>
+              <w:t>88</w:t>
+            </w:r>
+          </w:p>
+        </w:tc>
+        <w:tc>
+          <w:tcPr>
+            <w:tcW w:type="dxa" w:w="964"/>
+          </w:tcPr>
+          <w:p>
+            <w:r/>
+            <w:r>
+              <w:rPr>
+                <w:sz w:val="19"/>
+              </w:rPr>
+              <w:t>1.66</w:t>
+            </w:r>
+          </w:p>
+        </w:tc>
+        <w:tc>
+          <w:tcPr>
+            <w:tcW w:type="dxa" w:w="964"/>
+          </w:tcPr>
+          <w:p>
+            <w:r/>
+            <w:r>
+              <w:rPr>
+                <w:sz w:val="19"/>
+              </w:rPr>
+              <w:t>0.75</w:t>
+            </w:r>
+          </w:p>
+        </w:tc>
+        <w:tc>
+          <w:tcPr>
+            <w:tcW w:type="dxa" w:w="794"/>
+          </w:tcPr>
+          <w:p>
+            <w:r/>
+            <w:r>
+              <w:rPr>
+                <w:sz w:val="19"/>
+              </w:rPr>
+              <w:t>8</w:t>
+            </w:r>
+          </w:p>
+        </w:tc>
+        <w:tc>
+          <w:tcPr>
+            <w:tcW w:type="dxa" w:w="794"/>
+          </w:tcPr>
+          <w:p>
+            <w:r/>
+            <w:r>
+              <w:rPr>
+                <w:sz w:val="19"/>
+              </w:rPr>
+              <w:t>57</w:t>
+            </w:r>
+          </w:p>
+        </w:tc>
+        <w:tc>
+          <w:tcPr>
+            <w:tcW w:type="dxa" w:w="680"/>
+          </w:tcPr>
+          <w:p>
+            <w:r/>
+            <w:r>
+              <w:rPr>
+                <w:sz w:val="19"/>
+              </w:rPr>
+              <w:t>27</w:t>
+            </w:r>
+          </w:p>
+        </w:tc>
+        <w:tc>
+          <w:tcPr>
+            <w:tcW w:type="dxa" w:w="680"/>
+          </w:tcPr>
+          <w:p>
+            <w:r/>
+            <w:r>
+              <w:rPr>
+                <w:sz w:val="19"/>
+              </w:rPr>
+              <w:t>82</w:t>
+            </w:r>
+          </w:p>
+        </w:tc>
+        <w:tc>
+          <w:tcPr>
+            <w:tcW w:type="dxa" w:w="794"/>
+          </w:tcPr>
+          <w:p>
+            <w:r/>
+            <w:r>
+              <w:rPr>
+                <w:sz w:val="19"/>
+              </w:rPr>
+              <w:t>44</w:t>
+            </w:r>
+          </w:p>
+        </w:tc>
+        <w:tc>
+          <w:tcPr>
+            <w:tcW w:type="dxa" w:w="680"/>
+          </w:tcPr>
+          <w:p>
+            <w:r/>
+            <w:r>
+              <w:rPr>
+                <w:sz w:val="19"/>
+              </w:rPr>
+              <w:t>13</w:t>
+            </w:r>
+          </w:p>
+        </w:tc>
+      </w:tr>
+      <w:tr>
+        <w:tc>
+          <w:tcPr>
+            <w:tcW w:type="dxa" w:w="2041"/>
+          </w:tcPr>
+          <w:p>
+            <w:r/>
+            <w:r>
+              <w:rPr>
+                <w:sz w:val="19"/>
+              </w:rPr>
+              <w:t>KAEC</w:t>
+            </w:r>
+          </w:p>
+        </w:tc>
+        <w:tc>
+          <w:tcPr>
+            <w:tcW w:type="dxa" w:w="850"/>
+          </w:tcPr>
+          <w:p>
+            <w:r/>
+            <w:r>
+              <w:rPr>
+                <w:sz w:val="19"/>
+              </w:rPr>
+              <w:t>314</w:t>
+            </w:r>
+          </w:p>
+        </w:tc>
+        <w:tc>
+          <w:tcPr>
+            <w:tcW w:type="dxa" w:w="964"/>
+          </w:tcPr>
+          <w:p>
+            <w:r/>
+            <w:r>
+              <w:rPr>
+                <w:sz w:val="19"/>
+              </w:rPr>
+              <w:t>3.05</w:t>
+            </w:r>
+          </w:p>
+        </w:tc>
+        <w:tc>
+          <w:tcPr>
+            <w:tcW w:type="dxa" w:w="964"/>
+          </w:tcPr>
+          <w:p>
+            <w:r/>
+            <w:r>
+              <w:rPr>
+                <w:sz w:val="19"/>
+              </w:rPr>
+              <w:t>0.19</w:t>
+            </w:r>
+          </w:p>
+        </w:tc>
+        <w:tc>
+          <w:tcPr>
+            <w:tcW w:type="dxa" w:w="794"/>
+          </w:tcPr>
+          <w:p>
+            <w:r/>
+            <w:r>
+              <w:rPr>
+                <w:sz w:val="19"/>
+              </w:rPr>
+              <w:t>15</w:t>
+            </w:r>
+          </w:p>
+        </w:tc>
+        <w:tc>
+          <w:tcPr>
+            <w:tcW w:type="dxa" w:w="794"/>
+          </w:tcPr>
+          <w:p>
+            <w:r/>
+            <w:r>
+              <w:rPr>
+                <w:sz w:val="19"/>
+              </w:rPr>
+              <w:t>70</w:t>
+            </w:r>
+          </w:p>
+        </w:tc>
+        <w:tc>
+          <w:tcPr>
+            <w:tcW w:type="dxa" w:w="680"/>
+          </w:tcPr>
+          <w:p>
+            <w:r/>
+            <w:r>
+              <w:rPr>
+                <w:sz w:val="19"/>
+              </w:rPr>
+              <w:t>32</w:t>
+            </w:r>
+          </w:p>
+        </w:tc>
+        <w:tc>
+          <w:tcPr>
+            <w:tcW w:type="dxa" w:w="680"/>
+          </w:tcPr>
+          <w:p>
+            <w:r/>
+            <w:r>
+              <w:rPr>
+                <w:sz w:val="19"/>
+              </w:rPr>
+              <w:t>36</w:t>
+            </w:r>
+          </w:p>
+        </w:tc>
+        <w:tc>
+          <w:tcPr>
+            <w:tcW w:type="dxa" w:w="794"/>
+          </w:tcPr>
+          <w:p>
+            <w:r/>
+            <w:r>
+              <w:rPr>
+                <w:sz w:val="19"/>
+              </w:rPr>
+              <w:t>67</w:t>
+            </w:r>
+          </w:p>
+        </w:tc>
+        <w:tc>
+          <w:tcPr>
+            <w:tcW w:type="dxa" w:w="680"/>
+          </w:tcPr>
+          <w:p>
+            <w:r/>
+            <w:r>
+              <w:rPr>
+                <w:sz w:val="19"/>
+              </w:rPr>
+              <w:t>20</w:t>
+            </w:r>
+          </w:p>
+        </w:tc>
+      </w:tr>
+      <w:tr>
+        <w:tc>
+          <w:tcPr>
+            <w:tcW w:type="dxa" w:w="2041"/>
+          </w:tcPr>
+          <w:p>
+            <w:r/>
+            <w:r>
+              <w:rPr>
+                <w:sz w:val="19"/>
+              </w:rPr>
+              <w:t>Madinah</w:t>
+            </w:r>
+          </w:p>
+        </w:tc>
+        <w:tc>
+          <w:tcPr>
+            <w:tcW w:type="dxa" w:w="850"/>
+          </w:tcPr>
+          <w:p>
+            <w:r/>
+            <w:r>
+              <w:rPr>
+                <w:sz w:val="19"/>
+              </w:rPr>
+              <w:t>340</w:t>
+            </w:r>
+          </w:p>
+        </w:tc>
+        <w:tc>
+          <w:tcPr>
+            <w:tcW w:type="dxa" w:w="964"/>
+          </w:tcPr>
+          <w:p>
+            <w:r/>
+            <w:r>
+              <w:rPr>
+                <w:sz w:val="19"/>
+              </w:rPr>
+              <w:t>2.94</w:t>
+            </w:r>
+          </w:p>
+        </w:tc>
+        <w:tc>
+          <w:tcPr>
+            <w:tcW w:type="dxa" w:w="964"/>
+          </w:tcPr>
+          <w:p>
+            <w:r/>
+            <w:r>
+              <w:rPr>
+                <w:sz w:val="19"/>
+              </w:rPr>
+              <w:t>0.29</w:t>
+            </w:r>
+          </w:p>
+        </w:tc>
+        <w:tc>
+          <w:tcPr>
+            <w:tcW w:type="dxa" w:w="794"/>
+          </w:tcPr>
+          <w:p>
+            <w:r/>
+            <w:r>
+              <w:rPr>
+                <w:sz w:val="19"/>
+              </w:rPr>
+              <w:t>16</w:t>
+            </w:r>
+          </w:p>
+        </w:tc>
+        <w:tc>
+          <w:tcPr>
+            <w:tcW w:type="dxa" w:w="794"/>
+          </w:tcPr>
+          <w:p>
+            <w:r/>
+            <w:r>
+              <w:rPr>
+                <w:sz w:val="19"/>
+              </w:rPr>
+              <w:t>69</w:t>
+            </w:r>
+          </w:p>
+        </w:tc>
+        <w:tc>
+          <w:tcPr>
+            <w:tcW w:type="dxa" w:w="680"/>
+          </w:tcPr>
+          <w:p>
+            <w:r/>
+            <w:r>
+              <w:rPr>
+                <w:sz w:val="19"/>
+              </w:rPr>
+              <w:t>32</w:t>
+            </w:r>
+          </w:p>
+        </w:tc>
+        <w:tc>
+          <w:tcPr>
+            <w:tcW w:type="dxa" w:w="680"/>
+          </w:tcPr>
+          <w:p>
+            <w:r/>
+            <w:r>
+              <w:rPr>
+                <w:sz w:val="19"/>
+              </w:rPr>
+              <w:t>44</w:t>
+            </w:r>
+          </w:p>
+        </w:tc>
+        <w:tc>
+          <w:tcPr>
+            <w:tcW w:type="dxa" w:w="794"/>
+          </w:tcPr>
+          <w:p>
+            <w:r/>
+            <w:r>
+              <w:rPr>
+                <w:sz w:val="19"/>
+              </w:rPr>
+              <w:t>72</w:t>
+            </w:r>
+          </w:p>
+        </w:tc>
+        <w:tc>
+          <w:tcPr>
+            <w:tcW w:type="dxa" w:w="680"/>
+          </w:tcPr>
+          <w:p>
+            <w:r/>
+            <w:r>
+              <w:rPr>
+                <w:sz w:val="19"/>
+              </w:rPr>
+              <w:t>21</w:t>
+            </w:r>
+          </w:p>
+        </w:tc>
+      </w:tr>
+      <w:tr>
+        <w:tc>
+          <w:tcPr>
+            <w:tcW w:type="dxa" w:w="2041"/>
+          </w:tcPr>
+          <w:p>
+            <w:r/>
+            <w:r>
+              <w:rPr>
+                <w:sz w:val="19"/>
+              </w:rPr>
+              <w:t>Abqaiq</w:t>
+            </w:r>
+          </w:p>
+        </w:tc>
+        <w:tc>
+          <w:tcPr>
+            <w:tcW w:type="dxa" w:w="850"/>
+          </w:tcPr>
+          <w:p>
+            <w:r/>
+            <w:r>
+              <w:rPr>
+                <w:sz w:val="19"/>
+              </w:rPr>
+              <w:t>32</w:t>
+            </w:r>
+          </w:p>
+        </w:tc>
+        <w:tc>
+          <w:tcPr>
+            <w:tcW w:type="dxa" w:w="964"/>
+          </w:tcPr>
+          <w:p>
+            <w:r/>
+            <w:r>
+              <w:rPr>
+                <w:sz w:val="19"/>
+              </w:rPr>
+              <w:t>0.90</w:t>
+            </w:r>
+          </w:p>
+        </w:tc>
+        <w:tc>
+          <w:tcPr>
+            <w:tcW w:type="dxa" w:w="964"/>
+          </w:tcPr>
+          <w:p>
+            <w:r/>
+            <w:r>
+              <w:rPr>
+                <w:sz w:val="19"/>
+              </w:rPr>
+              <w:t>0.38</w:t>
+            </w:r>
+          </w:p>
+        </w:tc>
+        <w:tc>
+          <w:tcPr>
+            <w:tcW w:type="dxa" w:w="794"/>
+          </w:tcPr>
+          <w:p>
+            <w:r/>
+            <w:r>
+              <w:rPr>
+                <w:sz w:val="19"/>
+              </w:rPr>
+              <w:t>8</w:t>
+            </w:r>
+          </w:p>
+        </w:tc>
+        <w:tc>
+          <w:tcPr>
+            <w:tcW w:type="dxa" w:w="794"/>
+          </w:tcPr>
+          <w:p>
+            <w:r/>
+            <w:r>
+              <w:rPr>
+                <w:sz w:val="19"/>
+              </w:rPr>
+              <w:t>49</w:t>
+            </w:r>
+          </w:p>
+        </w:tc>
+        <w:tc>
+          <w:tcPr>
+            <w:tcW w:type="dxa" w:w="680"/>
+          </w:tcPr>
+          <w:p>
+            <w:r/>
+            <w:r>
+              <w:rPr>
+                <w:sz w:val="19"/>
+              </w:rPr>
+              <w:t>24</w:t>
+            </w:r>
+          </w:p>
+        </w:tc>
+        <w:tc>
+          <w:tcPr>
+            <w:tcW w:type="dxa" w:w="680"/>
+          </w:tcPr>
+          <w:p>
+            <w:r/>
+            <w:r>
+              <w:rPr>
+                <w:sz w:val="19"/>
+              </w:rPr>
+              <w:t>51</w:t>
+            </w:r>
+          </w:p>
+        </w:tc>
+        <w:tc>
+          <w:tcPr>
+            <w:tcW w:type="dxa" w:w="794"/>
+          </w:tcPr>
+          <w:p>
+            <w:r/>
+            <w:r>
+              <w:rPr>
+                <w:sz w:val="19"/>
+              </w:rPr>
+              <w:t>26</w:t>
+            </w:r>
+          </w:p>
+        </w:tc>
+        <w:tc>
+          <w:tcPr>
+            <w:tcW w:type="dxa" w:w="680"/>
+          </w:tcPr>
+          <w:p>
+            <w:r/>
+            <w:r>
+              <w:rPr>
+                <w:sz w:val="19"/>
+              </w:rPr>
+              <w:t>11</w:t>
+            </w:r>
+          </w:p>
+        </w:tc>
+      </w:tr>
+      <w:tr>
+        <w:tc>
+          <w:tcPr>
+            <w:tcW w:type="dxa" w:w="2041"/>
+          </w:tcPr>
+          <w:p>
+            <w:r/>
+            <w:r>
+              <w:rPr>
+                <w:sz w:val="19"/>
+              </w:rPr>
+              <w:t>Hail</w:t>
+            </w:r>
+          </w:p>
+        </w:tc>
+        <w:tc>
+          <w:tcPr>
+            <w:tcW w:type="dxa" w:w="850"/>
+          </w:tcPr>
+          <w:p>
+            <w:r/>
+            <w:r>
+              <w:rPr>
+                <w:sz w:val="19"/>
+              </w:rPr>
+              <w:t>88</w:t>
+            </w:r>
+          </w:p>
+        </w:tc>
+        <w:tc>
+          <w:tcPr>
+            <w:tcW w:type="dxa" w:w="964"/>
+          </w:tcPr>
+          <w:p>
+            <w:r/>
+            <w:r>
+              <w:rPr>
+                <w:sz w:val="19"/>
+              </w:rPr>
+              <w:t>1.66</w:t>
+            </w:r>
+          </w:p>
+        </w:tc>
+        <w:tc>
+          <w:tcPr>
+            <w:tcW w:type="dxa" w:w="964"/>
+          </w:tcPr>
+          <w:p>
+            <w:r/>
+            <w:r>
+              <w:rPr>
+                <w:sz w:val="19"/>
+              </w:rPr>
+              <w:t>0.75</w:t>
+            </w:r>
+          </w:p>
+        </w:tc>
+        <w:tc>
+          <w:tcPr>
+            <w:tcW w:type="dxa" w:w="794"/>
+          </w:tcPr>
+          <w:p>
+            <w:r/>
+            <w:r>
+              <w:rPr>
+                <w:sz w:val="19"/>
+              </w:rPr>
+              <w:t>8</w:t>
+            </w:r>
+          </w:p>
+        </w:tc>
+        <w:tc>
+          <w:tcPr>
+            <w:tcW w:type="dxa" w:w="794"/>
+          </w:tcPr>
+          <w:p>
+            <w:r/>
+            <w:r>
+              <w:rPr>
+                <w:sz w:val="19"/>
+              </w:rPr>
+              <w:t>57</w:t>
+            </w:r>
+          </w:p>
+        </w:tc>
+        <w:tc>
+          <w:tcPr>
+            <w:tcW w:type="dxa" w:w="680"/>
+          </w:tcPr>
+          <w:p>
+            <w:r/>
+            <w:r>
+              <w:rPr>
+                <w:sz w:val="19"/>
+              </w:rPr>
+              <w:t>27</w:t>
+            </w:r>
+          </w:p>
+        </w:tc>
+        <w:tc>
+          <w:tcPr>
+            <w:tcW w:type="dxa" w:w="680"/>
+          </w:tcPr>
+          <w:p>
+            <w:r/>
+            <w:r>
+              <w:rPr>
+                <w:sz w:val="19"/>
+              </w:rPr>
+              <w:t>82</w:t>
+            </w:r>
+          </w:p>
+        </w:tc>
+        <w:tc>
+          <w:tcPr>
+            <w:tcW w:type="dxa" w:w="794"/>
+          </w:tcPr>
+          <w:p>
+            <w:r/>
+            <w:r>
+              <w:rPr>
+                <w:sz w:val="19"/>
+              </w:rPr>
+              <w:t>44</w:t>
+            </w:r>
+          </w:p>
+        </w:tc>
+        <w:tc>
+          <w:tcPr>
+            <w:tcW w:type="dxa" w:w="680"/>
+          </w:tcPr>
+          <w:p>
+            <w:r/>
+            <w:r>
+              <w:rPr>
+                <w:sz w:val="19"/>
+              </w:rPr>
+              <w:t>13</w:t>
+            </w:r>
+          </w:p>
+        </w:tc>
+      </w:tr>
+      <w:tr>
+        <w:tc>
+          <w:tcPr>
+            <w:tcW w:type="dxa" w:w="2041"/>
+          </w:tcPr>
+          <w:p>
+            <w:r/>
+            <w:r>
+              <w:rPr>
+                <w:sz w:val="19"/>
+              </w:rPr>
+              <w:t>Al Jouf</w:t>
+            </w:r>
+          </w:p>
+        </w:tc>
+        <w:tc>
+          <w:tcPr>
+            <w:tcW w:type="dxa" w:w="850"/>
+          </w:tcPr>
+          <w:p>
+            <w:r/>
+            <w:r>
+              <w:rPr>
+                <w:sz w:val="19"/>
+              </w:rPr>
+              <w:t>88</w:t>
+            </w:r>
+          </w:p>
+        </w:tc>
+        <w:tc>
+          <w:tcPr>
+            <w:tcW w:type="dxa" w:w="964"/>
+          </w:tcPr>
+          <w:p>
+            <w:r/>
+            <w:r>
+              <w:rPr>
+                <w:sz w:val="19"/>
+              </w:rPr>
+              <w:t>1.68</w:t>
+            </w:r>
+          </w:p>
+        </w:tc>
+        <w:tc>
+          <w:tcPr>
+            <w:tcW w:type="dxa" w:w="964"/>
+          </w:tcPr>
+          <w:p>
+            <w:r/>
+            <w:r>
+              <w:rPr>
+                <w:sz w:val="19"/>
+              </w:rPr>
+              <w:t>0.75</w:t>
+            </w:r>
+          </w:p>
+        </w:tc>
+        <w:tc>
+          <w:tcPr>
+            <w:tcW w:type="dxa" w:w="794"/>
+          </w:tcPr>
+          <w:p>
+            <w:r/>
+            <w:r>
+              <w:rPr>
+                <w:sz w:val="19"/>
+              </w:rPr>
+              <w:t>8</w:t>
+            </w:r>
+          </w:p>
+        </w:tc>
+        <w:tc>
+          <w:tcPr>
+            <w:tcW w:type="dxa" w:w="794"/>
+          </w:tcPr>
+          <w:p>
+            <w:r/>
+            <w:r>
+              <w:rPr>
+                <w:sz w:val="19"/>
+              </w:rPr>
+              <w:t>57</w:t>
+            </w:r>
+          </w:p>
+        </w:tc>
+        <w:tc>
+          <w:tcPr>
+            <w:tcW w:type="dxa" w:w="680"/>
+          </w:tcPr>
+          <w:p>
+            <w:r/>
+            <w:r>
+              <w:rPr>
+                <w:sz w:val="19"/>
+              </w:rPr>
+              <w:t>27</w:t>
+            </w:r>
+          </w:p>
+        </w:tc>
+        <w:tc>
+          <w:tcPr>
+            <w:tcW w:type="dxa" w:w="680"/>
+          </w:tcPr>
+          <w:p>
+            <w:r/>
+            <w:r>
+              <w:rPr>
+                <w:sz w:val="19"/>
+              </w:rPr>
+              <w:t>82</w:t>
+            </w:r>
+          </w:p>
+        </w:tc>
+        <w:tc>
+          <w:tcPr>
+            <w:tcW w:type="dxa" w:w="794"/>
+          </w:tcPr>
+          <w:p>
+            <w:r/>
+            <w:r>
+              <w:rPr>
+                <w:sz w:val="19"/>
+              </w:rPr>
+              <w:t>44</w:t>
+            </w:r>
+          </w:p>
+        </w:tc>
+        <w:tc>
+          <w:tcPr>
+            <w:tcW w:type="dxa" w:w="680"/>
+          </w:tcPr>
+          <w:p>
+            <w:r/>
+            <w:r>
+              <w:rPr>
+                <w:sz w:val="19"/>
+              </w:rPr>
+              <w:t>13</w:t>
+            </w:r>
+          </w:p>
+        </w:tc>
+      </w:tr>
+      <w:tr>
+        <w:tc>
+          <w:tcPr>
+            <w:tcW w:type="dxa" w:w="2041"/>
+          </w:tcPr>
+          <w:p>
+            <w:r/>
+            <w:r>
+              <w:rPr>
+                <w:sz w:val="19"/>
+              </w:rPr>
+              <w:t>Al Qurayyat</w:t>
+            </w:r>
+          </w:p>
+        </w:tc>
+        <w:tc>
+          <w:tcPr>
+            <w:tcW w:type="dxa" w:w="850"/>
+          </w:tcPr>
+          <w:p>
+            <w:r/>
+            <w:r>
+              <w:rPr>
+                <w:sz w:val="19"/>
+              </w:rPr>
+              <w:t>88</w:t>
+            </w:r>
+          </w:p>
+        </w:tc>
+        <w:tc>
+          <w:tcPr>
+            <w:tcW w:type="dxa" w:w="964"/>
+          </w:tcPr>
+          <w:p>
+            <w:r/>
+            <w:r>
+              <w:rPr>
+                <w:sz w:val="19"/>
+              </w:rPr>
+              <w:t>1.66</w:t>
+            </w:r>
+          </w:p>
+        </w:tc>
+        <w:tc>
+          <w:tcPr>
+            <w:tcW w:type="dxa" w:w="964"/>
+          </w:tcPr>
+          <w:p>
+            <w:r/>
+            <w:r>
+              <w:rPr>
+                <w:sz w:val="19"/>
+              </w:rPr>
+              <w:t>0.75</w:t>
+            </w:r>
+          </w:p>
+        </w:tc>
+        <w:tc>
+          <w:tcPr>
+            <w:tcW w:type="dxa" w:w="794"/>
+          </w:tcPr>
+          <w:p>
+            <w:r/>
+            <w:r>
+              <w:rPr>
+                <w:sz w:val="19"/>
+              </w:rPr>
+              <w:t>8</w:t>
+            </w:r>
+          </w:p>
+        </w:tc>
+        <w:tc>
+          <w:tcPr>
+            <w:tcW w:type="dxa" w:w="794"/>
+          </w:tcPr>
+          <w:p>
+            <w:r/>
+            <w:r>
+              <w:rPr>
+                <w:sz w:val="19"/>
+              </w:rPr>
+              <w:t>57</w:t>
+            </w:r>
+          </w:p>
+        </w:tc>
+        <w:tc>
+          <w:tcPr>
+            <w:tcW w:type="dxa" w:w="680"/>
+          </w:tcPr>
+          <w:p>
+            <w:r/>
+            <w:r>
+              <w:rPr>
+                <w:sz w:val="19"/>
+              </w:rPr>
+              <w:t>27</w:t>
+            </w:r>
+          </w:p>
+        </w:tc>
+        <w:tc>
+          <w:tcPr>
+            <w:tcW w:type="dxa" w:w="680"/>
+          </w:tcPr>
+          <w:p>
+            <w:r/>
+            <w:r>
+              <w:rPr>
+                <w:sz w:val="19"/>
+              </w:rPr>
+              <w:t>82</w:t>
+            </w:r>
+          </w:p>
+        </w:tc>
+        <w:tc>
+          <w:tcPr>
+            <w:tcW w:type="dxa" w:w="794"/>
+          </w:tcPr>
+          <w:p>
+            <w:r/>
+            <w:r>
+              <w:rPr>
+                <w:sz w:val="19"/>
+              </w:rPr>
+              <w:t>44</w:t>
+            </w:r>
+          </w:p>
+        </w:tc>
+        <w:tc>
+          <w:tcPr>
+            <w:tcW w:type="dxa" w:w="680"/>
+          </w:tcPr>
+          <w:p>
+            <w:r/>
+            <w:r>
+              <w:rPr>
+                <w:sz w:val="19"/>
+              </w:rPr>
+              <w:t>13</w:t>
             </w:r>
           </w:p>
         </w:tc>
@@ -3420,7 +5617,7 @@
               <w:rPr>
                 <w:sz w:val="19"/>
               </w:rPr>
-              <w:t>14 Jan 2027</w:t>
+              <w:t>12 Jan 2027</w:t>
             </w:r>
           </w:p>
         </w:tc>
@@ -3434,7 +5631,7 @@
               <w:rPr>
                 <w:sz w:val="19"/>
               </w:rPr>
-              <w:t>31</w:t>
+              <w:t>38</w:t>
             </w:r>
           </w:p>
         </w:tc>
@@ -3492,7 +5689,7 @@
               <w:rPr>
                 <w:sz w:val="19"/>
               </w:rPr>
-              <w:t>14 Jan 2027</w:t>
+              <w:t>12 Jan 2027</w:t>
             </w:r>
           </w:p>
         </w:tc>
@@ -3506,7 +5703,7 @@
               <w:rPr>
                 <w:sz w:val="19"/>
               </w:rPr>
-              <w:t>31</w:t>
+              <w:t>38</w:t>
             </w:r>
           </w:p>
         </w:tc>
@@ -3564,7 +5761,7 @@
               <w:rPr>
                 <w:sz w:val="19"/>
               </w:rPr>
-              <w:t>28 Jan 2027</w:t>
+              <w:t>04 Feb 2027</w:t>
             </w:r>
           </w:p>
         </w:tc>
@@ -3622,7 +5819,7 @@
               <w:rPr>
                 <w:sz w:val="19"/>
               </w:rPr>
-              <w:t>31 Jan 2027</w:t>
+              <w:t>07 Feb 2027</w:t>
             </w:r>
           </w:p>
         </w:tc>
@@ -3636,7 +5833,7 @@
               <w:rPr>
                 <w:sz w:val="19"/>
               </w:rPr>
-              <w:t>18 Feb 2027</w:t>
+              <w:t>28 Feb 2027</w:t>
             </w:r>
           </w:p>
         </w:tc>
@@ -3694,7 +5891,7 @@
               <w:rPr>
                 <w:sz w:val="19"/>
               </w:rPr>
-              <w:t>21 Feb 2027</w:t>
+              <w:t>01 Mar 2027</w:t>
             </w:r>
           </w:p>
         </w:tc>
@@ -3708,7 +5905,7 @@
               <w:rPr>
                 <w:sz w:val="19"/>
               </w:rPr>
-              <w:t>21 Mar 2027</w:t>
+              <w:t>28 Mar 2027</w:t>
             </w:r>
           </w:p>
         </w:tc>
@@ -3766,7 +5963,7 @@
               <w:rPr>
                 <w:sz w:val="19"/>
               </w:rPr>
-              <w:t>18 Jul 2028</w:t>
+              <w:t>16 Aug 2028</w:t>
             </w:r>
           </w:p>
         </w:tc>
@@ -3780,7 +5977,7 @@
               <w:rPr>
                 <w:sz w:val="19"/>
               </w:rPr>
-              <w:t>31 Jul 2028</w:t>
+              <w:t>27 Aug 2028</w:t>
             </w:r>
           </w:p>
         </w:tc>
@@ -3838,7 +6035,7 @@
               <w:rPr>
                 <w:sz w:val="19"/>
               </w:rPr>
-              <w:t>01 Aug 2028</w:t>
+              <w:t>28 Aug 2028</w:t>
             </w:r>
           </w:p>
         </w:tc>
@@ -3852,7 +6049,7 @@
               <w:rPr>
                 <w:sz w:val="19"/>
               </w:rPr>
-              <w:t>13 Aug 2028</w:t>
+              <w:t>10 Sep 2028</w:t>
             </w:r>
           </w:p>
         </w:tc>
@@ -3910,7 +6107,7 @@
               <w:rPr>
                 <w:sz w:val="19"/>
               </w:rPr>
-              <w:t>14 Aug 2028</w:t>
+              <w:t>11 Sep 2028</w:t>
             </w:r>
           </w:p>
         </w:tc>
@@ -3924,7 +6121,7 @@
               <w:rPr>
                 <w:sz w:val="19"/>
               </w:rPr>
-              <w:t>04 Sep 2028</w:t>
+              <w:t>02 Oct 2028</w:t>
             </w:r>
           </w:p>
         </w:tc>
@@ -3982,7 +6179,7 @@
               <w:rPr>
                 <w:sz w:val="19"/>
               </w:rPr>
-              <w:t>05 Sep 2028</w:t>
+              <w:t>03 Oct 2028</w:t>
             </w:r>
           </w:p>
         </w:tc>
@@ -3996,7 +6193,7 @@
               <w:rPr>
                 <w:sz w:val="19"/>
               </w:rPr>
-              <w:t>09 Oct 2028</w:t>
+              <w:t>07 Nov 2028</w:t>
             </w:r>
           </w:p>
         </w:tc>
@@ -4054,7 +6251,7 @@
               <w:rPr>
                 <w:sz w:val="19"/>
               </w:rPr>
-              <w:t>18 Sep 2028</w:t>
+              <w:t>17 Oct 2028</w:t>
             </w:r>
           </w:p>
         </w:tc>
@@ -4068,7 +6265,7 @@
               <w:rPr>
                 <w:sz w:val="19"/>
               </w:rPr>
-              <w:t>26 Oct 2028</w:t>
+              <w:t>23 Nov 2028</w:t>
             </w:r>
           </w:p>
         </w:tc>
@@ -4126,7 +6323,7 @@
               <w:rPr>
                 <w:sz w:val="19"/>
               </w:rPr>
-              <w:t>10 Oct 2028</w:t>
+              <w:t>08 Nov 2028</w:t>
             </w:r>
           </w:p>
         </w:tc>
@@ -4140,7 +6337,7 @@
               <w:rPr>
                 <w:sz w:val="19"/>
               </w:rPr>
-              <w:t>30 Oct 2028</w:t>
+              <w:t>28 Nov 2028</w:t>
             </w:r>
           </w:p>
         </w:tc>
@@ -4154,7 +6351,7 @@
               <w:rPr>
                 <w:sz w:val="19"/>
               </w:rPr>
-              <w:t>34</w:t>
+              <w:t>33</w:t>
             </w:r>
           </w:p>
         </w:tc>
@@ -4198,7 +6395,7 @@
               <w:rPr>
                 <w:sz w:val="19"/>
               </w:rPr>
-              <w:t>10 Oct 2028</w:t>
+              <w:t>08 Nov 2028</w:t>
             </w:r>
           </w:p>
         </w:tc>
@@ -4212,7 +6409,7 @@
               <w:rPr>
                 <w:sz w:val="19"/>
               </w:rPr>
-              <w:t>26 Oct 2028</w:t>
+              <w:t>23 Nov 2028</w:t>
             </w:r>
           </w:p>
         </w:tc>
@@ -4270,7 +6467,7 @@
               <w:rPr>
                 <w:sz w:val="19"/>
               </w:rPr>
-              <w:t>29 Oct 2028</w:t>
+              <w:t>26 Nov 2028</w:t>
             </w:r>
           </w:p>
         </w:tc>
@@ -4284,7 +6481,7 @@
               <w:rPr>
                 <w:sz w:val="19"/>
               </w:rPr>
-              <w:t>16 Nov 2028</w:t>
+              <w:t>14 Dec 2028</w:t>
             </w:r>
           </w:p>
         </w:tc>
@@ -4342,7 +6539,7 @@
               <w:rPr>
                 <w:sz w:val="19"/>
               </w:rPr>
-              <w:t>29 Oct 2028</w:t>
+              <w:t>26 Nov 2028</w:t>
             </w:r>
           </w:p>
         </w:tc>
@@ -4356,7 +6553,7 @@
               <w:rPr>
                 <w:sz w:val="19"/>
               </w:rPr>
-              <w:t>16 Nov 2028</w:t>
+              <w:t>14 Dec 2028</w:t>
             </w:r>
           </w:p>
         </w:tc>
@@ -4414,7 +6611,7 @@
               <w:rPr>
                 <w:sz w:val="19"/>
               </w:rPr>
-              <w:t>19 Nov 2028</w:t>
+              <w:t>17 Dec 2028</w:t>
             </w:r>
           </w:p>
         </w:tc>
@@ -4428,7 +6625,7 @@
               <w:rPr>
                 <w:sz w:val="19"/>
               </w:rPr>
-              <w:t>04 Mar 2029</w:t>
+              <w:t>27 Feb 2029</w:t>
             </w:r>
           </w:p>
         </w:tc>
@@ -4486,7 +6683,7 @@
               <w:rPr>
                 <w:sz w:val="19"/>
               </w:rPr>
-              <w:t>19 Nov 2028</w:t>
+              <w:t>17 Dec 2028</w:t>
             </w:r>
           </w:p>
         </w:tc>
@@ -4500,7 +6697,7 @@
               <w:rPr>
                 <w:sz w:val="19"/>
               </w:rPr>
-              <w:t>04 Mar 2029</w:t>
+              <w:t>27 Feb 2029</w:t>
             </w:r>
           </w:p>
         </w:tc>
@@ -4558,7 +6755,7 @@
               <w:rPr>
                 <w:sz w:val="19"/>
               </w:rPr>
-              <w:t>19 Nov 2028</w:t>
+              <w:t>17 Dec 2028</w:t>
             </w:r>
           </w:p>
         </w:tc>
@@ -4572,7 +6769,7 @@
               <w:rPr>
                 <w:sz w:val="19"/>
               </w:rPr>
-              <w:t>04 Mar 2029</w:t>
+              <w:t>27 Feb 2029</w:t>
             </w:r>
           </w:p>
         </w:tc>
@@ -4630,7 +6827,7 @@
               <w:rPr>
                 <w:sz w:val="19"/>
               </w:rPr>
-              <w:t>19 Nov 2028</w:t>
+              <w:t>17 Dec 2028</w:t>
             </w:r>
           </w:p>
         </w:tc>
@@ -4644,7 +6841,7 @@
               <w:rPr>
                 <w:sz w:val="19"/>
               </w:rPr>
-              <w:t>04 Mar 2029</w:t>
+              <w:t>27 Feb 2029</w:t>
             </w:r>
           </w:p>
         </w:tc>
@@ -4702,7 +6899,7 @@
               <w:rPr>
                 <w:sz w:val="19"/>
               </w:rPr>
-              <w:t>05 Mar 2029</w:t>
+              <w:t>28 Feb 2029</w:t>
             </w:r>
           </w:p>
         </w:tc>
@@ -4716,7 +6913,7 @@
               <w:rPr>
                 <w:sz w:val="19"/>
               </w:rPr>
-              <w:t>18 Mar 2029</w:t>
+              <w:t>13 Mar 2029</w:t>
             </w:r>
           </w:p>
         </w:tc>
@@ -4774,7 +6971,7 @@
               <w:rPr>
                 <w:sz w:val="19"/>
               </w:rPr>
-              <w:t>19 Mar 2029</w:t>
+              <w:t>14 Mar 2029</w:t>
             </w:r>
           </w:p>
         </w:tc>
@@ -4788,7 +6985,7 @@
               <w:rPr>
                 <w:sz w:val="19"/>
               </w:rPr>
-              <w:t>29 Apr 2029</w:t>
+              <w:t>12 Apr 2029</w:t>
             </w:r>
           </w:p>
         </w:tc>
@@ -4846,7 +7043,7 @@
               <w:rPr>
                 <w:sz w:val="19"/>
               </w:rPr>
-              <w:t>30 Apr 2029</w:t>
+              <w:t>15 Apr 2029</w:t>
             </w:r>
           </w:p>
         </w:tc>
@@ -4860,7 +7057,7 @@
               <w:rPr>
                 <w:sz w:val="19"/>
               </w:rPr>
-              <w:t>06 May 2029</w:t>
+              <w:t>19 Apr 2029</w:t>
             </w:r>
           </w:p>
         </w:tc>
@@ -4918,7 +7115,7 @@
               <w:rPr>
                 <w:sz w:val="19"/>
               </w:rPr>
-              <w:t>07 May 2029</w:t>
+              <w:t>29 Apr 2029</w:t>
             </w:r>
           </w:p>
         </w:tc>
@@ -4932,7 +7129,7 @@
               <w:rPr>
                 <w:sz w:val="19"/>
               </w:rPr>
-              <w:t>21 May 2029</w:t>
+              <w:t>15 May 2029</w:t>
             </w:r>
           </w:p>
         </w:tc>

</xml_diff>

<commit_message>
Logic: stations are not linked to each other; every station links to mobilization only
Co-Authored-By: Claude Sonnet 5.5 <noreply@anthropic.com>
Claude-Session: https://claude.ai/code/session_01DZdGPWRxvKXCnMyT6qFPZb
</commit_message>
<xml_diff>
--- a/p6/0580_Schedule_Narrative.docx
+++ b/p6/0580_Schedule_Narrative.docx
@@ -67,7 +67,7 @@
         <w:rPr>
           <w:b w:val="0"/>
         </w:rPr>
-        <w:t>This narrative describes the baseline programme (Rev 1) of project 0580-Security Technology Salutation after eliminating Passenger Checking Roles, covering 14 stations on three railways (North South Railway, East West Railway and Haramain High Speed Rail). It is delivered as a Primavera P6 24 XER file with 591 activities (500 tasks and 91 milestones) and 913 logic links. It runs from the Notice to Proceed milestone on 01 Nov 2026 to the contract completion milestone on 31 Oct 2029.</w:t>
+        <w:t>This narrative describes the baseline programme (Rev 1) of project 0580-Security Technology Salutation after eliminating Passenger Checking Roles, covering 14 stations on three railways (North South Railway, East West Railway and Haramain High Speed Rail). It is delivered as a Primavera P6 24 XER file with 591 activities (500 tasks and 91 milestones) and 912 logic links. It runs from the Notice to Proceed milestone on 01 Nov 2026 to the contract completion milestone on 31 Oct 2029.</w:t>
       </w:r>
     </w:p>
     <w:p>
@@ -559,7 +559,7 @@
               <w:rPr>
                 <w:sz w:val="19"/>
               </w:rPr>
-              <w:t>28 Mar 2027</w:t>
+              <w:t>11 Feb 2027</w:t>
             </w:r>
           </w:p>
         </w:tc>
@@ -986,7 +986,7 @@
         <w:rPr>
           <w:b w:val="0"/>
         </w:rPr>
-        <w:t>Priority 1: Makkah (Haramain) and Riyadh (Thumamah, North South Railway). Their permits are applied for first and their enabling and civil works run in parallel with design. Equipment is manufactured only after SAR approval of the engineering (milestone MS3), so no equipment is ordered before approval. Priority 2: Riyadh (Malaz, East West Railway), permitted in the same two months. The remaining stations follow in waves after the detailed baseline is approved, each with the same four month design.</w:t>
+        <w:t>Priority 1: Makkah (Haramain) and Riyadh (Thumamah, North South Railway). Their permits are applied for first and their enabling and civil works run in parallel with design. Equipment is manufactured only after SAR approval of the engineering (milestone MS3), so no equipment is ordered before approval. Priority 2: Riyadh (Malaz, East West Railway), permitted in the same two months. The remaining stations start in waves counted from the end of mobilization, each with the same four month design.</w:t>
       </w:r>
     </w:p>
     <w:tbl>
@@ -1359,7 +1359,7 @@
               <w:rPr>
                 <w:sz w:val="19"/>
               </w:rPr>
-              <w:t>29 Mar 2027</w:t>
+              <w:t>01 Mar 2027</w:t>
             </w:r>
           </w:p>
         </w:tc>
@@ -1373,7 +1373,7 @@
               <w:rPr>
                 <w:sz w:val="19"/>
               </w:rPr>
-              <w:t>23 Aug 2028</w:t>
+              <w:t>26 Jul 2028</w:t>
             </w:r>
           </w:p>
         </w:tc>
@@ -5184,7 +5184,7 @@
         <w:rPr>
           <w:b w:val="0"/>
         </w:rPr>
-        <w:t>Relationships are mainly finish to start, with a few start to start and finish to finish links. There are no date constraints. Priority stations start first; the other stations follow in waves calibrated so the last station completes inside the 36 month term. The only activity without a predecessor is NTP, and the only activity without a successor is contract completion.</w:t>
+        <w:t>Relationships are mainly finish to start, with a few start to start and finish to finish links. There are no date constraints. Stations are not linked to each other and the railway lines are not linked to each other: every station is linked only to the mobilization (milestone PRJ-M1150), and the other stations start at a lag from it, in waves calibrated so the last station completes inside the 36 month term. Station completions feed the closeout and contract completion only. The only activity without a predecessor is NTP, and the only activity without a successor is contract completion.</w:t>
       </w:r>
     </w:p>
     <w:p>
@@ -5244,7 +5244,7 @@
         <w:rPr>
           <w:b w:val="0"/>
         </w:rPr>
-        <w:t>The contract completion milestone is held by the 36 month term, so no activity has zero float against it. The longest physical path finishes 21 working days before the contract end date, and that margin is the project float. 29 tasks sit on this longest path and 8 more are within 20 working days of it. The first 25 in date order are listed below.</w:t>
+        <w:t>The contract completion milestone is held by the 36 month term, so no activity has zero float against it. The longest physical path finishes 21 working days before the contract end date, and that margin is the project float. 26 tasks sit on this longest path and 6 more are within 20 working days of it. The first 25 in date order are listed below.</w:t>
       </w:r>
     </w:p>
     <w:tbl>
@@ -5575,7 +5575,7 @@
               <w:rPr>
                 <w:sz w:val="19"/>
               </w:rPr>
-              <w:t>NRY-E1010</w:t>
+              <w:t>NQR-E1010</w:t>
             </w:r>
           </w:p>
         </w:tc>
@@ -5589,7 +5589,7 @@
               <w:rPr>
                 <w:sz w:val="19"/>
               </w:rPr>
-              <w:t>Survey: submittal of site survey and as-found report - Riyadh (Thumamah)</w:t>
+              <w:t>Survey: submittal of site survey and as-found report - Al Qurayyat</w:t>
             </w:r>
           </w:p>
         </w:tc>
@@ -5603,7 +5603,7 @@
               <w:rPr>
                 <w:sz w:val="19"/>
               </w:rPr>
-              <w:t>03 Jan 2027</w:t>
+              <w:t>16 Aug 2028</w:t>
             </w:r>
           </w:p>
         </w:tc>
@@ -5617,7 +5617,7 @@
               <w:rPr>
                 <w:sz w:val="19"/>
               </w:rPr>
-              <w:t>12 Jan 2027</w:t>
+              <w:t>27 Aug 2028</w:t>
             </w:r>
           </w:p>
         </w:tc>
@@ -5631,7 +5631,7 @@
               <w:rPr>
                 <w:sz w:val="19"/>
               </w:rPr>
-              <w:t>38</w:t>
+              <w:t>21</w:t>
             </w:r>
           </w:p>
         </w:tc>
@@ -5647,7 +5647,7 @@
               <w:rPr>
                 <w:sz w:val="19"/>
               </w:rPr>
-              <w:t>ERY-E1010</w:t>
+              <w:t>NQR-E1030</w:t>
             </w:r>
           </w:p>
         </w:tc>
@@ -5661,7 +5661,7 @@
               <w:rPr>
                 <w:sz w:val="19"/>
               </w:rPr>
-              <w:t>Survey: submittal of site survey and as-found report - Riyadh (Malaz)</w:t>
+              <w:t>Concept design: submittal - Al Qurayyat</w:t>
             </w:r>
           </w:p>
         </w:tc>
@@ -5675,7 +5675,7 @@
               <w:rPr>
                 <w:sz w:val="19"/>
               </w:rPr>
-              <w:t>03 Jan 2027</w:t>
+              <w:t>28 Aug 2028</w:t>
             </w:r>
           </w:p>
         </w:tc>
@@ -5689,7 +5689,7 @@
               <w:rPr>
                 <w:sz w:val="19"/>
               </w:rPr>
-              <w:t>12 Jan 2027</w:t>
+              <w:t>10 Sep 2028</w:t>
             </w:r>
           </w:p>
         </w:tc>
@@ -5703,7 +5703,7 @@
               <w:rPr>
                 <w:sz w:val="19"/>
               </w:rPr>
-              <w:t>38</w:t>
+              <w:t>21</w:t>
             </w:r>
           </w:p>
         </w:tc>
@@ -5719,7 +5719,7 @@
               <w:rPr>
                 <w:sz w:val="19"/>
               </w:rPr>
-              <w:t>HMK-E1010</w:t>
+              <w:t>NQR-E1050</w:t>
             </w:r>
           </w:p>
         </w:tc>
@@ -5733,7 +5733,7 @@
               <w:rPr>
                 <w:sz w:val="19"/>
               </w:rPr>
-              <w:t>Survey: submittal of site survey and as-found report - Makkah</w:t>
+              <w:t>Preliminary design: submittal - Al Qurayyat</w:t>
             </w:r>
           </w:p>
         </w:tc>
@@ -5747,7 +5747,7 @@
               <w:rPr>
                 <w:sz w:val="19"/>
               </w:rPr>
-              <w:t>03 Jan 2027</w:t>
+              <w:t>11 Sep 2028</w:t>
             </w:r>
           </w:p>
         </w:tc>
@@ -5761,7 +5761,7 @@
               <w:rPr>
                 <w:sz w:val="19"/>
               </w:rPr>
-              <w:t>04 Feb 2027</w:t>
+              <w:t>02 Oct 2028</w:t>
             </w:r>
           </w:p>
         </w:tc>
@@ -5791,7 +5791,7 @@
               <w:rPr>
                 <w:sz w:val="19"/>
               </w:rPr>
-              <w:t>PRJ-A2010</w:t>
+              <w:t>NQR-E1070</w:t>
             </w:r>
           </w:p>
         </w:tc>
@@ -5805,7 +5805,7 @@
               <w:rPr>
                 <w:sz w:val="19"/>
               </w:rPr>
-              <w:t>Detailed baseline programme (within 21 days after survey)</w:t>
+              <w:t>Detailed design: submittal (drawings, BOQ, data sheets) - Al Qurayyat</w:t>
             </w:r>
           </w:p>
         </w:tc>
@@ -5819,7 +5819,7 @@
               <w:rPr>
                 <w:sz w:val="19"/>
               </w:rPr>
-              <w:t>07 Feb 2027</w:t>
+              <w:t>03 Oct 2028</w:t>
             </w:r>
           </w:p>
         </w:tc>
@@ -5833,7 +5833,7 @@
               <w:rPr>
                 <w:sz w:val="19"/>
               </w:rPr>
-              <w:t>28 Feb 2027</w:t>
+              <w:t>07 Nov 2028</w:t>
             </w:r>
           </w:p>
         </w:tc>
@@ -5863,7 +5863,7 @@
               <w:rPr>
                 <w:sz w:val="19"/>
               </w:rPr>
-              <w:t>PRJ-A2020</w:t>
+              <w:t>NQR-E1110</w:t>
             </w:r>
           </w:p>
         </w:tc>
@@ -5877,7 +5877,7 @@
               <w:rPr>
                 <w:sz w:val="19"/>
               </w:rPr>
-              <w:t>SAR review and approval of detailed baseline</w:t>
+              <w:t>HCIS Stage 3 and 4 documents: preparation - Al Qurayyat</w:t>
             </w:r>
           </w:p>
         </w:tc>
@@ -5891,7 +5891,7 @@
               <w:rPr>
                 <w:sz w:val="19"/>
               </w:rPr>
-              <w:t>01 Mar 2027</w:t>
+              <w:t>17 Oct 2028</w:t>
             </w:r>
           </w:p>
         </w:tc>
@@ -5905,7 +5905,7 @@
               <w:rPr>
                 <w:sz w:val="19"/>
               </w:rPr>
-              <w:t>28 Mar 2027</w:t>
+              <w:t>23 Nov 2028</w:t>
             </w:r>
           </w:p>
         </w:tc>
@@ -5935,7 +5935,7 @@
               <w:rPr>
                 <w:sz w:val="19"/>
               </w:rPr>
-              <w:t>NQR-E1010</w:t>
+              <w:t>NQR-E1080</w:t>
             </w:r>
           </w:p>
         </w:tc>
@@ -5949,7 +5949,7 @@
               <w:rPr>
                 <w:sz w:val="19"/>
               </w:rPr>
-              <w:t>Survey: submittal of site survey and as-found report - Al Qurayyat</w:t>
+              <w:t>Detailed design: SAR review and approval - Al Qurayyat</w:t>
             </w:r>
           </w:p>
         </w:tc>
@@ -5963,7 +5963,7 @@
               <w:rPr>
                 <w:sz w:val="19"/>
               </w:rPr>
-              <w:t>16 Aug 2028</w:t>
+              <w:t>08 Nov 2028</w:t>
             </w:r>
           </w:p>
         </w:tc>
@@ -5977,7 +5977,7 @@
               <w:rPr>
                 <w:sz w:val="19"/>
               </w:rPr>
-              <w:t>27 Aug 2028</w:t>
+              <w:t>28 Nov 2028</w:t>
             </w:r>
           </w:p>
         </w:tc>
@@ -5991,7 +5991,7 @@
               <w:rPr>
                 <w:sz w:val="19"/>
               </w:rPr>
-              <w:t>21</w:t>
+              <w:t>33</w:t>
             </w:r>
           </w:p>
         </w:tc>
@@ -6007,7 +6007,7 @@
               <w:rPr>
                 <w:sz w:val="19"/>
               </w:rPr>
-              <w:t>NQR-E1030</w:t>
+              <w:t>NQR-E1090</w:t>
             </w:r>
           </w:p>
         </w:tc>
@@ -6021,7 +6021,7 @@
               <w:rPr>
                 <w:sz w:val="19"/>
               </w:rPr>
-              <w:t>Concept design: submittal - Al Qurayyat</w:t>
+              <w:t>IFC and shop drawings: submittal - Al Qurayyat</w:t>
             </w:r>
           </w:p>
         </w:tc>
@@ -6035,7 +6035,7 @@
               <w:rPr>
                 <w:sz w:val="19"/>
               </w:rPr>
-              <w:t>28 Aug 2028</w:t>
+              <w:t>08 Nov 2028</w:t>
             </w:r>
           </w:p>
         </w:tc>
@@ -6049,7 +6049,7 @@
               <w:rPr>
                 <w:sz w:val="19"/>
               </w:rPr>
-              <w:t>10 Sep 2028</w:t>
+              <w:t>23 Nov 2028</w:t>
             </w:r>
           </w:p>
         </w:tc>
@@ -6079,7 +6079,7 @@
               <w:rPr>
                 <w:sz w:val="19"/>
               </w:rPr>
-              <w:t>NQR-E1050</w:t>
+              <w:t>NQR-E1100</w:t>
             </w:r>
           </w:p>
         </w:tc>
@@ -6093,7 +6093,7 @@
               <w:rPr>
                 <w:sz w:val="19"/>
               </w:rPr>
-              <w:t>Preliminary design: submittal - Al Qurayyat</w:t>
+              <w:t>IFC and shop drawings: SAR approval and release - Al Qurayyat</w:t>
             </w:r>
           </w:p>
         </w:tc>
@@ -6107,7 +6107,7 @@
               <w:rPr>
                 <w:sz w:val="19"/>
               </w:rPr>
-              <w:t>11 Sep 2028</w:t>
+              <w:t>26 Nov 2028</w:t>
             </w:r>
           </w:p>
         </w:tc>
@@ -6121,7 +6121,7 @@
               <w:rPr>
                 <w:sz w:val="19"/>
               </w:rPr>
-              <w:t>02 Oct 2028</w:t>
+              <w:t>14 Dec 2028</w:t>
             </w:r>
           </w:p>
         </w:tc>
@@ -6151,7 +6151,7 @@
               <w:rPr>
                 <w:sz w:val="19"/>
               </w:rPr>
-              <w:t>NQR-E1070</w:t>
+              <w:t>NQR-E1120</w:t>
             </w:r>
           </w:p>
         </w:tc>
@@ -6165,7 +6165,7 @@
               <w:rPr>
                 <w:sz w:val="19"/>
               </w:rPr>
-              <w:t>Detailed design: submittal (drawings, BOQ, data sheets) - Al Qurayyat</w:t>
+              <w:t>HCIS Stage 3 and 4 documents: SAR final review and HCIS submission - Al Qurayyat</w:t>
             </w:r>
           </w:p>
         </w:tc>
@@ -6179,7 +6179,7 @@
               <w:rPr>
                 <w:sz w:val="19"/>
               </w:rPr>
-              <w:t>03 Oct 2028</w:t>
+              <w:t>26 Nov 2028</w:t>
             </w:r>
           </w:p>
         </w:tc>
@@ -6193,7 +6193,7 @@
               <w:rPr>
                 <w:sz w:val="19"/>
               </w:rPr>
-              <w:t>07 Nov 2028</w:t>
+              <w:t>14 Dec 2028</w:t>
             </w:r>
           </w:p>
         </w:tc>
@@ -6223,7 +6223,7 @@
               <w:rPr>
                 <w:sz w:val="19"/>
               </w:rPr>
-              <w:t>NQR-E1110</w:t>
+              <w:t>NQR-P1010</w:t>
             </w:r>
           </w:p>
         </w:tc>
@@ -6237,7 +6237,7 @@
               <w:rPr>
                 <w:sz w:val="19"/>
               </w:rPr>
-              <w:t>HCIS Stage 3 and 4 documents: preparation - Al Qurayyat</w:t>
+              <w:t>Manufacture CCTV cameras and analytics - Al Qurayyat</w:t>
             </w:r>
           </w:p>
         </w:tc>
@@ -6251,7 +6251,7 @@
               <w:rPr>
                 <w:sz w:val="19"/>
               </w:rPr>
-              <w:t>17 Oct 2028</w:t>
+              <w:t>17 Dec 2028</w:t>
             </w:r>
           </w:p>
         </w:tc>
@@ -6265,7 +6265,7 @@
               <w:rPr>
                 <w:sz w:val="19"/>
               </w:rPr>
-              <w:t>23 Nov 2028</w:t>
+              <w:t>27 Feb 2029</w:t>
             </w:r>
           </w:p>
         </w:tc>
@@ -6295,7 +6295,7 @@
               <w:rPr>
                 <w:sz w:val="19"/>
               </w:rPr>
-              <w:t>NQR-E1080</w:t>
+              <w:t>NQR-P1020</w:t>
             </w:r>
           </w:p>
         </w:tc>
@@ -6309,7 +6309,7 @@
               <w:rPr>
                 <w:sz w:val="19"/>
               </w:rPr>
-              <w:t>Detailed design: SAR review and approval - Al Qurayyat</w:t>
+              <w:t>Manufacture video management servers, storage and video wall - Al Qurayyat</w:t>
             </w:r>
           </w:p>
         </w:tc>
@@ -6323,7 +6323,7 @@
               <w:rPr>
                 <w:sz w:val="19"/>
               </w:rPr>
-              <w:t>08 Nov 2028</w:t>
+              <w:t>17 Dec 2028</w:t>
             </w:r>
           </w:p>
         </w:tc>
@@ -6337,7 +6337,7 @@
               <w:rPr>
                 <w:sz w:val="19"/>
               </w:rPr>
-              <w:t>28 Nov 2028</w:t>
+              <w:t>27 Feb 2029</w:t>
             </w:r>
           </w:p>
         </w:tc>
@@ -6351,7 +6351,7 @@
               <w:rPr>
                 <w:sz w:val="19"/>
               </w:rPr>
-              <w:t>33</w:t>
+              <w:t>21</w:t>
             </w:r>
           </w:p>
         </w:tc>
@@ -6367,7 +6367,7 @@
               <w:rPr>
                 <w:sz w:val="19"/>
               </w:rPr>
-              <w:t>NQR-E1090</w:t>
+              <w:t>NQR-P1030</w:t>
             </w:r>
           </w:p>
         </w:tc>
@@ -6381,7 +6381,7 @@
               <w:rPr>
                 <w:sz w:val="19"/>
               </w:rPr>
-              <w:t>IFC and shop drawings: submittal - Al Qurayyat</w:t>
+              <w:t>Manufacture access control and intercom equipment - Al Qurayyat</w:t>
             </w:r>
           </w:p>
         </w:tc>
@@ -6395,7 +6395,7 @@
               <w:rPr>
                 <w:sz w:val="19"/>
               </w:rPr>
-              <w:t>08 Nov 2028</w:t>
+              <w:t>17 Dec 2028</w:t>
             </w:r>
           </w:p>
         </w:tc>
@@ -6409,7 +6409,7 @@
               <w:rPr>
                 <w:sz w:val="19"/>
               </w:rPr>
-              <w:t>23 Nov 2028</w:t>
+              <w:t>27 Feb 2029</w:t>
             </w:r>
           </w:p>
         </w:tc>
@@ -6439,7 +6439,7 @@
               <w:rPr>
                 <w:sz w:val="19"/>
               </w:rPr>
-              <w:t>NQR-E1100</w:t>
+              <w:t>NQR-P1040</w:t>
             </w:r>
           </w:p>
         </w:tc>
@@ -6453,7 +6453,7 @@
               <w:rPr>
                 <w:sz w:val="19"/>
               </w:rPr>
-              <w:t>IFC and shop drawings: SAR approval and release - Al Qurayyat</w:t>
+              <w:t>Manufacture UPS, network switches and field cabinets - Al Qurayyat</w:t>
             </w:r>
           </w:p>
         </w:tc>
@@ -6467,7 +6467,7 @@
               <w:rPr>
                 <w:sz w:val="19"/>
               </w:rPr>
-              <w:t>26 Nov 2028</w:t>
+              <w:t>17 Dec 2028</w:t>
             </w:r>
           </w:p>
         </w:tc>
@@ -6481,7 +6481,7 @@
               <w:rPr>
                 <w:sz w:val="19"/>
               </w:rPr>
-              <w:t>14 Dec 2028</w:t>
+              <w:t>27 Feb 2029</w:t>
             </w:r>
           </w:p>
         </w:tc>
@@ -6511,7 +6511,7 @@
               <w:rPr>
                 <w:sz w:val="19"/>
               </w:rPr>
-              <w:t>NQR-E1120</w:t>
+              <w:t>NQR-P1050</w:t>
             </w:r>
           </w:p>
         </w:tc>
@@ -6525,7 +6525,7 @@
               <w:rPr>
                 <w:sz w:val="19"/>
               </w:rPr>
-              <w:t>HCIS Stage 3 and 4 documents: SAR final review and HCIS submission - Al Qurayyat</w:t>
+              <w:t>Factory acceptance test at vendor premises - Al Qurayyat</w:t>
             </w:r>
           </w:p>
         </w:tc>
@@ -6539,7 +6539,7 @@
               <w:rPr>
                 <w:sz w:val="19"/>
               </w:rPr>
-              <w:t>26 Nov 2028</w:t>
+              <w:t>28 Feb 2029</w:t>
             </w:r>
           </w:p>
         </w:tc>
@@ -6553,7 +6553,7 @@
               <w:rPr>
                 <w:sz w:val="19"/>
               </w:rPr>
-              <w:t>14 Dec 2028</w:t>
+              <w:t>13 Mar 2029</w:t>
             </w:r>
           </w:p>
         </w:tc>
@@ -6583,7 +6583,7 @@
               <w:rPr>
                 <w:sz w:val="19"/>
               </w:rPr>
-              <w:t>NQR-P1010</w:t>
+              <w:t>NQR-P1060</w:t>
             </w:r>
           </w:p>
         </w:tc>
@@ -6597,7 +6597,7 @@
               <w:rPr>
                 <w:sz w:val="19"/>
               </w:rPr>
-              <w:t>Manufacture CCTV cameras and analytics - Al Qurayyat</w:t>
+              <w:t>Shipping and customs clearance - Al Qurayyat</w:t>
             </w:r>
           </w:p>
         </w:tc>
@@ -6611,7 +6611,7 @@
               <w:rPr>
                 <w:sz w:val="19"/>
               </w:rPr>
-              <w:t>17 Dec 2028</w:t>
+              <w:t>14 Mar 2029</w:t>
             </w:r>
           </w:p>
         </w:tc>
@@ -6625,7 +6625,7 @@
               <w:rPr>
                 <w:sz w:val="19"/>
               </w:rPr>
-              <w:t>27 Feb 2029</w:t>
+              <w:t>12 Apr 2029</w:t>
             </w:r>
           </w:p>
         </w:tc>
@@ -6655,7 +6655,7 @@
               <w:rPr>
                 <w:sz w:val="19"/>
               </w:rPr>
-              <w:t>NQR-P1020</w:t>
+              <w:t>NQR-P1070</w:t>
             </w:r>
           </w:p>
         </w:tc>
@@ -6669,7 +6669,7 @@
               <w:rPr>
                 <w:sz w:val="19"/>
               </w:rPr>
-              <w:t>Manufacture video management servers, storage and video wall - Al Qurayyat</w:t>
+              <w:t>Delivery to station and receiving inspection - Al Qurayyat</w:t>
             </w:r>
           </w:p>
         </w:tc>
@@ -6683,7 +6683,7 @@
               <w:rPr>
                 <w:sz w:val="19"/>
               </w:rPr>
-              <w:t>17 Dec 2028</w:t>
+              <w:t>15 Apr 2029</w:t>
             </w:r>
           </w:p>
         </w:tc>
@@ -6697,7 +6697,7 @@
               <w:rPr>
                 <w:sz w:val="19"/>
               </w:rPr>
-              <w:t>27 Feb 2029</w:t>
+              <w:t>19 Apr 2029</w:t>
             </w:r>
           </w:p>
         </w:tc>
@@ -6727,7 +6727,7 @@
               <w:rPr>
                 <w:sz w:val="19"/>
               </w:rPr>
-              <w:t>NQR-P1030</w:t>
+              <w:t>NQR-C2010</w:t>
             </w:r>
           </w:p>
         </w:tc>
@@ -6741,7 +6741,7 @@
               <w:rPr>
                 <w:sz w:val="19"/>
               </w:rPr>
-              <w:t>Manufacture access control and intercom equipment - Al Qurayyat</w:t>
+              <w:t>Install UPS, network switches and field cabinets - Al Qurayyat</w:t>
             </w:r>
           </w:p>
         </w:tc>
@@ -6755,7 +6755,7 @@
               <w:rPr>
                 <w:sz w:val="19"/>
               </w:rPr>
-              <w:t>17 Dec 2028</w:t>
+              <w:t>29 Apr 2029</w:t>
             </w:r>
           </w:p>
         </w:tc>
@@ -6769,7 +6769,7 @@
               <w:rPr>
                 <w:sz w:val="19"/>
               </w:rPr>
-              <w:t>27 Feb 2029</w:t>
+              <w:t>15 May 2029</w:t>
             </w:r>
           </w:p>
         </w:tc>
@@ -6799,7 +6799,7 @@
               <w:rPr>
                 <w:sz w:val="19"/>
               </w:rPr>
-              <w:t>NQR-P1040</w:t>
+              <w:t>NQR-C2020</w:t>
             </w:r>
           </w:p>
         </w:tc>
@@ -6813,7 +6813,7 @@
               <w:rPr>
                 <w:sz w:val="19"/>
               </w:rPr>
-              <w:t>Manufacture UPS, network switches and field cabinets - Al Qurayyat</w:t>
+              <w:t>Cabling and termination (power, fibre, data) - Al Qurayyat</w:t>
             </w:r>
           </w:p>
         </w:tc>
@@ -6827,7 +6827,7 @@
               <w:rPr>
                 <w:sz w:val="19"/>
               </w:rPr>
-              <w:t>17 Dec 2028</w:t>
+              <w:t>03 May 2029</w:t>
             </w:r>
           </w:p>
         </w:tc>
@@ -6841,7 +6841,7 @@
               <w:rPr>
                 <w:sz w:val="19"/>
               </w:rPr>
-              <w:t>27 Feb 2029</w:t>
+              <w:t>03 Jun 2029</w:t>
             </w:r>
           </w:p>
         </w:tc>
@@ -6871,7 +6871,7 @@
               <w:rPr>
                 <w:sz w:val="19"/>
               </w:rPr>
-              <w:t>NQR-P1050</w:t>
+              <w:t>NQR-C2040</w:t>
             </w:r>
           </w:p>
         </w:tc>
@@ -6885,7 +6885,7 @@
               <w:rPr>
                 <w:sz w:val="19"/>
               </w:rPr>
-              <w:t>Factory acceptance test at vendor premises - Al Qurayyat</w:t>
+              <w:t>Install video management, video wall and control-room equipment - Al Qurayyat</w:t>
             </w:r>
           </w:p>
         </w:tc>
@@ -6899,7 +6899,7 @@
               <w:rPr>
                 <w:sz w:val="19"/>
               </w:rPr>
-              <w:t>28 Feb 2029</w:t>
+              <w:t>16 May 2029</w:t>
             </w:r>
           </w:p>
         </w:tc>
@@ -6913,7 +6913,7 @@
               <w:rPr>
                 <w:sz w:val="19"/>
               </w:rPr>
-              <w:t>13 Mar 2029</w:t>
+              <w:t>05 Jun 2029</w:t>
             </w:r>
           </w:p>
         </w:tc>
@@ -6927,7 +6927,7 @@
               <w:rPr>
                 <w:sz w:val="19"/>
               </w:rPr>
-              <w:t>21</w:t>
+              <w:t>37</w:t>
             </w:r>
           </w:p>
         </w:tc>
@@ -6943,7 +6943,7 @@
               <w:rPr>
                 <w:sz w:val="19"/>
               </w:rPr>
-              <w:t>NQR-P1060</w:t>
+              <w:t>NQR-C2050</w:t>
             </w:r>
           </w:p>
         </w:tc>
@@ -6957,7 +6957,7 @@
               <w:rPr>
                 <w:sz w:val="19"/>
               </w:rPr>
-              <w:t>Shipping and customs clearance - Al Qurayyat</w:t>
+              <w:t>Install access control and intercom - Al Qurayyat</w:t>
             </w:r>
           </w:p>
         </w:tc>
@@ -6971,7 +6971,7 @@
               <w:rPr>
                 <w:sz w:val="19"/>
               </w:rPr>
-              <w:t>14 Mar 2029</w:t>
+              <w:t>22 May 2029</w:t>
             </w:r>
           </w:p>
         </w:tc>
@@ -6985,7 +6985,7 @@
               <w:rPr>
                 <w:sz w:val="19"/>
               </w:rPr>
-              <w:t>12 Apr 2029</w:t>
+              <w:t>07 Jun 2029</w:t>
             </w:r>
           </w:p>
         </w:tc>
@@ -6999,7 +6999,7 @@
               <w:rPr>
                 <w:sz w:val="19"/>
               </w:rPr>
-              <w:t>21</w:t>
+              <w:t>35</w:t>
             </w:r>
           </w:p>
         </w:tc>
@@ -7015,7 +7015,7 @@
               <w:rPr>
                 <w:sz w:val="19"/>
               </w:rPr>
-              <w:t>NQR-P1070</w:t>
+              <w:t>NQR-C2030</w:t>
             </w:r>
           </w:p>
         </w:tc>
@@ -7029,7 +7029,7 @@
               <w:rPr>
                 <w:sz w:val="19"/>
               </w:rPr>
-              <w:t>Delivery to station and receiving inspection - Al Qurayyat</w:t>
+              <w:t>Install and aim CCTV cameras - Al Qurayyat</w:t>
             </w:r>
           </w:p>
         </w:tc>
@@ -7043,7 +7043,7 @@
               <w:rPr>
                 <w:sz w:val="19"/>
               </w:rPr>
-              <w:t>15 Apr 2029</w:t>
+              <w:t>04 Jun 2029</w:t>
             </w:r>
           </w:p>
         </w:tc>
@@ -7057,7 +7057,7 @@
               <w:rPr>
                 <w:sz w:val="19"/>
               </w:rPr>
-              <w:t>19 Apr 2029</w:t>
+              <w:t>27 Jun 2029</w:t>
             </w:r>
           </w:p>
         </w:tc>
@@ -7087,7 +7087,7 @@
               <w:rPr>
                 <w:sz w:val="19"/>
               </w:rPr>
-              <w:t>NQR-C2010</w:t>
+              <w:t>NQR-E1130</w:t>
             </w:r>
           </w:p>
         </w:tc>
@@ -7101,7 +7101,7 @@
               <w:rPr>
                 <w:sz w:val="19"/>
               </w:rPr>
-              <w:t>Install UPS, network switches and field cabinets - Al Qurayyat</w:t>
+              <w:t>As-built and O&amp;M documentation: submittal - Al Qurayyat</w:t>
             </w:r>
           </w:p>
         </w:tc>
@@ -7115,7 +7115,7 @@
               <w:rPr>
                 <w:sz w:val="19"/>
               </w:rPr>
-              <w:t>29 Apr 2029</w:t>
+              <w:t>28 Jun 2029</w:t>
             </w:r>
           </w:p>
         </w:tc>
@@ -7129,7 +7129,7 @@
               <w:rPr>
                 <w:sz w:val="19"/>
               </w:rPr>
-              <w:t>15 May 2029</w:t>
+              <w:t>06 Aug 2029</w:t>
             </w:r>
           </w:p>
         </w:tc>

</xml_diff>

<commit_message>
Logic: enabling works start after the HCIS documents (FS) at every station; construction follows enabling
Co-Authored-By: Claude Sonnet 5.5 <noreply@anthropic.com>
Claude-Session: https://claude.ai/code/session_01DZdGPWRxvKXCnMyT6qFPZb
</commit_message>
<xml_diff>
--- a/p6/0580_Schedule_Narrative.docx
+++ b/p6/0580_Schedule_Narrative.docx
@@ -188,7 +188,7 @@
               <w:rPr>
                 <w:sz w:val="19"/>
               </w:rPr>
-              <w:t>At every station: two months of mobilization and survey, then four months of design starting two months after the station mobilization starts; enabling works start in the last two months of design (two months of overlap). At the priority stations this is months 1-2, 3-6 and 5-6 of the project.</w:t>
+              <w:t>At every station: two months of mobilization and survey, then four months of design starting two months after the station mobilization starts; enabling works start after the HCIS documents (finish to start) and construction follows the enabling works. At the priority stations this is months 1-2 and 3-6 of the project for permit and design.</w:t>
             </w:r>
           </w:p>
         </w:tc>
@@ -916,7 +916,7 @@
               <w:rPr>
                 <w:sz w:val="19"/>
               </w:rPr>
-              <w:t>Enabling works start (month 5)</w:t>
+              <w:t>Enabling works (after the HCIS documents)</w:t>
             </w:r>
           </w:p>
         </w:tc>
@@ -930,7 +930,7 @@
               <w:rPr>
                 <w:sz w:val="19"/>
               </w:rPr>
-              <w:t>01 Mar 2027</w:t>
+              <w:t>02 May 2027</w:t>
             </w:r>
           </w:p>
         </w:tc>
@@ -944,7 +944,7 @@
               <w:rPr>
                 <w:sz w:val="19"/>
               </w:rPr>
-              <w:t>11 Apr 2027</w:t>
+              <w:t>10 Jun 2027</w:t>
             </w:r>
           </w:p>
         </w:tc>
@@ -958,7 +958,7 @@
               <w:rPr>
                 <w:sz w:val="19"/>
               </w:rPr>
-              <w:t>Site preparation, setting out, temporary works, cable routes, duct banks and plinths, in parallel with the last two months of design</w:t>
+              <w:t>Site preparation, setting out, temporary works, cable routes, duct banks and plinths, starting when the HCIS documents are approved (finish to start); civil construction follows</w:t>
             </w:r>
           </w:p>
         </w:tc>
@@ -5244,7 +5244,7 @@
         <w:rPr>
           <w:b w:val="0"/>
         </w:rPr>
-        <w:t>The contract completion milestone is held by the 36 month term, so no activity has zero float against it. The longest physical path finishes 21 working days before the contract end date, and that margin is the project float. 26 tasks sit on this longest path and 6 more are within 20 working days of it. The first 25 in date order are listed below.</w:t>
+        <w:t>The contract completion milestone is held by the 36 month term, so no activity has zero float against it. The longest physical path finishes 21 working days before the contract end date, and that margin is the project float. 26 tasks sit on this longest path and 10 more are within 20 working days of it. The first 25 in date order are listed below.</w:t>
       </w:r>
     </w:p>
     <w:tbl>
@@ -6223,7 +6223,7 @@
               <w:rPr>
                 <w:sz w:val="19"/>
               </w:rPr>
-              <w:t>NQR-P1010</w:t>
+              <w:t>NQR-X1010</w:t>
             </w:r>
           </w:p>
         </w:tc>
@@ -6237,7 +6237,7 @@
               <w:rPr>
                 <w:sz w:val="19"/>
               </w:rPr>
-              <w:t>Manufacture CCTV cameras and analytics - Al Qurayyat</w:t>
+              <w:t>Enabling works: site preparation, setting out, temporary works and utilities clearance - Al Qurayyat</w:t>
             </w:r>
           </w:p>
         </w:tc>
@@ -6265,7 +6265,7 @@
               <w:rPr>
                 <w:sz w:val="19"/>
               </w:rPr>
-              <w:t>27 Feb 2029</w:t>
+              <w:t>21 Dec 2028</w:t>
             </w:r>
           </w:p>
         </w:tc>
@@ -6279,7 +6279,7 @@
               <w:rPr>
                 <w:sz w:val="19"/>
               </w:rPr>
-              <w:t>21</w:t>
+              <w:t>34</w:t>
             </w:r>
           </w:p>
         </w:tc>
@@ -6295,7 +6295,7 @@
               <w:rPr>
                 <w:sz w:val="19"/>
               </w:rPr>
-              <w:t>NQR-P1020</w:t>
+              <w:t>NQR-P1010</w:t>
             </w:r>
           </w:p>
         </w:tc>
@@ -6309,7 +6309,7 @@
               <w:rPr>
                 <w:sz w:val="19"/>
               </w:rPr>
-              <w:t>Manufacture video management servers, storage and video wall - Al Qurayyat</w:t>
+              <w:t>Manufacture CCTV cameras and analytics - Al Qurayyat</w:t>
             </w:r>
           </w:p>
         </w:tc>
@@ -6367,7 +6367,7 @@
               <w:rPr>
                 <w:sz w:val="19"/>
               </w:rPr>
-              <w:t>NQR-P1030</w:t>
+              <w:t>NQR-P1020</w:t>
             </w:r>
           </w:p>
         </w:tc>
@@ -6381,7 +6381,7 @@
               <w:rPr>
                 <w:sz w:val="19"/>
               </w:rPr>
-              <w:t>Manufacture access control and intercom equipment - Al Qurayyat</w:t>
+              <w:t>Manufacture video management servers, storage and video wall - Al Qurayyat</w:t>
             </w:r>
           </w:p>
         </w:tc>
@@ -6439,7 +6439,7 @@
               <w:rPr>
                 <w:sz w:val="19"/>
               </w:rPr>
-              <w:t>NQR-P1040</w:t>
+              <w:t>NQR-P1030</w:t>
             </w:r>
           </w:p>
         </w:tc>
@@ -6453,7 +6453,7 @@
               <w:rPr>
                 <w:sz w:val="19"/>
               </w:rPr>
-              <w:t>Manufacture UPS, network switches and field cabinets - Al Qurayyat</w:t>
+              <w:t>Manufacture access control and intercom equipment - Al Qurayyat</w:t>
             </w:r>
           </w:p>
         </w:tc>
@@ -6511,7 +6511,7 @@
               <w:rPr>
                 <w:sz w:val="19"/>
               </w:rPr>
-              <w:t>NQR-P1050</w:t>
+              <w:t>NQR-P1040</w:t>
             </w:r>
           </w:p>
         </w:tc>
@@ -6525,7 +6525,7 @@
               <w:rPr>
                 <w:sz w:val="19"/>
               </w:rPr>
-              <w:t>Factory acceptance test at vendor premises - Al Qurayyat</w:t>
+              <w:t>Manufacture UPS, network switches and field cabinets - Al Qurayyat</w:t>
             </w:r>
           </w:p>
         </w:tc>
@@ -6539,7 +6539,7 @@
               <w:rPr>
                 <w:sz w:val="19"/>
               </w:rPr>
-              <w:t>28 Feb 2029</w:t>
+              <w:t>17 Dec 2028</w:t>
             </w:r>
           </w:p>
         </w:tc>
@@ -6553,7 +6553,7 @@
               <w:rPr>
                 <w:sz w:val="19"/>
               </w:rPr>
-              <w:t>13 Mar 2029</w:t>
+              <w:t>27 Feb 2029</w:t>
             </w:r>
           </w:p>
         </w:tc>
@@ -6583,7 +6583,7 @@
               <w:rPr>
                 <w:sz w:val="19"/>
               </w:rPr>
-              <w:t>NQR-P1060</w:t>
+              <w:t>NQR-X1020</w:t>
             </w:r>
           </w:p>
         </w:tc>
@@ -6597,7 +6597,7 @@
               <w:rPr>
                 <w:sz w:val="19"/>
               </w:rPr>
-              <w:t>Shipping and customs clearance - Al Qurayyat</w:t>
+              <w:t>Enabling works: cable routes, duct-bank and cabinet plinth preparation - Al Qurayyat</w:t>
             </w:r>
           </w:p>
         </w:tc>
@@ -6611,7 +6611,7 @@
               <w:rPr>
                 <w:sz w:val="19"/>
               </w:rPr>
-              <w:t>14 Mar 2029</w:t>
+              <w:t>24 Dec 2028</w:t>
             </w:r>
           </w:p>
         </w:tc>
@@ -6625,7 +6625,7 @@
               <w:rPr>
                 <w:sz w:val="19"/>
               </w:rPr>
-              <w:t>12 Apr 2029</w:t>
+              <w:t>04 Jan 2029</w:t>
             </w:r>
           </w:p>
         </w:tc>
@@ -6639,7 +6639,7 @@
               <w:rPr>
                 <w:sz w:val="19"/>
               </w:rPr>
-              <w:t>21</w:t>
+              <w:t>34</w:t>
             </w:r>
           </w:p>
         </w:tc>
@@ -6655,7 +6655,7 @@
               <w:rPr>
                 <w:sz w:val="19"/>
               </w:rPr>
-              <w:t>NQR-P1070</w:t>
+              <w:t>NQR-C1010</w:t>
             </w:r>
           </w:p>
         </w:tc>
@@ -6669,7 +6669,7 @@
               <w:rPr>
                 <w:sz w:val="19"/>
               </w:rPr>
-              <w:t>Delivery to station and receiving inspection - Al Qurayyat</w:t>
+              <w:t>Civil: platform trenches and duct banks - Al Qurayyat</w:t>
             </w:r>
           </w:p>
         </w:tc>
@@ -6683,7 +6683,7 @@
               <w:rPr>
                 <w:sz w:val="19"/>
               </w:rPr>
-              <w:t>15 Apr 2029</w:t>
+              <w:t>07 Jan 2029</w:t>
             </w:r>
           </w:p>
         </w:tc>
@@ -6697,7 +6697,7 @@
               <w:rPr>
                 <w:sz w:val="19"/>
               </w:rPr>
-              <w:t>19 Apr 2029</w:t>
+              <w:t>03 Apr 2029</w:t>
             </w:r>
           </w:p>
         </w:tc>
@@ -6711,7 +6711,7 @@
               <w:rPr>
                 <w:sz w:val="19"/>
               </w:rPr>
-              <w:t>21</w:t>
+              <w:t>34</w:t>
             </w:r>
           </w:p>
         </w:tc>
@@ -6727,7 +6727,7 @@
               <w:rPr>
                 <w:sz w:val="19"/>
               </w:rPr>
-              <w:t>NQR-C2010</w:t>
+              <w:t>NQR-P1050</w:t>
             </w:r>
           </w:p>
         </w:tc>
@@ -6741,7 +6741,7 @@
               <w:rPr>
                 <w:sz w:val="19"/>
               </w:rPr>
-              <w:t>Install UPS, network switches and field cabinets - Al Qurayyat</w:t>
+              <w:t>Factory acceptance test at vendor premises - Al Qurayyat</w:t>
             </w:r>
           </w:p>
         </w:tc>
@@ -6755,7 +6755,7 @@
               <w:rPr>
                 <w:sz w:val="19"/>
               </w:rPr>
-              <w:t>29 Apr 2029</w:t>
+              <w:t>28 Feb 2029</w:t>
             </w:r>
           </w:p>
         </w:tc>
@@ -6769,7 +6769,7 @@
               <w:rPr>
                 <w:sz w:val="19"/>
               </w:rPr>
-              <w:t>15 May 2029</w:t>
+              <w:t>13 Mar 2029</w:t>
             </w:r>
           </w:p>
         </w:tc>
@@ -6799,7 +6799,7 @@
               <w:rPr>
                 <w:sz w:val="19"/>
               </w:rPr>
-              <w:t>NQR-C2020</w:t>
+              <w:t>NQR-C1020</w:t>
             </w:r>
           </w:p>
         </w:tc>
@@ -6813,7 +6813,7 @@
               <w:rPr>
                 <w:sz w:val="19"/>
               </w:rPr>
-              <w:t>Cabling and termination (power, fibre, data) - Al Qurayyat</w:t>
+              <w:t>Civil: camera and ALPR pole foundations and poles - Al Qurayyat</w:t>
             </w:r>
           </w:p>
         </w:tc>
@@ -6827,7 +6827,7 @@
               <w:rPr>
                 <w:sz w:val="19"/>
               </w:rPr>
-              <w:t>03 May 2029</w:t>
+              <w:t>07 Mar 2029</w:t>
             </w:r>
           </w:p>
         </w:tc>
@@ -6841,7 +6841,7 @@
               <w:rPr>
                 <w:sz w:val="19"/>
               </w:rPr>
-              <w:t>03 Jun 2029</w:t>
+              <w:t>15 May 2029</w:t>
             </w:r>
           </w:p>
         </w:tc>
@@ -6855,7 +6855,7 @@
               <w:rPr>
                 <w:sz w:val="19"/>
               </w:rPr>
-              <w:t>21</w:t>
+              <w:t>34</w:t>
             </w:r>
           </w:p>
         </w:tc>
@@ -6871,7 +6871,7 @@
               <w:rPr>
                 <w:sz w:val="19"/>
               </w:rPr>
-              <w:t>NQR-C2040</w:t>
+              <w:t>NQR-P1060</w:t>
             </w:r>
           </w:p>
         </w:tc>
@@ -6885,7 +6885,7 @@
               <w:rPr>
                 <w:sz w:val="19"/>
               </w:rPr>
-              <w:t>Install video management, video wall and control-room equipment - Al Qurayyat</w:t>
+              <w:t>Shipping and customs clearance - Al Qurayyat</w:t>
             </w:r>
           </w:p>
         </w:tc>
@@ -6899,7 +6899,7 @@
               <w:rPr>
                 <w:sz w:val="19"/>
               </w:rPr>
-              <w:t>16 May 2029</w:t>
+              <w:t>14 Mar 2029</w:t>
             </w:r>
           </w:p>
         </w:tc>
@@ -6913,7 +6913,7 @@
               <w:rPr>
                 <w:sz w:val="19"/>
               </w:rPr>
-              <w:t>05 Jun 2029</w:t>
+              <w:t>12 Apr 2029</w:t>
             </w:r>
           </w:p>
         </w:tc>
@@ -6927,7 +6927,7 @@
               <w:rPr>
                 <w:sz w:val="19"/>
               </w:rPr>
-              <w:t>37</w:t>
+              <w:t>21</w:t>
             </w:r>
           </w:p>
         </w:tc>
@@ -6943,7 +6943,7 @@
               <w:rPr>
                 <w:sz w:val="19"/>
               </w:rPr>
-              <w:t>NQR-C2050</w:t>
+              <w:t>NQR-P1070</w:t>
             </w:r>
           </w:p>
         </w:tc>
@@ -6957,7 +6957,7 @@
               <w:rPr>
                 <w:sz w:val="19"/>
               </w:rPr>
-              <w:t>Install access control and intercom - Al Qurayyat</w:t>
+              <w:t>Delivery to station and receiving inspection - Al Qurayyat</w:t>
             </w:r>
           </w:p>
         </w:tc>
@@ -6971,7 +6971,7 @@
               <w:rPr>
                 <w:sz w:val="19"/>
               </w:rPr>
-              <w:t>22 May 2029</w:t>
+              <w:t>15 Apr 2029</w:t>
             </w:r>
           </w:p>
         </w:tc>
@@ -6985,7 +6985,7 @@
               <w:rPr>
                 <w:sz w:val="19"/>
               </w:rPr>
-              <w:t>07 Jun 2029</w:t>
+              <w:t>19 Apr 2029</w:t>
             </w:r>
           </w:p>
         </w:tc>
@@ -6999,7 +6999,7 @@
               <w:rPr>
                 <w:sz w:val="19"/>
               </w:rPr>
-              <w:t>35</w:t>
+              <w:t>21</w:t>
             </w:r>
           </w:p>
         </w:tc>
@@ -7015,7 +7015,7 @@
               <w:rPr>
                 <w:sz w:val="19"/>
               </w:rPr>
-              <w:t>NQR-C2030</w:t>
+              <w:t>NQR-C2010</w:t>
             </w:r>
           </w:p>
         </w:tc>
@@ -7029,7 +7029,7 @@
               <w:rPr>
                 <w:sz w:val="19"/>
               </w:rPr>
-              <w:t>Install and aim CCTV cameras - Al Qurayyat</w:t>
+              <w:t>Install UPS, network switches and field cabinets - Al Qurayyat</w:t>
             </w:r>
           </w:p>
         </w:tc>
@@ -7043,7 +7043,7 @@
               <w:rPr>
                 <w:sz w:val="19"/>
               </w:rPr>
-              <w:t>04 Jun 2029</w:t>
+              <w:t>29 Apr 2029</w:t>
             </w:r>
           </w:p>
         </w:tc>
@@ -7057,7 +7057,7 @@
               <w:rPr>
                 <w:sz w:val="19"/>
               </w:rPr>
-              <w:t>27 Jun 2029</w:t>
+              <w:t>15 May 2029</w:t>
             </w:r>
           </w:p>
         </w:tc>
@@ -7087,7 +7087,7 @@
               <w:rPr>
                 <w:sz w:val="19"/>
               </w:rPr>
-              <w:t>NQR-E1130</w:t>
+              <w:t>NQR-C2020</w:t>
             </w:r>
           </w:p>
         </w:tc>
@@ -7101,7 +7101,7 @@
               <w:rPr>
                 <w:sz w:val="19"/>
               </w:rPr>
-              <w:t>As-built and O&amp;M documentation: submittal - Al Qurayyat</w:t>
+              <w:t>Cabling and termination (power, fibre, data) - Al Qurayyat</w:t>
             </w:r>
           </w:p>
         </w:tc>
@@ -7115,7 +7115,7 @@
               <w:rPr>
                 <w:sz w:val="19"/>
               </w:rPr>
-              <w:t>28 Jun 2029</w:t>
+              <w:t>03 May 2029</w:t>
             </w:r>
           </w:p>
         </w:tc>
@@ -7129,7 +7129,7 @@
               <w:rPr>
                 <w:sz w:val="19"/>
               </w:rPr>
-              <w:t>06 Aug 2029</w:t>
+              <w:t>03 Jun 2029</w:t>
             </w:r>
           </w:p>
         </w:tc>

</xml_diff>

<commit_message>
Reflect the signed contract (1 Nov 2026): performance security 10%, taking-over 30 days, signed-contract terms on site and presentation
Co-Authored-By: Claude Sonnet 5.5 <noreply@anthropic.com>
Claude-Session: https://claude.ai/code/session_01DZdGPWRxvKXCnMyT6qFPZb
</commit_message>
<xml_diff>
--- a/p6/0580_Schedule_Narrative.docx
+++ b/p6/0580_Schedule_Narrative.docx
@@ -1157,7 +1157,7 @@
               <w:rPr>
                 <w:sz w:val="19"/>
               </w:rPr>
-              <w:t>24 Jan 2028</w:t>
+              <w:t>02 Feb 2028</w:t>
             </w:r>
           </w:p>
         </w:tc>
@@ -1229,7 +1229,7 @@
               <w:rPr>
                 <w:sz w:val="19"/>
               </w:rPr>
-              <w:t>27 Jun 2028</w:t>
+              <w:t>06 Jul 2028</w:t>
             </w:r>
           </w:p>
         </w:tc>
@@ -1301,7 +1301,7 @@
               <w:rPr>
                 <w:sz w:val="19"/>
               </w:rPr>
-              <w:t>05 Jan 2028</w:t>
+              <w:t>16 Jan 2028</w:t>
             </w:r>
           </w:p>
         </w:tc>
@@ -1359,7 +1359,7 @@
               <w:rPr>
                 <w:sz w:val="19"/>
               </w:rPr>
-              <w:t>01 Mar 2027</w:t>
+              <w:t>25 Feb 2027</w:t>
             </w:r>
           </w:p>
         </w:tc>
@@ -1373,7 +1373,7 @@
               <w:rPr>
                 <w:sz w:val="19"/>
               </w:rPr>
-              <w:t>26 Jul 2028</w:t>
+              <w:t>31 Jul 2028</w:t>
             </w:r>
           </w:p>
         </w:tc>
@@ -1431,7 +1431,7 @@
               <w:rPr>
                 <w:sz w:val="19"/>
               </w:rPr>
-              <w:t>17 Jun 2027</w:t>
+              <w:t>13 Jun 2027</w:t>
             </w:r>
           </w:p>
         </w:tc>
@@ -1445,7 +1445,7 @@
               <w:rPr>
                 <w:sz w:val="19"/>
               </w:rPr>
-              <w:t>27 Jun 2028</w:t>
+              <w:t>04 Jul 2028</w:t>
             </w:r>
           </w:p>
         </w:tc>
@@ -1503,7 +1503,7 @@
               <w:rPr>
                 <w:sz w:val="19"/>
               </w:rPr>
-              <w:t>10 Aug 2027</w:t>
+              <w:t>04 Aug 2027</w:t>
             </w:r>
           </w:p>
         </w:tc>
@@ -1517,7 +1517,7 @@
               <w:rPr>
                 <w:sz w:val="19"/>
               </w:rPr>
-              <w:t>10 Sep 2028</w:t>
+              <w:t>12 Sep 2028</w:t>
             </w:r>
           </w:p>
         </w:tc>
@@ -1575,7 +1575,7 @@
               <w:rPr>
                 <w:sz w:val="19"/>
               </w:rPr>
-              <w:t>10 Aug 2027</w:t>
+              <w:t>04 Aug 2027</w:t>
             </w:r>
           </w:p>
         </w:tc>
@@ -1589,7 +1589,7 @@
               <w:rPr>
                 <w:sz w:val="19"/>
               </w:rPr>
-              <w:t>16 Aug 2028</w:t>
+              <w:t>20 Aug 2028</w:t>
             </w:r>
           </w:p>
         </w:tc>
@@ -1647,7 +1647,7 @@
               <w:rPr>
                 <w:sz w:val="19"/>
               </w:rPr>
-              <w:t>28 Sep 2027</w:t>
+              <w:t>20 Sep 2027</w:t>
             </w:r>
           </w:p>
         </w:tc>
@@ -1661,7 +1661,7 @@
               <w:rPr>
                 <w:sz w:val="19"/>
               </w:rPr>
-              <w:t>29 Oct 2028</w:t>
+              <w:t>30 Oct 2028</w:t>
             </w:r>
           </w:p>
         </w:tc>
@@ -1719,7 +1719,7 @@
               <w:rPr>
                 <w:sz w:val="19"/>
               </w:rPr>
-              <w:t>25 Jan 2028</w:t>
+              <w:t>16 Jan 2028</w:t>
             </w:r>
           </w:p>
         </w:tc>
@@ -1791,7 +1791,7 @@
               <w:rPr>
                 <w:sz w:val="19"/>
               </w:rPr>
-              <w:t>25 Jan 2028</w:t>
+              <w:t>16 Jan 2028</w:t>
             </w:r>
           </w:p>
         </w:tc>
@@ -1863,7 +1863,7 @@
               <w:rPr>
                 <w:sz w:val="19"/>
               </w:rPr>
-              <w:t>20 Mar 2028</w:t>
+              <w:t>08 Mar 2028</w:t>
             </w:r>
           </w:p>
         </w:tc>
@@ -1877,7 +1877,7 @@
               <w:rPr>
                 <w:sz w:val="19"/>
               </w:rPr>
-              <w:t>01 Mar 2029</w:t>
+              <w:t>27 Feb 2029</w:t>
             </w:r>
           </w:p>
         </w:tc>
@@ -1935,7 +1935,7 @@
               <w:rPr>
                 <w:sz w:val="19"/>
               </w:rPr>
-              <w:t>12 Apr 2028</w:t>
+              <w:t>02 Apr 2028</w:t>
             </w:r>
           </w:p>
         </w:tc>
@@ -2007,7 +2007,7 @@
               <w:rPr>
                 <w:sz w:val="19"/>
               </w:rPr>
-              <w:t>29 Jun 2028</w:t>
+              <w:t>18 Jun 2028</w:t>
             </w:r>
           </w:p>
         </w:tc>
@@ -2079,7 +2079,7 @@
               <w:rPr>
                 <w:sz w:val="19"/>
               </w:rPr>
-              <w:t>16 Aug 2028</w:t>
+              <w:t>02 Aug 2028</w:t>
             </w:r>
           </w:p>
         </w:tc>
@@ -2093,7 +2093,7 @@
               <w:rPr>
                 <w:sz w:val="19"/>
               </w:rPr>
-              <w:t>17 Sep 2029</w:t>
+              <w:t>12 Sep 2029</w:t>
             </w:r>
           </w:p>
         </w:tc>
@@ -2113,7 +2113,7 @@
         <w:rPr>
           <w:b w:val="0"/>
         </w:rPr>
-        <w:t>Durations are driven by the BOQ quantities of each station (Annex 3), in working days (Sunday to Thursday). Survey: 5 days plus 1 day per 30 cameras. Design is fixed at four calendar months for every station, survey included. Manufacture lead time: 40 days plus 1 day per SAR 100,000 of equipment (cameras, VMS, access control, UPS and network), capped at 100. Shipping and customs: 20 days plus 1 day per SAR 250,000 of equipment. Civil works: 20 days plus 1 day per SAR 12,000 of civil works. Installation: 15 days plus 3 cameras per crew per day, with 1 crew below 150 cameras, 2 crews up to 349 and 3 crews from 350. SAT: 10 days plus 1 day per 30 cameras. Training 10 days, trial operation 30 days and taking over 15 days are fixed. The productivity rates are Contractor planning assumptions.</w:t>
+        <w:t>Durations are driven by the BOQ quantities of each station (Annex 3), in working days (Sunday to Thursday). Survey: 5 days plus 1 day per 30 cameras. Design is fixed at four calendar months for every station, survey included. Manufacture lead time: 40 days plus 1 day per SAR 100,000 of equipment (cameras, VMS, access control, UPS and network), capped at 100. Shipping and customs: 20 days plus 1 day per SAR 250,000 of equipment. Civil works: 20 days plus 1 day per SAR 12,000 of civil works. Installation: 15 days plus 3 cameras per crew per day, with 1 crew below 150 cameras, 2 crews up to 349 and 3 crews from 350. SAT: 10 days plus 1 day per 30 cameras. Training 10 days, trial operation 30 days and taking over 22 days (SAR issues the certificate within 30 calendar days of the application, clause 12.3) are fixed. The productivity rates are Contractor planning assumptions.</w:t>
       </w:r>
     </w:p>
     <w:tbl>
@@ -5244,7 +5244,7 @@
         <w:rPr>
           <w:b w:val="0"/>
         </w:rPr>
-        <w:t>The contract completion milestone is held by the 36 month term, so no activity has zero float against it. The longest physical path finishes 21 working days before the contract end date, and that margin is the project float. 26 tasks sit on this longest path and 10 more are within 20 working days of it. The first 25 in date order are listed below.</w:t>
+        <w:t>The contract completion milestone is held by the 36 month term, so no activity has zero float against it. The longest physical path finishes 24 working days before the contract end date, and that margin is the project float. 26 tasks sit on this longest path and 10 more are within 20 working days of it. The first 25 in date order are listed below.</w:t>
       </w:r>
     </w:p>
     <w:tbl>
@@ -5415,7 +5415,7 @@
               <w:rPr>
                 <w:sz w:val="19"/>
               </w:rPr>
-              <w:t>21</w:t>
+              <w:t>24</w:t>
             </w:r>
           </w:p>
         </w:tc>
@@ -5487,7 +5487,7 @@
               <w:rPr>
                 <w:sz w:val="19"/>
               </w:rPr>
-              <w:t>36</w:t>
+              <w:t>39</w:t>
             </w:r>
           </w:p>
         </w:tc>
@@ -5559,7 +5559,7 @@
               <w:rPr>
                 <w:sz w:val="19"/>
               </w:rPr>
-              <w:t>41</w:t>
+              <w:t>44</w:t>
             </w:r>
           </w:p>
         </w:tc>
@@ -5603,7 +5603,7 @@
               <w:rPr>
                 <w:sz w:val="19"/>
               </w:rPr>
-              <w:t>16 Aug 2028</w:t>
+              <w:t>02 Aug 2028</w:t>
             </w:r>
           </w:p>
         </w:tc>
@@ -5617,7 +5617,7 @@
               <w:rPr>
                 <w:sz w:val="19"/>
               </w:rPr>
-              <w:t>27 Aug 2028</w:t>
+              <w:t>13 Aug 2028</w:t>
             </w:r>
           </w:p>
         </w:tc>
@@ -5631,7 +5631,7 @@
               <w:rPr>
                 <w:sz w:val="19"/>
               </w:rPr>
-              <w:t>21</w:t>
+              <w:t>24</w:t>
             </w:r>
           </w:p>
         </w:tc>
@@ -5675,7 +5675,7 @@
               <w:rPr>
                 <w:sz w:val="19"/>
               </w:rPr>
-              <w:t>28 Aug 2028</w:t>
+              <w:t>14 Aug 2028</w:t>
             </w:r>
           </w:p>
         </w:tc>
@@ -5689,7 +5689,7 @@
               <w:rPr>
                 <w:sz w:val="19"/>
               </w:rPr>
-              <w:t>10 Sep 2028</w:t>
+              <w:t>27 Aug 2028</w:t>
             </w:r>
           </w:p>
         </w:tc>
@@ -5703,7 +5703,7 @@
               <w:rPr>
                 <w:sz w:val="19"/>
               </w:rPr>
-              <w:t>21</w:t>
+              <w:t>24</w:t>
             </w:r>
           </w:p>
         </w:tc>
@@ -5747,7 +5747,7 @@
               <w:rPr>
                 <w:sz w:val="19"/>
               </w:rPr>
-              <w:t>11 Sep 2028</w:t>
+              <w:t>28 Aug 2028</w:t>
             </w:r>
           </w:p>
         </w:tc>
@@ -5761,7 +5761,7 @@
               <w:rPr>
                 <w:sz w:val="19"/>
               </w:rPr>
-              <w:t>02 Oct 2028</w:t>
+              <w:t>18 Sep 2028</w:t>
             </w:r>
           </w:p>
         </w:tc>
@@ -5775,7 +5775,7 @@
               <w:rPr>
                 <w:sz w:val="19"/>
               </w:rPr>
-              <w:t>21</w:t>
+              <w:t>24</w:t>
             </w:r>
           </w:p>
         </w:tc>
@@ -5819,7 +5819,7 @@
               <w:rPr>
                 <w:sz w:val="19"/>
               </w:rPr>
-              <w:t>03 Oct 2028</w:t>
+              <w:t>19 Sep 2028</w:t>
             </w:r>
           </w:p>
         </w:tc>
@@ -5833,7 +5833,7 @@
               <w:rPr>
                 <w:sz w:val="19"/>
               </w:rPr>
-              <w:t>07 Nov 2028</w:t>
+              <w:t>24 Oct 2028</w:t>
             </w:r>
           </w:p>
         </w:tc>
@@ -5847,7 +5847,7 @@
               <w:rPr>
                 <w:sz w:val="19"/>
               </w:rPr>
-              <w:t>21</w:t>
+              <w:t>24</w:t>
             </w:r>
           </w:p>
         </w:tc>
@@ -5891,7 +5891,7 @@
               <w:rPr>
                 <w:sz w:val="19"/>
               </w:rPr>
-              <w:t>17 Oct 2028</w:t>
+              <w:t>03 Oct 2028</w:t>
             </w:r>
           </w:p>
         </w:tc>
@@ -5905,7 +5905,7 @@
               <w:rPr>
                 <w:sz w:val="19"/>
               </w:rPr>
-              <w:t>23 Nov 2028</w:t>
+              <w:t>09 Nov 2028</w:t>
             </w:r>
           </w:p>
         </w:tc>
@@ -5919,7 +5919,7 @@
               <w:rPr>
                 <w:sz w:val="19"/>
               </w:rPr>
-              <w:t>21</w:t>
+              <w:t>24</w:t>
             </w:r>
           </w:p>
         </w:tc>
@@ -5963,7 +5963,7 @@
               <w:rPr>
                 <w:sz w:val="19"/>
               </w:rPr>
-              <w:t>08 Nov 2028</w:t>
+              <w:t>25 Oct 2028</w:t>
             </w:r>
           </w:p>
         </w:tc>
@@ -5977,7 +5977,7 @@
               <w:rPr>
                 <w:sz w:val="19"/>
               </w:rPr>
-              <w:t>28 Nov 2028</w:t>
+              <w:t>14 Nov 2028</w:t>
             </w:r>
           </w:p>
         </w:tc>
@@ -5991,7 +5991,7 @@
               <w:rPr>
                 <w:sz w:val="19"/>
               </w:rPr>
-              <w:t>33</w:t>
+              <w:t>36</w:t>
             </w:r>
           </w:p>
         </w:tc>
@@ -6035,7 +6035,7 @@
               <w:rPr>
                 <w:sz w:val="19"/>
               </w:rPr>
-              <w:t>08 Nov 2028</w:t>
+              <w:t>25 Oct 2028</w:t>
             </w:r>
           </w:p>
         </w:tc>
@@ -6049,7 +6049,7 @@
               <w:rPr>
                 <w:sz w:val="19"/>
               </w:rPr>
-              <w:t>23 Nov 2028</w:t>
+              <w:t>09 Nov 2028</w:t>
             </w:r>
           </w:p>
         </w:tc>
@@ -6063,7 +6063,7 @@
               <w:rPr>
                 <w:sz w:val="19"/>
               </w:rPr>
-              <w:t>21</w:t>
+              <w:t>24</w:t>
             </w:r>
           </w:p>
         </w:tc>
@@ -6107,7 +6107,7 @@
               <w:rPr>
                 <w:sz w:val="19"/>
               </w:rPr>
-              <w:t>26 Nov 2028</w:t>
+              <w:t>12 Nov 2028</w:t>
             </w:r>
           </w:p>
         </w:tc>
@@ -6121,7 +6121,7 @@
               <w:rPr>
                 <w:sz w:val="19"/>
               </w:rPr>
-              <w:t>14 Dec 2028</w:t>
+              <w:t>30 Nov 2028</w:t>
             </w:r>
           </w:p>
         </w:tc>
@@ -6135,7 +6135,7 @@
               <w:rPr>
                 <w:sz w:val="19"/>
               </w:rPr>
-              <w:t>21</w:t>
+              <w:t>24</w:t>
             </w:r>
           </w:p>
         </w:tc>
@@ -6179,7 +6179,7 @@
               <w:rPr>
                 <w:sz w:val="19"/>
               </w:rPr>
-              <w:t>26 Nov 2028</w:t>
+              <w:t>12 Nov 2028</w:t>
             </w:r>
           </w:p>
         </w:tc>
@@ -6193,7 +6193,7 @@
               <w:rPr>
                 <w:sz w:val="19"/>
               </w:rPr>
-              <w:t>14 Dec 2028</w:t>
+              <w:t>30 Nov 2028</w:t>
             </w:r>
           </w:p>
         </w:tc>
@@ -6207,7 +6207,7 @@
               <w:rPr>
                 <w:sz w:val="19"/>
               </w:rPr>
-              <w:t>21</w:t>
+              <w:t>24</w:t>
             </w:r>
           </w:p>
         </w:tc>
@@ -6251,7 +6251,7 @@
               <w:rPr>
                 <w:sz w:val="19"/>
               </w:rPr>
-              <w:t>17 Dec 2028</w:t>
+              <w:t>03 Dec 2028</w:t>
             </w:r>
           </w:p>
         </w:tc>
@@ -6265,7 +6265,7 @@
               <w:rPr>
                 <w:sz w:val="19"/>
               </w:rPr>
-              <w:t>21 Dec 2028</w:t>
+              <w:t>07 Dec 2028</w:t>
             </w:r>
           </w:p>
         </w:tc>
@@ -6279,7 +6279,7 @@
               <w:rPr>
                 <w:sz w:val="19"/>
               </w:rPr>
-              <w:t>34</w:t>
+              <w:t>37</w:t>
             </w:r>
           </w:p>
         </w:tc>
@@ -6323,7 +6323,7 @@
               <w:rPr>
                 <w:sz w:val="19"/>
               </w:rPr>
-              <w:t>17 Dec 2028</w:t>
+              <w:t>03 Dec 2028</w:t>
             </w:r>
           </w:p>
         </w:tc>
@@ -6337,7 +6337,7 @@
               <w:rPr>
                 <w:sz w:val="19"/>
               </w:rPr>
-              <w:t>27 Feb 2029</w:t>
+              <w:t>05 Feb 2029</w:t>
             </w:r>
           </w:p>
         </w:tc>
@@ -6351,7 +6351,7 @@
               <w:rPr>
                 <w:sz w:val="19"/>
               </w:rPr>
-              <w:t>21</w:t>
+              <w:t>24</w:t>
             </w:r>
           </w:p>
         </w:tc>
@@ -6395,7 +6395,7 @@
               <w:rPr>
                 <w:sz w:val="19"/>
               </w:rPr>
-              <w:t>17 Dec 2028</w:t>
+              <w:t>03 Dec 2028</w:t>
             </w:r>
           </w:p>
         </w:tc>
@@ -6409,7 +6409,7 @@
               <w:rPr>
                 <w:sz w:val="19"/>
               </w:rPr>
-              <w:t>27 Feb 2029</w:t>
+              <w:t>05 Feb 2029</w:t>
             </w:r>
           </w:p>
         </w:tc>
@@ -6423,7 +6423,7 @@
               <w:rPr>
                 <w:sz w:val="19"/>
               </w:rPr>
-              <w:t>21</w:t>
+              <w:t>24</w:t>
             </w:r>
           </w:p>
         </w:tc>
@@ -6467,7 +6467,7 @@
               <w:rPr>
                 <w:sz w:val="19"/>
               </w:rPr>
-              <w:t>17 Dec 2028</w:t>
+              <w:t>03 Dec 2028</w:t>
             </w:r>
           </w:p>
         </w:tc>
@@ -6481,7 +6481,7 @@
               <w:rPr>
                 <w:sz w:val="19"/>
               </w:rPr>
-              <w:t>27 Feb 2029</w:t>
+              <w:t>05 Feb 2029</w:t>
             </w:r>
           </w:p>
         </w:tc>
@@ -6495,7 +6495,7 @@
               <w:rPr>
                 <w:sz w:val="19"/>
               </w:rPr>
-              <w:t>21</w:t>
+              <w:t>24</w:t>
             </w:r>
           </w:p>
         </w:tc>
@@ -6539,7 +6539,7 @@
               <w:rPr>
                 <w:sz w:val="19"/>
               </w:rPr>
-              <w:t>17 Dec 2028</w:t>
+              <w:t>03 Dec 2028</w:t>
             </w:r>
           </w:p>
         </w:tc>
@@ -6553,7 +6553,7 @@
               <w:rPr>
                 <w:sz w:val="19"/>
               </w:rPr>
-              <w:t>27 Feb 2029</w:t>
+              <w:t>05 Feb 2029</w:t>
             </w:r>
           </w:p>
         </w:tc>
@@ -6567,7 +6567,7 @@
               <w:rPr>
                 <w:sz w:val="19"/>
               </w:rPr>
-              <w:t>21</w:t>
+              <w:t>24</w:t>
             </w:r>
           </w:p>
         </w:tc>
@@ -6611,7 +6611,7 @@
               <w:rPr>
                 <w:sz w:val="19"/>
               </w:rPr>
-              <w:t>24 Dec 2028</w:t>
+              <w:t>10 Dec 2028</w:t>
             </w:r>
           </w:p>
         </w:tc>
@@ -6625,7 +6625,7 @@
               <w:rPr>
                 <w:sz w:val="19"/>
               </w:rPr>
-              <w:t>04 Jan 2029</w:t>
+              <w:t>21 Dec 2028</w:t>
             </w:r>
           </w:p>
         </w:tc>
@@ -6639,7 +6639,7 @@
               <w:rPr>
                 <w:sz w:val="19"/>
               </w:rPr>
-              <w:t>34</w:t>
+              <w:t>37</w:t>
             </w:r>
           </w:p>
         </w:tc>
@@ -6683,7 +6683,7 @@
               <w:rPr>
                 <w:sz w:val="19"/>
               </w:rPr>
-              <w:t>07 Jan 2029</w:t>
+              <w:t>24 Dec 2028</w:t>
             </w:r>
           </w:p>
         </w:tc>
@@ -6697,7 +6697,7 @@
               <w:rPr>
                 <w:sz w:val="19"/>
               </w:rPr>
-              <w:t>03 Apr 2029</w:t>
+              <w:t>20 Mar 2029</w:t>
             </w:r>
           </w:p>
         </w:tc>
@@ -6711,7 +6711,7 @@
               <w:rPr>
                 <w:sz w:val="19"/>
               </w:rPr>
-              <w:t>34</w:t>
+              <w:t>37</w:t>
             </w:r>
           </w:p>
         </w:tc>
@@ -6755,7 +6755,7 @@
               <w:rPr>
                 <w:sz w:val="19"/>
               </w:rPr>
-              <w:t>28 Feb 2029</w:t>
+              <w:t>06 Feb 2029</w:t>
             </w:r>
           </w:p>
         </w:tc>
@@ -6769,7 +6769,7 @@
               <w:rPr>
                 <w:sz w:val="19"/>
               </w:rPr>
-              <w:t>13 Mar 2029</w:t>
+              <w:t>27 Feb 2029</w:t>
             </w:r>
           </w:p>
         </w:tc>
@@ -6783,7 +6783,7 @@
               <w:rPr>
                 <w:sz w:val="19"/>
               </w:rPr>
-              <w:t>21</w:t>
+              <w:t>24</w:t>
             </w:r>
           </w:p>
         </w:tc>
@@ -6827,7 +6827,7 @@
               <w:rPr>
                 <w:sz w:val="19"/>
               </w:rPr>
-              <w:t>07 Mar 2029</w:t>
+              <w:t>20 Feb 2029</w:t>
             </w:r>
           </w:p>
         </w:tc>
@@ -6841,7 +6841,7 @@
               <w:rPr>
                 <w:sz w:val="19"/>
               </w:rPr>
-              <w:t>15 May 2029</w:t>
+              <w:t>01 May 2029</w:t>
             </w:r>
           </w:p>
         </w:tc>
@@ -6855,7 +6855,7 @@
               <w:rPr>
                 <w:sz w:val="19"/>
               </w:rPr>
-              <w:t>34</w:t>
+              <w:t>37</w:t>
             </w:r>
           </w:p>
         </w:tc>
@@ -6899,7 +6899,7 @@
               <w:rPr>
                 <w:sz w:val="19"/>
               </w:rPr>
-              <w:t>14 Mar 2029</w:t>
+              <w:t>28 Feb 2029</w:t>
             </w:r>
           </w:p>
         </w:tc>
@@ -6913,7 +6913,7 @@
               <w:rPr>
                 <w:sz w:val="19"/>
               </w:rPr>
-              <w:t>12 Apr 2029</w:t>
+              <w:t>29 Mar 2029</w:t>
             </w:r>
           </w:p>
         </w:tc>
@@ -6927,7 +6927,7 @@
               <w:rPr>
                 <w:sz w:val="19"/>
               </w:rPr>
-              <w:t>21</w:t>
+              <w:t>24</w:t>
             </w:r>
           </w:p>
         </w:tc>
@@ -6971,7 +6971,7 @@
               <w:rPr>
                 <w:sz w:val="19"/>
               </w:rPr>
-              <w:t>15 Apr 2029</w:t>
+              <w:t>01 Apr 2029</w:t>
             </w:r>
           </w:p>
         </w:tc>
@@ -6985,7 +6985,7 @@
               <w:rPr>
                 <w:sz w:val="19"/>
               </w:rPr>
-              <w:t>19 Apr 2029</w:t>
+              <w:t>05 Apr 2029</w:t>
             </w:r>
           </w:p>
         </w:tc>
@@ -6999,7 +6999,7 @@
               <w:rPr>
                 <w:sz w:val="19"/>
               </w:rPr>
-              <w:t>21</w:t>
+              <w:t>24</w:t>
             </w:r>
           </w:p>
         </w:tc>
@@ -7043,7 +7043,7 @@
               <w:rPr>
                 <w:sz w:val="19"/>
               </w:rPr>
-              <w:t>29 Apr 2029</w:t>
+              <w:t>08 Apr 2029</w:t>
             </w:r>
           </w:p>
         </w:tc>
@@ -7057,7 +7057,7 @@
               <w:rPr>
                 <w:sz w:val="19"/>
               </w:rPr>
-              <w:t>15 May 2029</w:t>
+              <w:t>01 May 2029</w:t>
             </w:r>
           </w:p>
         </w:tc>
@@ -7071,7 +7071,7 @@
               <w:rPr>
                 <w:sz w:val="19"/>
               </w:rPr>
-              <w:t>21</w:t>
+              <w:t>24</w:t>
             </w:r>
           </w:p>
         </w:tc>
@@ -7115,7 +7115,7 @@
               <w:rPr>
                 <w:sz w:val="19"/>
               </w:rPr>
-              <w:t>03 May 2029</w:t>
+              <w:t>12 Apr 2029</w:t>
             </w:r>
           </w:p>
         </w:tc>
@@ -7129,7 +7129,7 @@
               <w:rPr>
                 <w:sz w:val="19"/>
               </w:rPr>
-              <w:t>03 Jun 2029</w:t>
+              <w:t>20 May 2029</w:t>
             </w:r>
           </w:p>
         </w:tc>
@@ -7143,7 +7143,7 @@
               <w:rPr>
                 <w:sz w:val="19"/>
               </w:rPr>
-              <w:t>21</w:t>
+              <w:t>24</w:t>
             </w:r>
           </w:p>
         </w:tc>

</xml_diff>